<commit_message>
quelques modifs pour voir le formulaire sans conditions
</commit_message>
<xml_diff>
--- a/backend/src/templates/modele_complet.docx
+++ b/backend/src/templates/modele_complet.docx
@@ -2919,6 +2919,7 @@
       <w:tblPr>
         <w:tblStyle w:val="TableNormal"/>
         <w:tblW w:w="0" w:type="auto"/>
+        <w:tblInd w:w="-8" w:type="dxa"/>
         <w:tblBorders>
           <w:top w:val="single" w:sz="4" w:space="0" w:color="000000"/>
           <w:left w:val="single" w:sz="4" w:space="0" w:color="000000"/>
@@ -2931,10 +2932,7 @@
         <w:tblLook w:val="01E0" w:firstRow="1" w:lastRow="1" w:firstColumn="1" w:lastColumn="1" w:noHBand="0" w:noVBand="0"/>
       </w:tblPr>
       <w:tblGrid>
-        <w:gridCol w:w="1288"/>
-        <w:gridCol w:w="1004"/>
-        <w:gridCol w:w="17"/>
-        <w:gridCol w:w="2309"/>
+        <w:gridCol w:w="3402"/>
         <w:gridCol w:w="1412"/>
         <w:gridCol w:w="1412"/>
         <w:gridCol w:w="1412"/>
@@ -2942,34 +2940,42 @@
       </w:tblGrid>
       <w:tr>
         <w:trPr>
-          <w:trHeight w:val="376"/>
+          <w:trHeight w:val="396"/>
         </w:trPr>
         <w:tc>
           <w:tcPr>
-            <w:tcW w:w="7440" w:type="dxa"/>
-            <w:gridSpan w:val="6"/>
+            <w:tcW w:w="6226" w:type="dxa"/>
+            <w:gridSpan w:val="3"/>
             <w:tcBorders>
               <w:top w:val="nil"/>
               <w:left w:val="nil"/>
+              <w:bottom w:val="single" w:sz="4" w:space="0" w:color="000000"/>
+              <w:right w:val="single" w:sz="4" w:space="0" w:color="000000"/>
             </w:tcBorders>
           </w:tcPr>
           <w:p>
             <w:pPr>
               <w:pStyle w:val="TableParagraph"/>
               <w:spacing w:before="0" w:line="240" w:lineRule="auto"/>
-              <w:rPr>
-                <w:rFonts w:ascii="Times New Roman"/>
-                <w:sz w:val="18"/>
+              <w:ind w:left="13" w:right="32"/>
+              <w:jc w:val="center"/>
+              <w:rPr>
+                <w:b/>
+                <w:color w:val="FFFFFF"/>
+                <w:spacing w:val="-2"/>
+                <w:sz w:val="24"/>
               </w:rPr>
             </w:pPr>
           </w:p>
         </w:tc>
         <w:tc>
           <w:tcPr>
-            <w:tcW w:w="2579" w:type="dxa"/>
+            <w:tcW w:w="2824" w:type="dxa"/>
             <w:gridSpan w:val="2"/>
             <w:tcBorders>
-              <w:top w:val="single" w:sz="6" w:space="0" w:color="000000"/>
+              <w:left w:val="single" w:sz="4" w:space="0" w:color="000000"/>
+              <w:bottom w:val="nil"/>
+              <w:right w:val="single" w:sz="6" w:space="0" w:color="000000"/>
             </w:tcBorders>
             <w:shd w:val="clear" w:color="auto" w:fill="447986"/>
           </w:tcPr>
@@ -2977,9 +2983,12 @@
             <w:pPr>
               <w:pStyle w:val="TableParagraph"/>
               <w:spacing w:before="0" w:line="240" w:lineRule="auto"/>
-              <w:ind w:left="820"/>
+              <w:ind w:left="15" w:right="7"/>
+              <w:jc w:val="center"/>
               <w:rPr>
                 <w:b/>
+                <w:color w:val="FFFFFF"/>
+                <w:spacing w:val="-10"/>
                 <w:sz w:val="24"/>
               </w:rPr>
             </w:pPr>
@@ -3001,9 +3010,151 @@
         </w:trPr>
         <w:tc>
           <w:tcPr>
-            <w:tcW w:w="2309" w:type="dxa"/>
-            <w:gridSpan w:val="3"/>
+            <w:tcW w:w="3402" w:type="dxa"/>
             <w:tcBorders>
+              <w:top w:val="single" w:sz="4" w:space="0" w:color="000000"/>
+              <w:left w:val="single" w:sz="4" w:space="0" w:color="000000"/>
+              <w:bottom w:val="thickThinMediumGap" w:sz="4" w:space="0" w:color="000000"/>
+              <w:right w:val="single" w:sz="6" w:space="0" w:color="000000"/>
+            </w:tcBorders>
+            <w:shd w:val="clear" w:color="auto" w:fill="447986"/>
+          </w:tcPr>
+          <w:p>
+            <w:pPr>
+              <w:pStyle w:val="TableParagraph"/>
+              <w:spacing w:before="0" w:line="240" w:lineRule="auto"/>
+              <w:ind w:left="15" w:right="7"/>
+              <w:jc w:val="center"/>
+              <w:rPr>
+                <w:b/>
+                <w:color w:val="FFFFFF"/>
+                <w:spacing w:val="-10"/>
+                <w:sz w:val="24"/>
+              </w:rPr>
+            </w:pPr>
+            <w:r>
+              <w:rPr>
+                <w:b/>
+                <w:color w:val="FFFFFF"/>
+                <w:spacing w:val="-10"/>
+                <w:sz w:val="24"/>
+              </w:rPr>
+              <w:t>Libellé</w:t>
+            </w:r>
+          </w:p>
+        </w:tc>
+        <w:tc>
+          <w:tcPr>
+            <w:tcW w:w="1412" w:type="dxa"/>
+            <w:tcBorders>
+              <w:top w:val="single" w:sz="4" w:space="0" w:color="000000"/>
+              <w:left w:val="single" w:sz="6" w:space="0" w:color="000000"/>
+              <w:bottom w:val="thickThinMediumGap" w:sz="3" w:space="0" w:color="000000"/>
+              <w:right w:val="single" w:sz="6" w:space="0" w:color="000000"/>
+            </w:tcBorders>
+            <w:shd w:val="clear" w:color="auto" w:fill="447986"/>
+          </w:tcPr>
+          <w:p>
+            <w:pPr>
+              <w:pStyle w:val="TableParagraph"/>
+              <w:spacing w:before="0" w:line="240" w:lineRule="auto"/>
+              <w:ind w:left="32" w:right="19"/>
+              <w:jc w:val="center"/>
+              <w:rPr>
+                <w:b/>
+                <w:sz w:val="24"/>
+              </w:rPr>
+            </w:pPr>
+            <w:r>
+              <w:rPr>
+                <w:b/>
+                <w:color w:val="FFFFFF"/>
+                <w:spacing w:val="-10"/>
+                <w:sz w:val="24"/>
+              </w:rPr>
+              <w:t>N</w:t>
+            </w:r>
+          </w:p>
+        </w:tc>
+        <w:tc>
+          <w:tcPr>
+            <w:tcW w:w="1412" w:type="dxa"/>
+            <w:tcBorders>
+              <w:top w:val="single" w:sz="4" w:space="0" w:color="000000"/>
+              <w:left w:val="single" w:sz="6" w:space="0" w:color="000000"/>
+              <w:bottom w:val="thickThinMediumGap" w:sz="3" w:space="0" w:color="000000"/>
+              <w:right w:val="single" w:sz="6" w:space="0" w:color="000000"/>
+            </w:tcBorders>
+            <w:shd w:val="clear" w:color="auto" w:fill="447986"/>
+          </w:tcPr>
+          <w:p>
+            <w:pPr>
+              <w:pStyle w:val="TableParagraph"/>
+              <w:spacing w:before="0" w:line="240" w:lineRule="auto"/>
+              <w:ind w:left="13" w:right="32"/>
+              <w:jc w:val="center"/>
+              <w:rPr>
+                <w:b/>
+                <w:sz w:val="24"/>
+              </w:rPr>
+            </w:pPr>
+            <w:r>
+              <w:rPr>
+                <w:b/>
+                <w:color w:val="FFFFFF"/>
+                <w:spacing w:val="-2"/>
+                <w:sz w:val="24"/>
+              </w:rPr>
+              <w:t>N-</w:t>
+            </w:r>
+            <w:r>
+              <w:rPr>
+                <w:b/>
+                <w:color w:val="FFFFFF"/>
+                <w:spacing w:val="-10"/>
+                <w:sz w:val="24"/>
+              </w:rPr>
+              <w:t>1</w:t>
+            </w:r>
+          </w:p>
+        </w:tc>
+        <w:tc>
+          <w:tcPr>
+            <w:tcW w:w="1412" w:type="dxa"/>
+            <w:tcBorders>
+              <w:top w:val="nil"/>
+              <w:left w:val="single" w:sz="6" w:space="0" w:color="000000"/>
+              <w:bottom w:val="thickThinMediumGap" w:sz="3" w:space="0" w:color="000000"/>
+              <w:right w:val="single" w:sz="6" w:space="0" w:color="000000"/>
+            </w:tcBorders>
+            <w:shd w:val="clear" w:color="auto" w:fill="447986"/>
+          </w:tcPr>
+          <w:p>
+            <w:pPr>
+              <w:pStyle w:val="TableParagraph"/>
+              <w:spacing w:before="0" w:line="240" w:lineRule="auto"/>
+              <w:ind w:left="418"/>
+              <w:rPr>
+                <w:b/>
+                <w:sz w:val="24"/>
+              </w:rPr>
+            </w:pPr>
+            <w:r>
+              <w:rPr>
+                <w:b/>
+                <w:color w:val="FFFFFF"/>
+                <w:spacing w:val="-2"/>
+                <w:sz w:val="24"/>
+              </w:rPr>
+              <w:t>Valeur</w:t>
+            </w:r>
+          </w:p>
+        </w:tc>
+        <w:tc>
+          <w:tcPr>
+            <w:tcW w:w="1412" w:type="dxa"/>
+            <w:tcBorders>
+              <w:top w:val="nil"/>
               <w:left w:val="single" w:sz="6" w:space="0" w:color="000000"/>
               <w:bottom w:val="thickThinMediumGap" w:sz="3" w:space="0" w:color="000000"/>
               <w:right w:val="single" w:sz="6" w:space="0" w:color="000000"/>
@@ -3018,178 +3169,6 @@
               <w:jc w:val="center"/>
               <w:rPr>
                 <w:b/>
-                <w:color w:val="FFFFFF"/>
-                <w:spacing w:val="-10"/>
-                <w:sz w:val="24"/>
-              </w:rPr>
-            </w:pPr>
-            <w:r>
-              <w:rPr>
-                <w:b/>
-                <w:color w:val="FFFFFF"/>
-                <w:spacing w:val="-10"/>
-                <w:sz w:val="24"/>
-              </w:rPr>
-              <w:t>Compte</w:t>
-            </w:r>
-          </w:p>
-        </w:tc>
-        <w:tc>
-          <w:tcPr>
-            <w:tcW w:w="2309" w:type="dxa"/>
-            <w:tcBorders>
-              <w:left w:val="single" w:sz="6" w:space="0" w:color="000000"/>
-              <w:bottom w:val="thickThinMediumGap" w:sz="3" w:space="0" w:color="000000"/>
-              <w:right w:val="single" w:sz="6" w:space="0" w:color="000000"/>
-            </w:tcBorders>
-            <w:shd w:val="clear" w:color="auto" w:fill="447986"/>
-          </w:tcPr>
-          <w:p>
-            <w:pPr>
-              <w:pStyle w:val="TableParagraph"/>
-              <w:spacing w:before="0" w:line="240" w:lineRule="auto"/>
-              <w:ind w:left="15" w:right="7"/>
-              <w:jc w:val="center"/>
-              <w:rPr>
-                <w:b/>
-                <w:color w:val="FFFFFF"/>
-                <w:spacing w:val="-10"/>
-                <w:sz w:val="24"/>
-              </w:rPr>
-            </w:pPr>
-            <w:r>
-              <w:rPr>
-                <w:b/>
-                <w:color w:val="FFFFFF"/>
-                <w:spacing w:val="-10"/>
-                <w:sz w:val="24"/>
-              </w:rPr>
-              <w:t>Libellé</w:t>
-            </w:r>
-          </w:p>
-        </w:tc>
-        <w:tc>
-          <w:tcPr>
-            <w:tcW w:w="1412" w:type="dxa"/>
-            <w:tcBorders>
-              <w:left w:val="single" w:sz="6" w:space="0" w:color="000000"/>
-              <w:bottom w:val="thickThinMediumGap" w:sz="3" w:space="0" w:color="000000"/>
-              <w:right w:val="single" w:sz="6" w:space="0" w:color="000000"/>
-            </w:tcBorders>
-            <w:shd w:val="clear" w:color="auto" w:fill="447986"/>
-          </w:tcPr>
-          <w:p>
-            <w:pPr>
-              <w:pStyle w:val="TableParagraph"/>
-              <w:spacing w:before="0" w:line="240" w:lineRule="auto"/>
-              <w:ind w:left="32" w:right="19"/>
-              <w:jc w:val="center"/>
-              <w:rPr>
-                <w:b/>
-                <w:sz w:val="24"/>
-              </w:rPr>
-            </w:pPr>
-            <w:r>
-              <w:rPr>
-                <w:b/>
-                <w:color w:val="FFFFFF"/>
-                <w:spacing w:val="-10"/>
-                <w:sz w:val="24"/>
-              </w:rPr>
-              <w:t>N</w:t>
-            </w:r>
-          </w:p>
-        </w:tc>
-        <w:tc>
-          <w:tcPr>
-            <w:tcW w:w="1412" w:type="dxa"/>
-            <w:tcBorders>
-              <w:left w:val="single" w:sz="6" w:space="0" w:color="000000"/>
-              <w:bottom w:val="thickThinMediumGap" w:sz="3" w:space="0" w:color="000000"/>
-              <w:right w:val="single" w:sz="6" w:space="0" w:color="000000"/>
-            </w:tcBorders>
-            <w:shd w:val="clear" w:color="auto" w:fill="447986"/>
-          </w:tcPr>
-          <w:p>
-            <w:pPr>
-              <w:pStyle w:val="TableParagraph"/>
-              <w:spacing w:before="0" w:line="240" w:lineRule="auto"/>
-              <w:ind w:left="13" w:right="32"/>
-              <w:jc w:val="center"/>
-              <w:rPr>
-                <w:b/>
-                <w:sz w:val="24"/>
-              </w:rPr>
-            </w:pPr>
-            <w:r>
-              <w:rPr>
-                <w:b/>
-                <w:color w:val="FFFFFF"/>
-                <w:spacing w:val="-2"/>
-                <w:sz w:val="24"/>
-              </w:rPr>
-              <w:t>N-</w:t>
-            </w:r>
-            <w:r>
-              <w:rPr>
-                <w:b/>
-                <w:color w:val="FFFFFF"/>
-                <w:spacing w:val="-10"/>
-                <w:sz w:val="24"/>
-              </w:rPr>
-              <w:t>1</w:t>
-            </w:r>
-          </w:p>
-        </w:tc>
-        <w:tc>
-          <w:tcPr>
-            <w:tcW w:w="1412" w:type="dxa"/>
-            <w:tcBorders>
-              <w:left w:val="single" w:sz="6" w:space="0" w:color="000000"/>
-              <w:bottom w:val="thickThinMediumGap" w:sz="3" w:space="0" w:color="000000"/>
-              <w:right w:val="single" w:sz="6" w:space="0" w:color="000000"/>
-            </w:tcBorders>
-            <w:shd w:val="clear" w:color="auto" w:fill="447986"/>
-          </w:tcPr>
-          <w:p>
-            <w:pPr>
-              <w:pStyle w:val="TableParagraph"/>
-              <w:spacing w:before="0" w:line="240" w:lineRule="auto"/>
-              <w:ind w:left="418"/>
-              <w:rPr>
-                <w:b/>
-                <w:sz w:val="24"/>
-              </w:rPr>
-            </w:pPr>
-            <w:r>
-              <w:rPr>
-                <w:b/>
-                <w:color w:val="FFFFFF"/>
-                <w:spacing w:val="-2"/>
-                <w:sz w:val="24"/>
-              </w:rPr>
-              <w:t>Valeur</w:t>
-            </w:r>
-          </w:p>
-        </w:tc>
-        <w:tc>
-          <w:tcPr>
-            <w:tcW w:w="1412" w:type="dxa"/>
-            <w:tcBorders>
-              <w:left w:val="single" w:sz="6" w:space="0" w:color="000000"/>
-              <w:bottom w:val="thickThinMediumGap" w:sz="3" w:space="0" w:color="000000"/>
-              <w:right w:val="single" w:sz="6" w:space="0" w:color="000000"/>
-            </w:tcBorders>
-            <w:shd w:val="clear" w:color="auto" w:fill="447986"/>
-          </w:tcPr>
-          <w:p>
-            <w:pPr>
-              <w:pStyle w:val="TableParagraph"/>
-              <w:spacing w:before="0" w:line="240" w:lineRule="auto"/>
-              <w:ind w:left="15" w:right="7"/>
-              <w:jc w:val="center"/>
-              <w:rPr>
-                <w:b/>
                 <w:sz w:val="24"/>
               </w:rPr>
             </w:pPr>
@@ -3211,90 +3190,11 @@
         </w:trPr>
         <w:tc>
           <w:tcPr>
-            <w:tcW w:w="1288" w:type="dxa"/>
+            <w:tcW w:w="3402" w:type="dxa"/>
             <w:tcBorders>
-              <w:top w:val="thinThickMediumGap" w:sz="3" w:space="0" w:color="000000"/>
-              <w:left w:val="dashed" w:sz="6" w:space="0" w:color="000000"/>
-              <w:bottom w:val="single" w:sz="6" w:space="0" w:color="000000"/>
-              <w:right w:val="nil"/>
-            </w:tcBorders>
-            <w:vAlign w:val="center"/>
-          </w:tcPr>
-          <w:p>
-            <w:pPr>
-              <w:pStyle w:val="TableParagraph"/>
-              <w:spacing w:before="0"/>
-              <w:ind w:left="85"/>
-              <w:rPr>
-                <w:sz w:val="20"/>
-              </w:rPr>
-            </w:pPr>
-            <w:r>
-              <w:rPr>
-                <w:color w:val="46413B"/>
-                <w:spacing w:val="-2"/>
-                <w:sz w:val="20"/>
-              </w:rPr>
-              <w:t>[[#EC_tab]]</w:t>
-            </w:r>
-            <w:r>
-              <w:rPr>
-                <w:color w:val="46413B"/>
-                <w:spacing w:val="-2"/>
-                <w:sz w:val="20"/>
-              </w:rPr>
-              <w:t xml:space="preserve"> [[</w:t>
-            </w:r>
-            <w:proofErr w:type="spellStart"/>
-            <w:r>
-              <w:rPr>
-                <w:color w:val="46413B"/>
-                <w:spacing w:val="-2"/>
-                <w:sz w:val="20"/>
-              </w:rPr>
-              <w:t>EC_compte</w:t>
-            </w:r>
-            <w:proofErr w:type="spellEnd"/>
-            <w:r>
-              <w:rPr>
-                <w:color w:val="46413B"/>
-                <w:spacing w:val="-2"/>
-                <w:sz w:val="20"/>
-              </w:rPr>
-              <w:t>]]</w:t>
-            </w:r>
-          </w:p>
-        </w:tc>
-        <w:tc>
-          <w:tcPr>
-            <w:tcW w:w="1004" w:type="dxa"/>
-            <w:tcBorders>
-              <w:top w:val="thinThickMediumGap" w:sz="3" w:space="0" w:color="000000"/>
-              <w:left w:val="nil"/>
-              <w:bottom w:val="single" w:sz="6" w:space="0" w:color="000000"/>
-              <w:right w:val="single" w:sz="6" w:space="0" w:color="000000"/>
-            </w:tcBorders>
-            <w:vAlign w:val="center"/>
-          </w:tcPr>
-          <w:p>
-            <w:pPr>
-              <w:pStyle w:val="TableParagraph"/>
-              <w:spacing w:before="0"/>
-              <w:ind w:left="85"/>
-              <w:rPr>
-                <w:sz w:val="20"/>
-              </w:rPr>
-            </w:pPr>
-          </w:p>
-        </w:tc>
-        <w:tc>
-          <w:tcPr>
-            <w:tcW w:w="2326" w:type="dxa"/>
-            <w:gridSpan w:val="2"/>
-            <w:tcBorders>
-              <w:top w:val="thinThickMediumGap" w:sz="3" w:space="0" w:color="000000"/>
-              <w:left w:val="nil"/>
-              <w:bottom w:val="single" w:sz="6" w:space="0" w:color="000000"/>
+              <w:top w:val="thickThinMediumGap" w:sz="4" w:space="0" w:color="000000"/>
+              <w:left w:val="single" w:sz="4" w:space="0" w:color="000000"/>
+              <w:bottom w:val="single" w:sz="4" w:space="0" w:color="000000"/>
               <w:right w:val="single" w:sz="6" w:space="0" w:color="000000"/>
             </w:tcBorders>
             <w:vAlign w:val="center"/>
@@ -3670,6 +3570,7 @@
             <w:gridSpan w:val="2"/>
             <w:tcBorders>
               <w:top w:val="single" w:sz="6" w:space="0" w:color="000000"/>
+              <w:bottom w:val="nil"/>
             </w:tcBorders>
             <w:shd w:val="clear" w:color="auto" w:fill="447987"/>
           </w:tcPr>
@@ -3798,6 +3699,7 @@
           <w:tcPr>
             <w:tcW w:w="1486" w:type="dxa"/>
             <w:tcBorders>
+              <w:top w:val="nil"/>
               <w:left w:val="single" w:sz="6" w:space="0" w:color="000000"/>
               <w:bottom w:val="thickThinMediumGap" w:sz="3" w:space="0" w:color="000000"/>
               <w:right w:val="single" w:sz="6" w:space="0" w:color="000000"/>
@@ -3831,6 +3733,7 @@
           <w:tcPr>
             <w:tcW w:w="1486" w:type="dxa"/>
             <w:tcBorders>
+              <w:top w:val="nil"/>
               <w:left w:val="single" w:sz="6" w:space="0" w:color="000000"/>
               <w:bottom w:val="thickThinMediumGap" w:sz="3" w:space="0" w:color="000000"/>
               <w:right w:val="single" w:sz="6" w:space="0" w:color="000000"/>
@@ -5019,7 +4922,6 @@
     </w:p>
     <w:p>
       <w:r>
-        <w:lastRenderedPageBreak/>
         <w:t>[[</w:t>
       </w:r>
       <w:proofErr w:type="spellStart"/>
@@ -8018,6 +7920,7 @@
     </w:p>
     <w:p>
       <w:r>
+        <w:lastRenderedPageBreak/>
         <w:t>[[</w:t>
       </w:r>
       <w:r>
@@ -8046,7 +7949,6 @@
           <w:spacing w:val="-2"/>
           <w:u w:val="single" w:color="46413B"/>
         </w:rPr>
-        <w:lastRenderedPageBreak/>
         <w:t>Créances</w:t>
       </w:r>
       <w:r>
@@ -10238,12 +10140,14 @@
         <w:ind w:left="528"/>
         <w:jc w:val="both"/>
       </w:pPr>
+      <w:proofErr w:type="gramStart"/>
       <w:r>
         <w:rPr>
           <w:color w:val="46413B"/>
         </w:rPr>
         <w:t>Au</w:t>
       </w:r>
+      <w:proofErr w:type="gramEnd"/>
       <w:r>
         <w:rPr>
           <w:color w:val="46413B"/>
@@ -10292,12 +10196,14 @@
         <w:ind w:left="528"/>
         <w:jc w:val="both"/>
       </w:pPr>
+      <w:proofErr w:type="gramStart"/>
       <w:r>
         <w:rPr>
           <w:color w:val="46413B"/>
         </w:rPr>
         <w:t>Au</w:t>
       </w:r>
+      <w:proofErr w:type="gramEnd"/>
       <w:r>
         <w:rPr>
           <w:color w:val="46413B"/>
@@ -11008,7 +10914,14 @@
         <w:rPr>
           <w:color w:val="46413B"/>
         </w:rPr>
-        <w:t xml:space="preserve">requis encourt des sanctions. Ces sanctions représentent 5 ‰ du chiffre d’affaires déclaré ou rehaussé avec une amende forfaitaire minimum d’un montant de 1 500 €. Par ailleurs, la </w:t>
+        <w:t xml:space="preserve">requis </w:t>
+      </w:r>
+      <w:r>
+        <w:rPr>
+          <w:color w:val="46413B"/>
+        </w:rPr>
+        <w:lastRenderedPageBreak/>
+        <w:t xml:space="preserve">encourt des sanctions. Ces sanctions représentent 5 ‰ du chiffre d’affaires déclaré ou rehaussé avec une amende forfaitaire minimum d’un montant de 1 500 €. Par ailleurs, la </w:t>
       </w:r>
       <w:r>
         <w:rPr>
@@ -11020,14 +10933,7 @@
         <w:rPr>
           <w:color w:val="46413B"/>
         </w:rPr>
-        <w:t xml:space="preserve"> de ce fichier laisse peser le risque de l’évaluation d’office </w:t>
-      </w:r>
-      <w:r>
-        <w:rPr>
-          <w:color w:val="46413B"/>
-        </w:rPr>
-        <w:lastRenderedPageBreak/>
-        <w:t>des bases d’imposition par l’administration. Les enjeux liés à cette obligation sont donc importants.</w:t>
+        <w:t xml:space="preserve"> de ce fichier laisse peser le risque de l’évaluation d’office des bases d’imposition par l’administration. Les enjeux liés à cette obligation sont donc importants.</w:t>
       </w:r>
     </w:p>
     <w:p>
@@ -11807,6 +11713,7 @@
         </w:rPr>
         <w:t xml:space="preserve"> </w:t>
       </w:r>
+      <w:proofErr w:type="gramStart"/>
       <w:r>
         <w:rPr>
           <w:color w:val="46413B"/>
@@ -11829,6 +11736,7 @@
         </w:rPr>
         <w:t>à</w:t>
       </w:r>
+      <w:proofErr w:type="gramEnd"/>
       <w:r>
         <w:rPr>
           <w:color w:val="46413B"/>
@@ -12113,6 +12021,7 @@
         </w:rPr>
         <w:t xml:space="preserve"> </w:t>
       </w:r>
+      <w:proofErr w:type="gramStart"/>
       <w:r>
         <w:rPr>
           <w:color w:val="46413B"/>
@@ -12135,6 +12044,7 @@
         </w:rPr>
         <w:t>au</w:t>
       </w:r>
+      <w:proofErr w:type="gramEnd"/>
       <w:r>
         <w:rPr>
           <w:color w:val="46413B"/>
@@ -12569,6 +12479,7 @@
           <w:color w:val="46413B"/>
         </w:rPr>
       </w:pPr>
+      <w:proofErr w:type="gramStart"/>
       <w:r>
         <w:rPr>
           <w:color w:val="46413B"/>
@@ -12587,6 +12498,7 @@
         </w:rPr>
         <w:t>à</w:t>
       </w:r>
+      <w:proofErr w:type="gramEnd"/>
       <w:r>
         <w:rPr>
           <w:color w:val="46413B"/>
@@ -13833,6 +13745,7 @@
               <w:rPr>
                 <w:sz w:val="20"/>
               </w:rPr>
+              <w:lastRenderedPageBreak/>
               <w:t>Résultat net comptable</w:t>
             </w:r>
           </w:p>
@@ -13921,7 +13834,6 @@
                 <w:color w:val="46413B"/>
                 <w:sz w:val="20"/>
               </w:rPr>
-              <w:lastRenderedPageBreak/>
               <w:t>Dotations aux amortissements et provisions</w:t>
             </w:r>
           </w:p>
@@ -18779,7 +18691,15 @@
           <w:color w:val="46413B"/>
           <w:sz w:val="20"/>
         </w:rPr>
-        <w:t>(respect des règles de distanciation, présence de points d’eau, savon et/ou gel hydroalcoolique, process de désinfection régulière des locaux et des équipements, fourniture de gants et masques, …).</w:t>
+        <w:t xml:space="preserve">(respect des règles de distanciation, présence de points d’eau, savon et/ou gel </w:t>
+      </w:r>
+      <w:r>
+        <w:rPr>
+          <w:color w:val="46413B"/>
+          <w:sz w:val="20"/>
+        </w:rPr>
+        <w:lastRenderedPageBreak/>
+        <w:t>hydroalcoolique, process de désinfection régulière des locaux et des équipements, fourniture de gants et masques, …).</w:t>
       </w:r>
     </w:p>
     <w:p>
@@ -18793,7 +18713,6 @@
         <w:rPr>
           <w:color w:val="46413B"/>
         </w:rPr>
-        <w:lastRenderedPageBreak/>
         <w:t>Ces</w:t>
       </w:r>
       <w:r>
@@ -20073,7 +19992,6 @@
         <w:rPr>
           <w:noProof/>
         </w:rPr>
-        <w:lastRenderedPageBreak/>
         <w:drawing>
           <wp:anchor distT="0" distB="0" distL="0" distR="0" simplePos="0" relativeHeight="487588352" behindDoc="1" locked="0" layoutInCell="1" allowOverlap="1" wp14:anchorId="28E9BD1B" wp14:editId="2A08862F">
             <wp:simplePos x="0" y="0"/>
@@ -20807,7 +20725,6 @@
   <w:style w:type="character" w:default="1" w:styleId="Policepardfaut">
     <w:name w:val="Default Paragraph Font"/>
     <w:uiPriority w:val="1"/>
-    <w:semiHidden/>
     <w:unhideWhenUsed/>
   </w:style>
   <w:style w:type="table" w:default="1" w:styleId="TableauNormal">

</xml_diff>

<commit_message>
ajout tableau recapitulatif des charges externes dans le formulaire pour plus de compréhension
</commit_message>
<xml_diff>
--- a/backend/src/templates/modele_complet.docx
+++ b/backend/src/templates/modele_complet.docx
@@ -3211,28 +3211,31 @@
             <w:r>
               <w:rPr>
                 <w:color w:val="46413B"/>
+                <w:sz w:val="20"/>
+              </w:rPr>
+              <w:t>[[</w:t>
+            </w:r>
+            <w:r>
+              <w:rPr>
+                <w:color w:val="46413B"/>
+                <w:sz w:val="20"/>
+              </w:rPr>
+              <w:t>#</w:t>
+            </w:r>
+            <w:r>
+              <w:rPr>
+                <w:color w:val="46413B"/>
+                <w:sz w:val="20"/>
+              </w:rPr>
+              <w:t>EC_tab]]</w:t>
+            </w:r>
+            <w:r>
+              <w:rPr>
+                <w:color w:val="46413B"/>
                 <w:spacing w:val="-2"/>
                 <w:sz w:val="20"/>
               </w:rPr>
-              <w:t>[[</w:t>
-            </w:r>
-            <w:proofErr w:type="spellStart"/>
-            <w:r>
-              <w:rPr>
-                <w:color w:val="46413B"/>
-                <w:spacing w:val="-2"/>
-                <w:sz w:val="20"/>
-              </w:rPr>
-              <w:t>EC_lib</w:t>
-            </w:r>
-            <w:proofErr w:type="spellEnd"/>
-            <w:r>
-              <w:rPr>
-                <w:color w:val="46413B"/>
-                <w:spacing w:val="-2"/>
-                <w:sz w:val="20"/>
-              </w:rPr>
-              <w:t>]]</w:t>
+              <w:t>[[EC_lib]]</w:t>
             </w:r>
           </w:p>
         </w:tc>
@@ -10140,14 +10143,12 @@
         <w:ind w:left="528"/>
         <w:jc w:val="both"/>
       </w:pPr>
-      <w:proofErr w:type="gramStart"/>
       <w:r>
         <w:rPr>
           <w:color w:val="46413B"/>
         </w:rPr>
         <w:t>Au</w:t>
       </w:r>
-      <w:proofErr w:type="gramEnd"/>
       <w:r>
         <w:rPr>
           <w:color w:val="46413B"/>
@@ -10196,14 +10197,12 @@
         <w:ind w:left="528"/>
         <w:jc w:val="both"/>
       </w:pPr>
-      <w:proofErr w:type="gramStart"/>
       <w:r>
         <w:rPr>
           <w:color w:val="46413B"/>
         </w:rPr>
         <w:t>Au</w:t>
       </w:r>
-      <w:proofErr w:type="gramEnd"/>
       <w:r>
         <w:rPr>
           <w:color w:val="46413B"/>
@@ -11713,7 +11712,6 @@
         </w:rPr>
         <w:t xml:space="preserve"> </w:t>
       </w:r>
-      <w:proofErr w:type="gramStart"/>
       <w:r>
         <w:rPr>
           <w:color w:val="46413B"/>
@@ -11736,7 +11734,6 @@
         </w:rPr>
         <w:t>à</w:t>
       </w:r>
-      <w:proofErr w:type="gramEnd"/>
       <w:r>
         <w:rPr>
           <w:color w:val="46413B"/>
@@ -12021,7 +12018,6 @@
         </w:rPr>
         <w:t xml:space="preserve"> </w:t>
       </w:r>
-      <w:proofErr w:type="gramStart"/>
       <w:r>
         <w:rPr>
           <w:color w:val="46413B"/>
@@ -12044,7 +12040,6 @@
         </w:rPr>
         <w:t>au</w:t>
       </w:r>
-      <w:proofErr w:type="gramEnd"/>
       <w:r>
         <w:rPr>
           <w:color w:val="46413B"/>
@@ -12479,7 +12474,6 @@
           <w:color w:val="46413B"/>
         </w:rPr>
       </w:pPr>
-      <w:proofErr w:type="gramStart"/>
       <w:r>
         <w:rPr>
           <w:color w:val="46413B"/>
@@ -12498,7 +12492,6 @@
         </w:rPr>
         <w:t>à</w:t>
       </w:r>
-      <w:proofErr w:type="gramEnd"/>
       <w:r>
         <w:rPr>
           <w:color w:val="46413B"/>
@@ -20725,6 +20718,7 @@
   <w:style w:type="character" w:default="1" w:styleId="Policepardfaut">
     <w:name w:val="Default Paragraph Font"/>
     <w:uiPriority w:val="1"/>
+    <w:semiHidden/>
     <w:unhideWhenUsed/>
   </w:style>
   <w:style w:type="table" w:default="1" w:styleId="TableauNormal">

</xml_diff>

<commit_message>
filtrage des charges externes via le formulaire fonctionne
</commit_message>
<xml_diff>
--- a/backend/src/templates/modele_complet.docx
+++ b/backend/src/templates/modele_complet.docx
@@ -3376,65 +3376,57 @@
             <w:pPr>
               <w:ind w:right="85"/>
               <w:jc w:val="right"/>
-            </w:pPr>
-            <w:r>
-              <w:rPr>
-                <w:color w:val="46413B"/>
-                <w:sz w:val="20"/>
-              </w:rPr>
-              <w:t>[[</w:t>
-            </w:r>
-            <w:proofErr w:type="spellStart"/>
-            <w:r>
-              <w:rPr>
-                <w:color w:val="46413B"/>
-                <w:sz w:val="20"/>
-              </w:rPr>
-              <w:t>EC_%Var</w:t>
-            </w:r>
-            <w:proofErr w:type="spellEnd"/>
-            <w:r>
-              <w:rPr>
-                <w:color w:val="46413B"/>
-                <w:sz w:val="20"/>
-              </w:rPr>
-              <w:t>]]</w:t>
-            </w:r>
-            <w:r>
-              <w:rPr>
-                <w:color w:val="46413B"/>
-                <w:sz w:val="20"/>
-              </w:rPr>
-              <w:t xml:space="preserve"> [[/</w:t>
-            </w:r>
-            <w:proofErr w:type="spellStart"/>
-            <w:r>
-              <w:rPr>
-                <w:color w:val="46413B"/>
-                <w:sz w:val="20"/>
-              </w:rPr>
-              <w:t>EC_tab</w:t>
-            </w:r>
-            <w:proofErr w:type="spellEnd"/>
-            <w:r>
-              <w:rPr>
-                <w:color w:val="46413B"/>
-                <w:sz w:val="20"/>
-              </w:rPr>
-              <w:t>]]</w:t>
-            </w:r>
-          </w:p>
-          <w:p>
-            <w:pPr>
-              <w:pStyle w:val="TableParagraph"/>
-              <w:spacing w:before="0" w:line="240" w:lineRule="auto"/>
-              <w:ind w:right="85"/>
-              <w:jc w:val="right"/>
               <w:rPr>
                 <w:rFonts w:ascii="Times New Roman"/>
                 <w:sz w:val="18"/>
               </w:rPr>
             </w:pPr>
+            <w:r>
+              <w:rPr>
+                <w:color w:val="46413B"/>
+                <w:sz w:val="20"/>
+              </w:rPr>
+              <w:t>[[</w:t>
+            </w:r>
+            <w:proofErr w:type="spellStart"/>
+            <w:r>
+              <w:rPr>
+                <w:color w:val="46413B"/>
+                <w:sz w:val="20"/>
+              </w:rPr>
+              <w:t>EC_%Var</w:t>
+            </w:r>
+            <w:proofErr w:type="spellEnd"/>
+            <w:r>
+              <w:rPr>
+                <w:color w:val="46413B"/>
+                <w:sz w:val="20"/>
+              </w:rPr>
+              <w:t>]]</w:t>
+            </w:r>
+            <w:r>
+              <w:rPr>
+                <w:color w:val="46413B"/>
+                <w:sz w:val="20"/>
+              </w:rPr>
+              <w:t>[[/</w:t>
+            </w:r>
+            <w:proofErr w:type="spellStart"/>
+            <w:r>
+              <w:rPr>
+                <w:color w:val="46413B"/>
+                <w:sz w:val="20"/>
+              </w:rPr>
+              <w:t>EC_tab</w:t>
+            </w:r>
+            <w:proofErr w:type="spellEnd"/>
+            <w:r>
+              <w:rPr>
+                <w:color w:val="46413B"/>
+                <w:sz w:val="20"/>
+              </w:rPr>
+              <w:t>]]</w:t>
+            </w:r>
           </w:p>
         </w:tc>
       </w:tr>
@@ -4925,6 +4917,7 @@
     </w:p>
     <w:p>
       <w:r>
+        <w:lastRenderedPageBreak/>
         <w:t>[[</w:t>
       </w:r>
       <w:proofErr w:type="spellStart"/>
@@ -7923,7 +7916,6 @@
     </w:p>
     <w:p>
       <w:r>
-        <w:lastRenderedPageBreak/>
         <w:t>[[</w:t>
       </w:r>
       <w:r>
@@ -7952,6 +7944,7 @@
           <w:spacing w:val="-2"/>
           <w:u w:val="single" w:color="46413B"/>
         </w:rPr>
+        <w:lastRenderedPageBreak/>
         <w:t>Créances</w:t>
       </w:r>
       <w:r>
@@ -10913,26 +10906,26 @@
         <w:rPr>
           <w:color w:val="46413B"/>
         </w:rPr>
-        <w:t xml:space="preserve">requis </w:t>
+        <w:t xml:space="preserve">requis encourt des sanctions. Ces sanctions représentent 5 ‰ du chiffre d’affaires déclaré ou rehaussé avec une amende forfaitaire minimum d’un montant de 1 500 €. Par ailleurs, la </w:t>
+      </w:r>
+      <w:r>
+        <w:rPr>
+          <w:color w:val="46413B"/>
+        </w:rPr>
+        <w:t>non-présentation</w:t>
+      </w:r>
+      <w:r>
+        <w:rPr>
+          <w:color w:val="46413B"/>
+        </w:rPr>
+        <w:t xml:space="preserve"> de ce fichier laisse peser le risque de l’évaluation d’office </w:t>
       </w:r>
       <w:r>
         <w:rPr>
           <w:color w:val="46413B"/>
         </w:rPr>
         <w:lastRenderedPageBreak/>
-        <w:t xml:space="preserve">encourt des sanctions. Ces sanctions représentent 5 ‰ du chiffre d’affaires déclaré ou rehaussé avec une amende forfaitaire minimum d’un montant de 1 500 €. Par ailleurs, la </w:t>
-      </w:r>
-      <w:r>
-        <w:rPr>
-          <w:color w:val="46413B"/>
-        </w:rPr>
-        <w:t>non-présentation</w:t>
-      </w:r>
-      <w:r>
-        <w:rPr>
-          <w:color w:val="46413B"/>
-        </w:rPr>
-        <w:t xml:space="preserve"> de ce fichier laisse peser le risque de l’évaluation d’office des bases d’imposition par l’administration. Les enjeux liés à cette obligation sont donc importants.</w:t>
+        <w:t>des bases d’imposition par l’administration. Les enjeux liés à cette obligation sont donc importants.</w:t>
       </w:r>
     </w:p>
     <w:p>
@@ -13738,7 +13731,6 @@
               <w:rPr>
                 <w:sz w:val="20"/>
               </w:rPr>
-              <w:lastRenderedPageBreak/>
               <w:t>Résultat net comptable</w:t>
             </w:r>
           </w:p>
@@ -13827,6 +13819,7 @@
                 <w:color w:val="46413B"/>
                 <w:sz w:val="20"/>
               </w:rPr>
+              <w:lastRenderedPageBreak/>
               <w:t>Dotations aux amortissements et provisions</w:t>
             </w:r>
           </w:p>
@@ -18684,15 +18677,7 @@
           <w:color w:val="46413B"/>
           <w:sz w:val="20"/>
         </w:rPr>
-        <w:t xml:space="preserve">(respect des règles de distanciation, présence de points d’eau, savon et/ou gel </w:t>
-      </w:r>
-      <w:r>
-        <w:rPr>
-          <w:color w:val="46413B"/>
-          <w:sz w:val="20"/>
-        </w:rPr>
-        <w:lastRenderedPageBreak/>
-        <w:t>hydroalcoolique, process de désinfection régulière des locaux et des équipements, fourniture de gants et masques, …).</w:t>
+        <w:t>(respect des règles de distanciation, présence de points d’eau, savon et/ou gel hydroalcoolique, process de désinfection régulière des locaux et des équipements, fourniture de gants et masques, …).</w:t>
       </w:r>
     </w:p>
     <w:p>
@@ -18706,6 +18691,7 @@
         <w:rPr>
           <w:color w:val="46413B"/>
         </w:rPr>
+        <w:lastRenderedPageBreak/>
         <w:t>Ces</w:t>
       </w:r>
       <w:r>
@@ -19985,6 +19971,7 @@
         <w:rPr>
           <w:noProof/>
         </w:rPr>
+        <w:lastRenderedPageBreak/>
         <w:drawing>
           <wp:anchor distT="0" distB="0" distL="0" distR="0" simplePos="0" relativeHeight="487588352" behindDoc="1" locked="0" layoutInCell="1" allowOverlap="1" wp14:anchorId="28E9BD1B" wp14:editId="2A08862F">
             <wp:simplePos x="0" y="0"/>

</xml_diff>

<commit_message>
commentaires sur les charges externes reformulés et bien affichés dans le tableau word
</commit_message>
<xml_diff>
--- a/backend/src/templates/modele_complet.docx
+++ b/backend/src/templates/modele_complet.docx
@@ -232,13 +232,17 @@
       <w:r>
         <w:t>[[</w:t>
       </w:r>
-      <w:proofErr w:type="spellStart"/>
-      <w:r>
-        <w:t>adresseEntreprise</w:t>
-      </w:r>
-      <w:proofErr w:type="spellEnd"/>
+      <w:r>
+        <w:t>adrEntreprise</w:t>
+      </w:r>
+      <w:r>
+        <w:t>1</w:t>
+      </w:r>
       <w:r>
         <w:t>]]</w:t>
+      </w:r>
+      <w:r>
+        <w:t>[[adrEntreprise2]]</w:t>
       </w:r>
     </w:p>
     <w:p>
@@ -502,6 +506,10 @@
       <w:pPr>
         <w:pStyle w:val="Titre1"/>
         <w:spacing w:after="36"/>
+        <w:rPr>
+          <w:color w:val="46413B"/>
+          <w:spacing w:val="-4"/>
+        </w:rPr>
       </w:pPr>
       <w:r>
         <w:rPr>
@@ -525,6 +533,20 @@
         <w:t>CLES</w:t>
       </w:r>
     </w:p>
+    <w:p>
+      <w:r>
+        <w:t>[[</w:t>
+      </w:r>
+      <w:proofErr w:type="spellStart"/>
+      <w:r>
+        <w:t>CC_comPerspective</w:t>
+      </w:r>
+      <w:proofErr w:type="spellEnd"/>
+      <w:r>
+        <w:t>]]</w:t>
+      </w:r>
+    </w:p>
+    <w:p/>
     <w:tbl>
       <w:tblPr>
         <w:tblStyle w:val="TableNormal"/>
@@ -2748,6 +2770,7 @@
         </w:tc>
       </w:tr>
     </w:tbl>
+    <w:p/>
     <w:p>
       <w:r>
         <w:t>[[</w:t>
@@ -2760,12 +2783,6 @@
         <w:t>_</w:t>
       </w:r>
       <w:r>
-        <w:t>progressionChiffre</w:t>
-      </w:r>
-      <w:r>
-        <w:t>_</w:t>
-      </w:r>
-      <w:r>
         <w:t>commentaire</w:t>
       </w:r>
       <w:proofErr w:type="spellEnd"/>
@@ -2773,31 +2790,7 @@
         <w:t>]]</w:t>
       </w:r>
     </w:p>
-    <w:p>
-      <w:r>
-        <w:t>[[</w:t>
-      </w:r>
-      <w:proofErr w:type="spellStart"/>
-      <w:r>
-        <w:t>CC</w:t>
-      </w:r>
-      <w:r>
-        <w:t>_</w:t>
-      </w:r>
-      <w:r>
-        <w:t>tauxMarge</w:t>
-      </w:r>
-      <w:r>
-        <w:t>_</w:t>
-      </w:r>
-      <w:r>
-        <w:t>commentaire</w:t>
-      </w:r>
-      <w:proofErr w:type="spellEnd"/>
-      <w:r>
-        <w:t>]]</w:t>
-      </w:r>
-    </w:p>
+    <w:p/>
     <w:p>
       <w:r>
         <w:t>[[</w:t>
@@ -2915,6 +2908,7 @@
         <w:t>ACHATS</w:t>
       </w:r>
     </w:p>
+    <w:p/>
     <w:tbl>
       <w:tblPr>
         <w:tblStyle w:val="TableNormal"/>
@@ -3194,7 +3188,7 @@
             <w:tcBorders>
               <w:top w:val="thickThinMediumGap" w:sz="4" w:space="0" w:color="000000"/>
               <w:left w:val="single" w:sz="4" w:space="0" w:color="000000"/>
-              <w:bottom w:val="single" w:sz="4" w:space="0" w:color="000000"/>
+              <w:bottom w:val="single" w:sz="4" w:space="0" w:color="auto"/>
               <w:right w:val="single" w:sz="6" w:space="0" w:color="000000"/>
             </w:tcBorders>
             <w:vAlign w:val="center"/>
@@ -3203,7 +3197,6 @@
             <w:pPr>
               <w:pStyle w:val="TableParagraph"/>
               <w:spacing w:before="0"/>
-              <w:ind w:left="85"/>
               <w:rPr>
                 <w:sz w:val="20"/>
               </w:rPr>
@@ -3211,23 +3204,10 @@
             <w:r>
               <w:rPr>
                 <w:color w:val="46413B"/>
-                <w:sz w:val="20"/>
-              </w:rPr>
-              <w:t>[[</w:t>
-            </w:r>
-            <w:r>
-              <w:rPr>
-                <w:color w:val="46413B"/>
-                <w:sz w:val="20"/>
-              </w:rPr>
-              <w:t>#</w:t>
-            </w:r>
-            <w:r>
-              <w:rPr>
-                <w:color w:val="46413B"/>
-                <w:sz w:val="20"/>
-              </w:rPr>
-              <w:t>EC_tab]]</w:t>
+                <w:spacing w:val="-2"/>
+                <w:sz w:val="20"/>
+              </w:rPr>
+              <w:t>[[#EC_tab]]</w:t>
             </w:r>
             <w:r>
               <w:rPr>
@@ -3245,7 +3225,7 @@
             <w:tcBorders>
               <w:top w:val="thinThickMediumGap" w:sz="3" w:space="0" w:color="000000"/>
               <w:left w:val="single" w:sz="6" w:space="0" w:color="000000"/>
-              <w:bottom w:val="single" w:sz="6" w:space="0" w:color="000000"/>
+              <w:bottom w:val="single" w:sz="4" w:space="0" w:color="auto"/>
               <w:right w:val="single" w:sz="6" w:space="0" w:color="000000"/>
             </w:tcBorders>
             <w:vAlign w:val="center"/>
@@ -3291,7 +3271,7 @@
             <w:tcBorders>
               <w:top w:val="thinThickMediumGap" w:sz="3" w:space="0" w:color="000000"/>
               <w:left w:val="single" w:sz="6" w:space="0" w:color="000000"/>
-              <w:bottom w:val="single" w:sz="6" w:space="0" w:color="000000"/>
+              <w:bottom w:val="single" w:sz="4" w:space="0" w:color="auto"/>
               <w:right w:val="single" w:sz="6" w:space="0" w:color="000000"/>
             </w:tcBorders>
             <w:vAlign w:val="center"/>
@@ -3321,7 +3301,7 @@
             <w:tcBorders>
               <w:top w:val="thinThickMediumGap" w:sz="3" w:space="0" w:color="000000"/>
               <w:left w:val="single" w:sz="6" w:space="0" w:color="000000"/>
-              <w:bottom w:val="single" w:sz="6" w:space="0" w:color="000000"/>
+              <w:bottom w:val="single" w:sz="4" w:space="0" w:color="auto"/>
               <w:right w:val="single" w:sz="6" w:space="0" w:color="000000"/>
             </w:tcBorders>
             <w:vAlign w:val="center"/>
@@ -3367,7 +3347,7 @@
             <w:tcBorders>
               <w:top w:val="thinThickMediumGap" w:sz="3" w:space="0" w:color="000000"/>
               <w:left w:val="single" w:sz="6" w:space="0" w:color="000000"/>
-              <w:bottom w:val="single" w:sz="6" w:space="0" w:color="000000"/>
+              <w:bottom w:val="single" w:sz="4" w:space="0" w:color="auto"/>
               <w:right w:val="dashed" w:sz="6" w:space="0" w:color="000000"/>
             </w:tcBorders>
             <w:vAlign w:val="center"/>
@@ -3404,6 +3384,95 @@
               </w:rPr>
               <w:t>]]</w:t>
             </w:r>
+          </w:p>
+        </w:tc>
+      </w:tr>
+      <w:tr>
+        <w:trPr>
+          <w:trHeight w:val="273"/>
+        </w:trPr>
+        <w:tc>
+          <w:tcPr>
+            <w:tcW w:w="9050" w:type="dxa"/>
+            <w:gridSpan w:val="5"/>
+            <w:tcBorders>
+              <w:top w:val="single" w:sz="4" w:space="0" w:color="auto"/>
+              <w:left w:val="single" w:sz="4" w:space="0" w:color="000000"/>
+              <w:bottom w:val="single" w:sz="4" w:space="0" w:color="auto"/>
+              <w:right w:val="dashed" w:sz="6" w:space="0" w:color="000000"/>
+            </w:tcBorders>
+            <w:vAlign w:val="center"/>
+          </w:tcPr>
+          <w:p>
+            <w:pPr>
+              <w:spacing w:before="120" w:after="120"/>
+              <w:rPr>
+                <w:i/>
+                <w:iCs/>
+                <w:color w:val="46413B"/>
+                <w:sz w:val="14"/>
+                <w:szCs w:val="14"/>
+              </w:rPr>
+            </w:pPr>
+            <w:r>
+              <w:rPr>
+                <w:i/>
+                <w:iCs/>
+                <w:color w:val="46413B"/>
+                <w:sz w:val="14"/>
+                <w:szCs w:val="14"/>
+              </w:rPr>
+              <w:t>[[#EC_comment_tab]][[.]]</w:t>
+            </w:r>
+          </w:p>
+        </w:tc>
+      </w:tr>
+      <w:tr>
+        <w:trPr>
+          <w:trHeight w:val="273"/>
+        </w:trPr>
+        <w:tc>
+          <w:tcPr>
+            <w:tcW w:w="9050" w:type="dxa"/>
+            <w:gridSpan w:val="5"/>
+            <w:tcBorders>
+              <w:top w:val="single" w:sz="4" w:space="0" w:color="auto"/>
+              <w:left w:val="single" w:sz="4" w:space="0" w:color="000000"/>
+              <w:bottom w:val="single" w:sz="4" w:space="0" w:color="auto"/>
+              <w:right w:val="dashed" w:sz="6" w:space="0" w:color="000000"/>
+            </w:tcBorders>
+            <w:vAlign w:val="center"/>
+          </w:tcPr>
+          <w:p>
+            <w:pPr>
+              <w:rPr>
+                <w:color w:val="46413B"/>
+                <w:sz w:val="20"/>
+              </w:rPr>
+            </w:pPr>
+            <w:r>
+              <w:rPr>
+                <w:color w:val="46413B"/>
+                <w:sz w:val="20"/>
+              </w:rPr>
+              <w:t>[[/</w:t>
+            </w:r>
+            <w:proofErr w:type="spellStart"/>
+            <w:r>
+              <w:rPr>
+                <w:color w:val="46413B"/>
+                <w:sz w:val="20"/>
+              </w:rPr>
+              <w:t>EC_comment_tab</w:t>
+            </w:r>
+            <w:proofErr w:type="spellEnd"/>
+            <w:r>
+              <w:rPr>
+                <w:color w:val="46413B"/>
+                <w:sz w:val="20"/>
+              </w:rPr>
+              <w:t>]]</w:t>
+            </w:r>
             <w:r>
               <w:rPr>
                 <w:color w:val="46413B"/>
@@ -3435,6 +3504,9 @@
       <w:r>
         <w:t>[[</w:t>
       </w:r>
+      <w:r>
+        <w:t>/</w:t>
+      </w:r>
       <w:proofErr w:type="spellStart"/>
       <w:r>
         <w:t>EC</w:t>
@@ -3443,35 +3515,14 @@
         <w:t>_</w:t>
       </w:r>
       <w:r>
-        <w:t>commentaire</w:t>
+        <w:t>masquerSection</w:t>
       </w:r>
       <w:proofErr w:type="spellEnd"/>
       <w:r>
         <w:t>]]</w:t>
       </w:r>
     </w:p>
-    <w:p>
-      <w:r>
-        <w:t>[[</w:t>
-      </w:r>
-      <w:r>
-        <w:t>/</w:t>
-      </w:r>
-      <w:proofErr w:type="spellStart"/>
-      <w:r>
-        <w:t>EC</w:t>
-      </w:r>
-      <w:r>
-        <w:t>_</w:t>
-      </w:r>
-      <w:r>
-        <w:t>masquerSection</w:t>
-      </w:r>
-      <w:proofErr w:type="spellEnd"/>
-      <w:r>
-        <w:t>]]</w:t>
-      </w:r>
-    </w:p>
+    <w:p/>
     <w:p>
       <w:pPr>
         <w:pStyle w:val="Titre1"/>
@@ -4590,7 +4641,7 @@
                 <w:spacing w:val="-5"/>
                 <w:sz w:val="20"/>
               </w:rPr>
-              <w:t>CP_heuresVal</w:t>
+              <w:t>CP_heureVal</w:t>
             </w:r>
             <w:proofErr w:type="spellEnd"/>
             <w:r>
@@ -4628,14 +4679,20 @@
               <w:rPr>
                 <w:sz w:val="20"/>
               </w:rPr>
-              <w:t>[[</w:t>
+              <w:t>[[CP_%</w:t>
             </w:r>
             <w:proofErr w:type="spellStart"/>
             <w:r>
               <w:rPr>
                 <w:sz w:val="20"/>
               </w:rPr>
-              <w:t>CP_%heures</w:t>
+              <w:t>heure</w:t>
+            </w:r>
+            <w:r>
+              <w:rPr>
+                <w:sz w:val="20"/>
+              </w:rPr>
+              <w:t>Val</w:t>
             </w:r>
             <w:proofErr w:type="spellEnd"/>
             <w:r>
@@ -4676,6 +4733,7 @@
                 <w:color w:val="46413B"/>
                 <w:sz w:val="20"/>
               </w:rPr>
+              <w:lastRenderedPageBreak/>
               <w:t>Coût</w:t>
             </w:r>
             <w:r>
@@ -4862,6 +4920,8 @@
       <w:r>
         <w:br w:type="textWrapping" w:clear="all"/>
       </w:r>
+    </w:p>
+    <w:p>
       <w:r>
         <w:t>[[</w:t>
       </w:r>
@@ -4917,7 +4977,6 @@
     </w:p>
     <w:p>
       <w:r>
-        <w:lastRenderedPageBreak/>
         <w:t>[[</w:t>
       </w:r>
       <w:proofErr w:type="spellStart"/>
@@ -6306,7 +6365,7 @@
         <w:t>[[#</w:t>
       </w:r>
       <w:r>
-        <w:t>IF</w:t>
+        <w:t>informationFiscale</w:t>
       </w:r>
       <w:r>
         <w:t>_hasAny</w:t>
@@ -6355,7 +6414,7 @@
         <w:t>#</w:t>
       </w:r>
       <w:r>
-        <w:t>IF</w:t>
+        <w:t>informationFiscale</w:t>
       </w:r>
       <w:r>
         <w:t>_Rnovation_et_taux_rduit_de_TVA</w:t>
@@ -6738,7 +6797,7 @@
       </w:r>
       <w:proofErr w:type="spellStart"/>
       <w:r>
-        <w:t>IF</w:t>
+        <w:t>informationFiscale</w:t>
       </w:r>
       <w:r>
         <w:t>_Rnovation_et_taux_rduit_de_TVA</w:t>
@@ -6756,7 +6815,7 @@
         <w:t>#</w:t>
       </w:r>
       <w:r>
-        <w:t>IF</w:t>
+        <w:t>informationFiscale</w:t>
       </w:r>
       <w:r>
         <w:t>_Prestataire_soustraitant__lattestation_de_vigilence</w:t>
@@ -7271,24 +7330,11 @@
         <w:t>/</w:t>
       </w:r>
       <w:r>
-        <w:t>IF</w:t>
-      </w:r>
-      <w:r>
-        <w:t>_Prestataire_</w:t>
-      </w:r>
-      <w:proofErr w:type="spellStart"/>
-      <w:r>
-        <w:t>soustraitant</w:t>
-      </w:r>
-      <w:proofErr w:type="spellEnd"/>
-      <w:r>
-        <w:t>__</w:t>
-      </w:r>
-      <w:proofErr w:type="spellStart"/>
-      <w:r>
-        <w:t>lattestation_de_vigilence</w:t>
-      </w:r>
-      <w:proofErr w:type="spellEnd"/>
+        <w:t>informationFiscale</w:t>
+      </w:r>
+      <w:r>
+        <w:t>_Prestataire_soustraitant__lattestation_de_vigilence</w:t>
+      </w:r>
       <w:r>
         <w:t>]]</w:t>
       </w:r>
@@ -7301,7 +7347,7 @@
         <w:t>#</w:t>
       </w:r>
       <w:r>
-        <w:t>IF</w:t>
+        <w:t>informationFiscale</w:t>
       </w:r>
       <w:r>
         <w:t>_Utilisation_de_une_ou_plusieurs_caisses_enregistreuses_ou_dun_systme_informatique_de_caisse</w:t>
@@ -7631,7 +7677,14 @@
         <w:rPr>
           <w:color w:val="46413B"/>
         </w:rPr>
-        <w:t xml:space="preserve">votre activité. Vous êtes, en conséquence, concerné par l'entrée en application au </w:t>
+        <w:t xml:space="preserve">votre </w:t>
+      </w:r>
+      <w:r>
+        <w:rPr>
+          <w:color w:val="46413B"/>
+        </w:rPr>
+        <w:lastRenderedPageBreak/>
+        <w:t xml:space="preserve">activité. Vous êtes, en conséquence, concerné par l'entrée en application au </w:t>
       </w:r>
       <w:r>
         <w:rPr>
@@ -7905,7 +7958,7 @@
         <w:t>/</w:t>
       </w:r>
       <w:r>
-        <w:t>IF</w:t>
+        <w:t>informationFiscale</w:t>
       </w:r>
       <w:r>
         <w:t>_Utilisation_de_une_ou_plusieurs_caisses_enregistreuses_ou_dun_systme_informatique_de_caisse</w:t>
@@ -7922,7 +7975,7 @@
         <w:t>#</w:t>
       </w:r>
       <w:r>
-        <w:t>IF</w:t>
+        <w:t>informationFiscale</w:t>
       </w:r>
       <w:r>
         <w:t>_Crances_irrcouvrables</w:t>
@@ -7944,7 +7997,6 @@
           <w:spacing w:val="-2"/>
           <w:u w:val="single" w:color="46413B"/>
         </w:rPr>
-        <w:lastRenderedPageBreak/>
         <w:t>Créances</w:t>
       </w:r>
       <w:r>
@@ -8001,7 +8053,7 @@
       </w:r>
       <w:proofErr w:type="spellStart"/>
       <w:r>
-        <w:t>IF</w:t>
+        <w:t>informationFiscale</w:t>
       </w:r>
       <w:r>
         <w:t>_Crances_irrcouvrables</w:t>
@@ -8019,7 +8071,7 @@
         <w:t>#</w:t>
       </w:r>
       <w:r>
-        <w:t>IF</w:t>
+        <w:t>informationFiscale</w:t>
       </w:r>
       <w:r>
         <w:t>_Rupture_dans_une_squence_de_numrotation_de_facturation</w:t>
@@ -9625,14 +9677,12 @@
       <w:r>
         <w:t>/</w:t>
       </w:r>
-      <w:proofErr w:type="spellStart"/>
-      <w:r>
-        <w:t>IF</w:t>
+      <w:r>
+        <w:t>informationFiscale</w:t>
       </w:r>
       <w:r>
         <w:t>_Rupture_dans_une_squence_de_numrotation_de_facturation</w:t>
       </w:r>
-      <w:proofErr w:type="spellEnd"/>
       <w:r>
         <w:t>]]</w:t>
       </w:r>
@@ -9645,7 +9695,7 @@
         <w:t>#</w:t>
       </w:r>
       <w:r>
-        <w:t>IF</w:t>
+        <w:t>informationFiscale</w:t>
       </w:r>
       <w:r>
         <w:t>_Perte_de_la_moiti_de_capital_social</w:t>
@@ -9962,7 +10012,7 @@
       </w:r>
       <w:proofErr w:type="spellStart"/>
       <w:r>
-        <w:t>IF</w:t>
+        <w:t>informationFiscale</w:t>
       </w:r>
       <w:r>
         <w:t>_Perte_de_la_moiti_de_capital_social</w:t>
@@ -9980,7 +10030,7 @@
         <w:t>#</w:t>
       </w:r>
       <w:r>
-        <w:t>IF</w:t>
+        <w:t>informationFiscale</w:t>
       </w:r>
       <w:r>
         <w:t>_Comptes_courants_dbiteurs</w:t>
@@ -10136,12 +10186,14 @@
         <w:ind w:left="528"/>
         <w:jc w:val="both"/>
       </w:pPr>
+      <w:proofErr w:type="gramStart"/>
       <w:r>
         <w:rPr>
           <w:color w:val="46413B"/>
         </w:rPr>
         <w:t>Au</w:t>
       </w:r>
+      <w:proofErr w:type="gramEnd"/>
       <w:r>
         <w:rPr>
           <w:color w:val="46413B"/>
@@ -10190,12 +10242,14 @@
         <w:ind w:left="528"/>
         <w:jc w:val="both"/>
       </w:pPr>
+      <w:proofErr w:type="gramStart"/>
       <w:r>
         <w:rPr>
           <w:color w:val="46413B"/>
         </w:rPr>
         <w:t>Au</w:t>
       </w:r>
+      <w:proofErr w:type="gramEnd"/>
       <w:r>
         <w:rPr>
           <w:color w:val="46413B"/>
@@ -10424,6 +10478,7 @@
     </w:p>
     <w:p>
       <w:r>
+        <w:lastRenderedPageBreak/>
         <w:t>[[</w:t>
       </w:r>
       <w:r>
@@ -10431,7 +10486,7 @@
       </w:r>
       <w:proofErr w:type="spellStart"/>
       <w:r>
-        <w:t>IF</w:t>
+        <w:t>informationFiscale</w:t>
       </w:r>
       <w:r>
         <w:t>_Comptes_courants_dbiteurs</w:t>
@@ -10449,7 +10504,7 @@
         <w:t>#</w:t>
       </w:r>
       <w:r>
-        <w:t>IF</w:t>
+        <w:t>informationFiscale</w:t>
       </w:r>
       <w:r>
         <w:t>_Obligation_FEC_pour_les_comptabilits_externes</w:t>
@@ -10918,14 +10973,7 @@
         <w:rPr>
           <w:color w:val="46413B"/>
         </w:rPr>
-        <w:t xml:space="preserve"> de ce fichier laisse peser le risque de l’évaluation d’office </w:t>
-      </w:r>
-      <w:r>
-        <w:rPr>
-          <w:color w:val="46413B"/>
-        </w:rPr>
-        <w:lastRenderedPageBreak/>
-        <w:t>des bases d’imposition par l’administration. Les enjeux liés à cette obligation sont donc importants.</w:t>
+        <w:t xml:space="preserve"> de ce fichier laisse peser le risque de l’évaluation d’office des bases d’imposition par l’administration. Les enjeux liés à cette obligation sont donc importants.</w:t>
       </w:r>
     </w:p>
     <w:p>
@@ -10935,14 +10983,12 @@
       <w:r>
         <w:t>/</w:t>
       </w:r>
-      <w:proofErr w:type="spellStart"/>
-      <w:r>
-        <w:t>IF</w:t>
+      <w:r>
+        <w:t>informationFiscale</w:t>
       </w:r>
       <w:r>
         <w:t>_Obligation_FEC_pour_les_comptabilits_externes</w:t>
       </w:r>
-      <w:proofErr w:type="spellEnd"/>
       <w:r>
         <w:t>]]</w:t>
       </w:r>
@@ -10955,7 +11001,7 @@
         <w:t>#</w:t>
       </w:r>
       <w:r>
-        <w:t>IF</w:t>
+        <w:t>informationFiscale</w:t>
       </w:r>
       <w:r>
         <w:t>_Obligation_des_entreprises_individuelles</w:t>
@@ -11060,7 +11106,7 @@
       </w:r>
       <w:proofErr w:type="spellStart"/>
       <w:r>
-        <w:t>IF</w:t>
+        <w:t>informationFiscale</w:t>
       </w:r>
       <w:r>
         <w:t>_Obligation_des_entreprises_individuelles</w:t>
@@ -11078,7 +11124,7 @@
         <w:t>#</w:t>
       </w:r>
       <w:r>
-        <w:t>IF</w:t>
+        <w:t>informationFiscale</w:t>
       </w:r>
       <w:r>
         <w:t>_Dclaration_de_revenus__obligation_du_grant_de_transmettre_les_documents_aux_associs</w:t>
@@ -11302,7 +11348,7 @@
         <w:t>/</w:t>
       </w:r>
       <w:r>
-        <w:t>IF</w:t>
+        <w:t>informationFiscale</w:t>
       </w:r>
       <w:r>
         <w:t>_Dclaration_de_revenus__obligation_du_grant_de_transmettre_les_documents_aux_associs</w:t>
@@ -11319,7 +11365,7 @@
         <w:t>#</w:t>
       </w:r>
       <w:r>
-        <w:t>IF</w:t>
+        <w:t>informationFiscale</w:t>
       </w:r>
       <w:r>
         <w:t>_Non_affiliation__la_mdecine_du_travail</w:t>
@@ -11548,7 +11594,7 @@
         <w:t>/</w:t>
       </w:r>
       <w:r>
-        <w:t>IF</w:t>
+        <w:t>informationFiscale</w:t>
       </w:r>
       <w:r>
         <w:t>_Non_affiliation__</w:t>
@@ -11570,7 +11616,7 @@
         <w:t>#</w:t>
       </w:r>
       <w:r>
-        <w:t>IF</w:t>
+        <w:t>informationFiscale</w:t>
       </w:r>
       <w:r>
         <w:t>_Retard_dpot_dclaration_fiscale__retard_dpot_documents</w:t>
@@ -11705,6 +11751,7 @@
         </w:rPr>
         <w:t xml:space="preserve"> </w:t>
       </w:r>
+      <w:proofErr w:type="gramStart"/>
       <w:r>
         <w:rPr>
           <w:color w:val="46413B"/>
@@ -11727,6 +11774,7 @@
         </w:rPr>
         <w:t>à</w:t>
       </w:r>
+      <w:proofErr w:type="gramEnd"/>
       <w:r>
         <w:rPr>
           <w:color w:val="46413B"/>
@@ -11854,16 +11902,11 @@
         <w:t>/</w:t>
       </w:r>
       <w:r>
-        <w:t>IF</w:t>
-      </w:r>
-      <w:r>
-        <w:t>_Retard_dpot_dclaration_fiscale__</w:t>
-      </w:r>
-      <w:proofErr w:type="spellStart"/>
-      <w:r>
-        <w:t>retard_dpot_documents</w:t>
-      </w:r>
-      <w:proofErr w:type="spellEnd"/>
+        <w:t>informationFiscale</w:t>
+      </w:r>
+      <w:r>
+        <w:t>_Retard_dpot_dclaration_fiscale__retard_dpot_documents</w:t>
+      </w:r>
       <w:r>
         <w:t>]]</w:t>
       </w:r>
@@ -11876,7 +11919,7 @@
         <w:t>#</w:t>
       </w:r>
       <w:r>
-        <w:t>IF</w:t>
+        <w:t>informationFiscale</w:t>
       </w:r>
       <w:r>
         <w:t>_Retard_dpot_dclaration_fiscale__retard_rglement_honoraires</w:t>
@@ -12011,6 +12054,7 @@
         </w:rPr>
         <w:t xml:space="preserve"> </w:t>
       </w:r>
+      <w:proofErr w:type="gramStart"/>
       <w:r>
         <w:rPr>
           <w:color w:val="46413B"/>
@@ -12033,6 +12077,7 @@
         </w:rPr>
         <w:t>au</w:t>
       </w:r>
+      <w:proofErr w:type="gramEnd"/>
       <w:r>
         <w:rPr>
           <w:color w:val="46413B"/>
@@ -12407,7 +12452,7 @@
         <w:t>/</w:t>
       </w:r>
       <w:r>
-        <w:t>IF</w:t>
+        <w:t>informationFiscale</w:t>
       </w:r>
       <w:r>
         <w:t>_Retard_dpot_dclaration_fiscale__retard_rglement_honoraires</w:t>
@@ -12424,7 +12469,7 @@
         <w:t>#</w:t>
       </w:r>
       <w:r>
-        <w:t>IF</w:t>
+        <w:t>informationFiscale</w:t>
       </w:r>
       <w:r>
         <w:t>_Protection_sociale</w:t>
@@ -12467,6 +12512,7 @@
           <w:color w:val="46413B"/>
         </w:rPr>
       </w:pPr>
+      <w:proofErr w:type="gramStart"/>
       <w:r>
         <w:rPr>
           <w:color w:val="46413B"/>
@@ -12485,6 +12531,7 @@
         </w:rPr>
         <w:t>à</w:t>
       </w:r>
+      <w:proofErr w:type="gramEnd"/>
       <w:r>
         <w:rPr>
           <w:color w:val="46413B"/>
@@ -12684,74 +12731,37 @@
       </w:r>
     </w:p>
     <w:p>
-      <w:pPr>
-        <w:rPr>
-          <w:lang w:val="en-US"/>
-        </w:rPr>
-      </w:pPr>
-      <w:r>
-        <w:rPr>
-          <w:lang w:val="en-US"/>
-        </w:rPr>
+      <w:r>
         <w:t>[[</w:t>
       </w:r>
       <w:r>
-        <w:rPr>
-          <w:lang w:val="en-US"/>
-        </w:rPr>
         <w:t>/</w:t>
       </w:r>
       <w:proofErr w:type="spellStart"/>
       <w:r>
-        <w:rPr>
-          <w:lang w:val="en-US"/>
-        </w:rPr>
-        <w:t>IF</w:t>
-      </w:r>
-      <w:r>
-        <w:rPr>
-          <w:lang w:val="en-US"/>
-        </w:rPr>
+        <w:t>informationFiscale</w:t>
+      </w:r>
+      <w:r>
         <w:t>_Protection_sociale</w:t>
       </w:r>
       <w:proofErr w:type="spellEnd"/>
       <w:r>
-        <w:rPr>
-          <w:lang w:val="en-US"/>
-        </w:rPr>
         <w:t>]]</w:t>
       </w:r>
     </w:p>
     <w:p>
-      <w:pPr>
-        <w:rPr>
-          <w:lang w:val="en-US"/>
-        </w:rPr>
-      </w:pPr>
-      <w:r>
-        <w:rPr>
-          <w:lang w:val="en-US"/>
-        </w:rPr>
+      <w:r>
         <w:t>[[/</w:t>
       </w:r>
       <w:proofErr w:type="spellStart"/>
       <w:r>
-        <w:rPr>
-          <w:lang w:val="en-US"/>
-        </w:rPr>
-        <w:t>IF</w:t>
-      </w:r>
-      <w:r>
-        <w:rPr>
-          <w:lang w:val="en-US"/>
-        </w:rPr>
+        <w:t>informationFiscale</w:t>
+      </w:r>
+      <w:r>
         <w:t>_hasAny</w:t>
       </w:r>
       <w:proofErr w:type="spellEnd"/>
       <w:r>
-        <w:rPr>
-          <w:lang w:val="en-US"/>
-        </w:rPr>
         <w:t>]]</w:t>
       </w:r>
     </w:p>
@@ -13236,6 +13246,7 @@
                 <w:color w:val="46413B"/>
                 <w:sz w:val="20"/>
               </w:rPr>
+              <w:lastRenderedPageBreak/>
               <w:t>-</w:t>
             </w:r>
             <w:r>
@@ -13819,7 +13830,6 @@
                 <w:color w:val="46413B"/>
                 <w:sz w:val="20"/>
               </w:rPr>
-              <w:lastRenderedPageBreak/>
               <w:t>Dotations aux amortissements et provisions</w:t>
             </w:r>
           </w:p>
@@ -18060,6 +18070,7 @@
         <w:rPr>
           <w:color w:val="46413B"/>
         </w:rPr>
+        <w:lastRenderedPageBreak/>
         <w:t>La</w:t>
       </w:r>
       <w:r>
@@ -18691,7 +18702,6 @@
         <w:rPr>
           <w:color w:val="46413B"/>
         </w:rPr>
-        <w:lastRenderedPageBreak/>
         <w:t>Ces</w:t>
       </w:r>
       <w:r>
@@ -19189,7 +19199,6 @@
         <w:t>]]</w:t>
       </w:r>
     </w:p>
-    <w:p/>
     <w:p>
       <w:r>
         <w:t>[[</w:t>
@@ -19971,7 +19980,6 @@
         <w:rPr>
           <w:noProof/>
         </w:rPr>
-        <w:lastRenderedPageBreak/>
         <w:drawing>
           <wp:anchor distT="0" distB="0" distL="0" distR="0" simplePos="0" relativeHeight="487588352" behindDoc="1" locked="0" layoutInCell="1" allowOverlap="1" wp14:anchorId="28E9BD1B" wp14:editId="2A08862F">
             <wp:simplePos x="0" y="0"/>
@@ -21074,4 +21082,26 @@
   <a:objectDefaults/>
   <a:extraClrSchemeLst/>
 </a:theme>
+</file>
+
+<file path=word/webextensions/taskpanes.xml><?xml version="1.0" encoding="utf-8"?>
+<wetp:taskpanes xmlns:wetp="http://schemas.microsoft.com/office/webextensions/taskpanes/2010/11">
+  <wetp:taskpane dockstate="right" visibility="0" width="350" row="0">
+    <wetp:webextensionref xmlns:r="http://schemas.openxmlformats.org/officeDocument/2006/relationships" r:id="rId1"/>
+  </wetp:taskpane>
+</wetp:taskpanes>
+</file>
+
+<file path=word/webextensions/webextension1.xml><?xml version="1.0" encoding="utf-8"?>
+<we:webextension xmlns:we="http://schemas.microsoft.com/office/webextensions/webextension/2010/11" id="{F77B4A6B-A458-4409-866F-D77A045167E0}">
+  <we:reference id="wa200005502" version="1.0.0.12" store="fr-FR" storeType="OMEX"/>
+  <we:alternateReferences>
+    <we:reference id="WA200005502" version="1.0.0.12" store="WA200005502" storeType="OMEX"/>
+  </we:alternateReferences>
+  <we:properties>
+    <we:property name="docId" value="&quot;ii0ls4wtvf7Vzty4Xzl6s&quot;"/>
+  </we:properties>
+  <we:bindings/>
+  <we:snapshot xmlns:r="http://schemas.openxmlformats.org/officeDocument/2006/relationships"/>
+</we:webextension>
 </file>
</xml_diff>

<commit_message>
simplification de formulaire.ts en répartissant le code dans plusieurs services et ajout du site en balise variable dans word
</commit_message>
<xml_diff>
--- a/backend/src/templates/modele_complet.docx
+++ b/backend/src/templates/modele_complet.docx
@@ -19181,73 +19181,80 @@
       </w:r>
     </w:p>
     <w:p>
-      <w:r>
+      <w:pPr>
+        <w:rPr>
+          <w:color w:val="46413B"/>
+          <w:sz w:val="20"/>
+          <w:szCs w:val="20"/>
+        </w:rPr>
+      </w:pPr>
+      <w:r>
+        <w:rPr>
+          <w:color w:val="46413B"/>
+          <w:sz w:val="20"/>
+          <w:szCs w:val="20"/>
+        </w:rPr>
         <w:t>[[</w:t>
       </w:r>
       <w:proofErr w:type="spellStart"/>
       <w:r>
+        <w:rPr>
+          <w:color w:val="46413B"/>
+          <w:sz w:val="20"/>
+          <w:szCs w:val="20"/>
+        </w:rPr>
         <w:t>FM</w:t>
       </w:r>
       <w:r>
+        <w:rPr>
+          <w:color w:val="46413B"/>
+          <w:sz w:val="20"/>
+          <w:szCs w:val="20"/>
+        </w:rPr>
         <w:t>_</w:t>
       </w:r>
       <w:r>
+        <w:rPr>
+          <w:color w:val="46413B"/>
+          <w:sz w:val="20"/>
+          <w:szCs w:val="20"/>
+        </w:rPr>
         <w:t>commentaire</w:t>
       </w:r>
       <w:proofErr w:type="spellEnd"/>
       <w:r>
+        <w:rPr>
+          <w:color w:val="46413B"/>
+          <w:sz w:val="20"/>
+          <w:szCs w:val="20"/>
+        </w:rPr>
         <w:t>]]</w:t>
       </w:r>
     </w:p>
     <w:p>
-      <w:r>
-        <w:t>[[</w:t>
-      </w:r>
-      <w:r>
-        <w:t>/</w:t>
-      </w:r>
-      <w:proofErr w:type="spellStart"/>
-      <w:r>
-        <w:t>FM</w:t>
-      </w:r>
-      <w:r>
-        <w:t>_</w:t>
-      </w:r>
-      <w:r>
-        <w:t>enabled</w:t>
-      </w:r>
-      <w:proofErr w:type="spellEnd"/>
-      <w:r>
-        <w:t>]]</w:t>
-      </w:r>
-    </w:p>
-    <w:p>
       <w:pPr>
-        <w:pStyle w:val="Titre1"/>
-        <w:spacing w:before="46"/>
-        <w:rPr>
-          <w:b w:val="0"/>
+        <w:rPr>
+          <w:color w:val="46413B"/>
+          <w:sz w:val="20"/>
+          <w:szCs w:val="20"/>
         </w:rPr>
       </w:pPr>
-      <w:r>
-        <w:rPr>
-          <w:color w:val="46413B"/>
-        </w:rPr>
-        <w:t>POINTS</w:t>
-      </w:r>
-      <w:r>
-        <w:rPr>
-          <w:color w:val="46413B"/>
-          <w:spacing w:val="-10"/>
-        </w:rPr>
-        <w:t xml:space="preserve"> </w:t>
-      </w:r>
-      <w:r>
-        <w:rPr>
-          <w:color w:val="46413B"/>
-          <w:spacing w:val="-2"/>
-        </w:rPr>
-        <w:t>IMPORTANTS</w:t>
+    </w:p>
+    <w:p>
+      <w:pPr>
+        <w:rPr>
+          <w:color w:val="46413B"/>
+          <w:sz w:val="20"/>
+          <w:szCs w:val="20"/>
+        </w:rPr>
+      </w:pPr>
+      <w:r>
+        <w:rPr>
+          <w:color w:val="46413B"/>
+          <w:sz w:val="20"/>
+          <w:szCs w:val="20"/>
+        </w:rPr>
+        <w:t>[[#FM_justificationsDemandes]]</w:t>
       </w:r>
     </w:p>
     <w:p>
@@ -19449,6 +19456,192 @@
       </w:r>
     </w:p>
     <w:p>
+      <w:pPr>
+        <w:rPr>
+          <w:color w:val="46413B"/>
+          <w:sz w:val="20"/>
+          <w:szCs w:val="20"/>
+          <w:lang w:val="en-US"/>
+        </w:rPr>
+      </w:pPr>
+      <w:r>
+        <w:rPr>
+          <w:color w:val="46413B"/>
+          <w:sz w:val="20"/>
+          <w:szCs w:val="20"/>
+          <w:lang w:val="en-US"/>
+        </w:rPr>
+        <w:t>[[</w:t>
+      </w:r>
+      <w:r>
+        <w:rPr>
+          <w:color w:val="46413B"/>
+          <w:sz w:val="20"/>
+          <w:szCs w:val="20"/>
+          <w:lang w:val="en-US"/>
+        </w:rPr>
+        <w:t>/</w:t>
+      </w:r>
+      <w:proofErr w:type="spellStart"/>
+      <w:r>
+        <w:rPr>
+          <w:color w:val="46413B"/>
+          <w:sz w:val="20"/>
+          <w:szCs w:val="20"/>
+          <w:lang w:val="en-US"/>
+        </w:rPr>
+        <w:t>FM_just</w:t>
+      </w:r>
+      <w:r>
+        <w:rPr>
+          <w:color w:val="46413B"/>
+          <w:sz w:val="20"/>
+          <w:szCs w:val="20"/>
+          <w:lang w:val="en-US"/>
+        </w:rPr>
+        <w:t>ificationsDemandes</w:t>
+      </w:r>
+      <w:proofErr w:type="spellEnd"/>
+      <w:r>
+        <w:rPr>
+          <w:color w:val="46413B"/>
+          <w:sz w:val="20"/>
+          <w:szCs w:val="20"/>
+          <w:lang w:val="en-US"/>
+        </w:rPr>
+        <w:t>]]</w:t>
+      </w:r>
+    </w:p>
+    <w:p>
+      <w:r>
+        <w:t>[[</w:t>
+      </w:r>
+      <w:r>
+        <w:t>/</w:t>
+      </w:r>
+      <w:proofErr w:type="spellStart"/>
+      <w:r>
+        <w:t>FM</w:t>
+      </w:r>
+      <w:r>
+        <w:t>_</w:t>
+      </w:r>
+      <w:r>
+        <w:t>enabled</w:t>
+      </w:r>
+      <w:proofErr w:type="spellEnd"/>
+      <w:r>
+        <w:t>]]</w:t>
+      </w:r>
+    </w:p>
+    <w:p>
+      <w:r>
+        <w:t>[[</w:t>
+      </w:r>
+      <w:r>
+        <w:t>#</w:t>
+      </w:r>
+      <w:r>
+        <w:t>P</w:t>
+      </w:r>
+      <w:r>
+        <w:t>I</w:t>
+      </w:r>
+      <w:r>
+        <w:t>_</w:t>
+      </w:r>
+      <w:r>
+        <w:t>commentaire</w:t>
+      </w:r>
+      <w:r>
+        <w:t>]]</w:t>
+      </w:r>
+    </w:p>
+    <w:p>
+      <w:pPr>
+        <w:pStyle w:val="Titre1"/>
+        <w:spacing w:before="46"/>
+        <w:rPr>
+          <w:color w:val="46413B"/>
+          <w:spacing w:val="-2"/>
+        </w:rPr>
+      </w:pPr>
+      <w:r>
+        <w:rPr>
+          <w:color w:val="46413B"/>
+        </w:rPr>
+        <w:t>POINTS</w:t>
+      </w:r>
+      <w:r>
+        <w:rPr>
+          <w:color w:val="46413B"/>
+          <w:spacing w:val="-10"/>
+        </w:rPr>
+        <w:t xml:space="preserve"> </w:t>
+      </w:r>
+      <w:r>
+        <w:rPr>
+          <w:color w:val="46413B"/>
+          <w:spacing w:val="-2"/>
+        </w:rPr>
+        <w:t>IMPORTANTS</w:t>
+      </w:r>
+    </w:p>
+    <w:p>
+      <w:pPr>
+        <w:rPr>
+          <w:color w:val="46413B"/>
+          <w:sz w:val="20"/>
+          <w:szCs w:val="20"/>
+        </w:rPr>
+      </w:pPr>
+      <w:r>
+        <w:rPr>
+          <w:color w:val="46413B"/>
+          <w:sz w:val="20"/>
+          <w:szCs w:val="20"/>
+        </w:rPr>
+        <w:t>[[</w:t>
+      </w:r>
+      <w:proofErr w:type="spellStart"/>
+      <w:r>
+        <w:rPr>
+          <w:color w:val="46413B"/>
+          <w:sz w:val="20"/>
+          <w:szCs w:val="20"/>
+        </w:rPr>
+        <w:t>PI_commentaire</w:t>
+      </w:r>
+      <w:proofErr w:type="spellEnd"/>
+      <w:r>
+        <w:rPr>
+          <w:color w:val="46413B"/>
+          <w:sz w:val="20"/>
+          <w:szCs w:val="20"/>
+        </w:rPr>
+        <w:t>]]</w:t>
+      </w:r>
+    </w:p>
+    <w:p>
+      <w:r>
+        <w:t>[[</w:t>
+      </w:r>
+      <w:r>
+        <w:t>/</w:t>
+      </w:r>
+      <w:proofErr w:type="spellStart"/>
+      <w:r>
+        <w:t>PI_</w:t>
+      </w:r>
+      <w:r>
+        <w:t>commentaire</w:t>
+      </w:r>
+      <w:proofErr w:type="spellEnd"/>
+      <w:r>
+        <w:t>]]</w:t>
+      </w:r>
+    </w:p>
+    <w:p>
       <w:r>
         <w:t>[[</w:t>
       </w:r>
@@ -19495,21 +19688,53 @@
       </w:r>
     </w:p>
     <w:p>
-      <w:r>
+      <w:pPr>
+        <w:rPr>
+          <w:color w:val="46413B"/>
+          <w:sz w:val="20"/>
+          <w:szCs w:val="20"/>
+        </w:rPr>
+      </w:pPr>
+      <w:r>
+        <w:rPr>
+          <w:color w:val="46413B"/>
+          <w:sz w:val="20"/>
+          <w:szCs w:val="20"/>
+        </w:rPr>
         <w:t>[[</w:t>
       </w:r>
       <w:proofErr w:type="spellStart"/>
       <w:r>
+        <w:rPr>
+          <w:color w:val="46413B"/>
+          <w:sz w:val="20"/>
+          <w:szCs w:val="20"/>
+        </w:rPr>
         <w:t>P</w:t>
       </w:r>
       <w:r>
+        <w:rPr>
+          <w:color w:val="46413B"/>
+          <w:sz w:val="20"/>
+          <w:szCs w:val="20"/>
+        </w:rPr>
         <w:t>_</w:t>
       </w:r>
       <w:r>
+        <w:rPr>
+          <w:color w:val="46413B"/>
+          <w:sz w:val="20"/>
+          <w:szCs w:val="20"/>
+        </w:rPr>
         <w:t>commentaire</w:t>
       </w:r>
       <w:proofErr w:type="spellEnd"/>
       <w:r>
+        <w:rPr>
+          <w:color w:val="46413B"/>
+          <w:sz w:val="20"/>
+          <w:szCs w:val="20"/>
+        </w:rPr>
         <w:t>]]</w:t>
       </w:r>
     </w:p>
@@ -20713,7 +20938,6 @@
   <w:style w:type="character" w:default="1" w:styleId="Policepardfaut">
     <w:name w:val="Default Paragraph Font"/>
     <w:uiPriority w:val="1"/>
-    <w:semiHidden/>
     <w:unhideWhenUsed/>
   </w:style>
   <w:style w:type="table" w:default="1" w:styleId="TableauNormal">
@@ -20756,6 +20980,7 @@
   <w:style w:type="paragraph" w:styleId="Corpsdetexte">
     <w:name w:val="Body Text"/>
     <w:basedOn w:val="Normal"/>
+    <w:link w:val="CorpsdetexteCar"/>
     <w:uiPriority w:val="1"/>
     <w:qFormat/>
     <w:rPr>
@@ -20797,6 +21022,19 @@
         <w:insideV w:val="single" w:sz="4" w:space="0" w:color="auto"/>
       </w:tblBorders>
     </w:tblPr>
+  </w:style>
+  <w:style w:type="character" w:customStyle="1" w:styleId="CorpsdetexteCar">
+    <w:name w:val="Corps de texte Car"/>
+    <w:basedOn w:val="Policepardfaut"/>
+    <w:link w:val="Corpsdetexte"/>
+    <w:uiPriority w:val="1"/>
+    <w:rsid w:val="00E224EA"/>
+    <w:rPr>
+      <w:rFonts w:ascii="Calibri" w:eastAsia="Calibri" w:hAnsi="Calibri" w:cs="Calibri"/>
+      <w:sz w:val="20"/>
+      <w:szCs w:val="20"/>
+      <w:lang w:val="fr-FR"/>
+    </w:rPr>
   </w:style>
 </w:styles>
 </file>

</xml_diff>

<commit_message>
remise en place des conditions d'affichage dans le formulaire
</commit_message>
<xml_diff>
--- a/backend/src/templates/modele_complet.docx
+++ b/backend/src/templates/modele_complet.docx
@@ -71,6 +71,7 @@
         </w:rPr>
         <w:t>[[</w:t>
       </w:r>
+      <w:proofErr w:type="spellStart"/>
       <w:r>
         <w:rPr>
           <w:rFonts w:ascii="Arial MT"/>
@@ -83,7 +84,15 @@
           <w:rFonts w:ascii="Arial MT"/>
           <w:sz w:val="16"/>
         </w:rPr>
-        <w:t>adresse]]</w:t>
+        <w:t>adresse</w:t>
+      </w:r>
+      <w:proofErr w:type="spellEnd"/>
+      <w:r>
+        <w:rPr>
+          <w:rFonts w:ascii="Arial MT"/>
+          <w:sz w:val="16"/>
+        </w:rPr>
+        <w:t>]]</w:t>
       </w:r>
     </w:p>
     <w:p>
@@ -105,6 +114,7 @@
         </w:rPr>
         <w:t>[[</w:t>
       </w:r>
+      <w:proofErr w:type="spellStart"/>
       <w:r>
         <w:rPr>
           <w:rFonts w:ascii="Arial MT"/>
@@ -117,35 +127,52 @@
           <w:rFonts w:ascii="Arial MT"/>
           <w:sz w:val="16"/>
         </w:rPr>
-        <w:t>cp]]</w:t>
-      </w:r>
+        <w:t>cp</w:t>
+      </w:r>
+      <w:proofErr w:type="spellEnd"/>
       <w:r>
         <w:rPr>
           <w:rFonts w:ascii="Arial MT"/>
           <w:sz w:val="16"/>
         </w:rPr>
-        <w:tab/>
+        <w:t>]]</w:t>
       </w:r>
       <w:r>
         <w:rPr>
           <w:rFonts w:ascii="Arial MT"/>
           <w:sz w:val="16"/>
         </w:rPr>
-        <w:t>[[</w:t>
+        <w:tab/>
       </w:r>
       <w:r>
         <w:rPr>
           <w:rFonts w:ascii="Arial MT"/>
           <w:sz w:val="16"/>
         </w:rPr>
-        <w:t>site_</w:t>
-      </w:r>
+        <w:t>[[</w:t>
+      </w:r>
+      <w:proofErr w:type="spellStart"/>
       <w:r>
         <w:rPr>
           <w:rFonts w:ascii="Arial MT"/>
           <w:sz w:val="16"/>
         </w:rPr>
-        <w:t>ville]]</w:t>
+        <w:t>site_</w:t>
+      </w:r>
+      <w:r>
+        <w:rPr>
+          <w:rFonts w:ascii="Arial MT"/>
+          <w:sz w:val="16"/>
+        </w:rPr>
+        <w:t>ville</w:t>
+      </w:r>
+      <w:proofErr w:type="spellEnd"/>
+      <w:r>
+        <w:rPr>
+          <w:rFonts w:ascii="Arial MT"/>
+          <w:sz w:val="16"/>
+        </w:rPr>
+        <w:t>]]</w:t>
       </w:r>
     </w:p>
     <w:p>
@@ -221,7 +248,15 @@
         <w:ind w:left="6480" w:firstLine="720"/>
       </w:pPr>
       <w:r>
-        <w:t>[[nomEntreprise]]</w:t>
+        <w:t>[[</w:t>
+      </w:r>
+      <w:proofErr w:type="spellStart"/>
+      <w:r>
+        <w:t>nomEntreprise</w:t>
+      </w:r>
+      <w:proofErr w:type="spellEnd"/>
+      <w:r>
+        <w:t>]]</w:t>
       </w:r>
     </w:p>
     <w:p>
@@ -239,7 +274,23 @@
         <w:ind w:left="7200"/>
       </w:pPr>
       <w:r>
-        <w:t>[[codePostalClient]] [[villeClient]]</w:t>
+        <w:t>[[</w:t>
+      </w:r>
+      <w:proofErr w:type="spellStart"/>
+      <w:r>
+        <w:t>codePostalClient</w:t>
+      </w:r>
+      <w:proofErr w:type="spellEnd"/>
+      <w:r>
+        <w:t>]] [[</w:t>
+      </w:r>
+      <w:proofErr w:type="spellStart"/>
+      <w:r>
+        <w:t>villeClient</w:t>
+      </w:r>
+      <w:proofErr w:type="spellEnd"/>
+      <w:r>
+        <w:t>]]</w:t>
       </w:r>
     </w:p>
     <w:p>
@@ -260,7 +311,15 @@
         <w:ind w:left="6480"/>
       </w:pPr>
       <w:r>
-        <w:t>à [[lieuCreation]]</w:t>
+        <w:t>à [[</w:t>
+      </w:r>
+      <w:proofErr w:type="spellStart"/>
+      <w:r>
+        <w:t>lieuCreation</w:t>
+      </w:r>
+      <w:proofErr w:type="spellEnd"/>
+      <w:r>
+        <w:t>]]</w:t>
       </w:r>
     </w:p>
     <w:p>
@@ -269,7 +328,15 @@
         <w:ind w:left="6480"/>
       </w:pPr>
       <w:r>
-        <w:t>Le [[dateCreation]]</w:t>
+        <w:t>Le [[</w:t>
+      </w:r>
+      <w:proofErr w:type="spellStart"/>
+      <w:r>
+        <w:t>dateCreation</w:t>
+      </w:r>
+      <w:proofErr w:type="spellEnd"/>
+      <w:r>
+        <w:t>]]</w:t>
       </w:r>
     </w:p>
     <w:p>
@@ -293,7 +360,23 @@
         <w:spacing w:before="120" w:after="120" w:line="276" w:lineRule="auto"/>
       </w:pPr>
       <w:r>
-        <w:t>Réf : [[initialesChefGroupe]] [[codeClient]]</w:t>
+        <w:t>Réf : [[</w:t>
+      </w:r>
+      <w:proofErr w:type="spellStart"/>
+      <w:r>
+        <w:t>initialesChefGroupe</w:t>
+      </w:r>
+      <w:proofErr w:type="spellEnd"/>
+      <w:r>
+        <w:t>]] [[</w:t>
+      </w:r>
+      <w:proofErr w:type="spellStart"/>
+      <w:r>
+        <w:t>codeClient</w:t>
+      </w:r>
+      <w:proofErr w:type="spellEnd"/>
+      <w:r>
+        <w:t>]]</w:t>
       </w:r>
     </w:p>
     <w:p>
@@ -313,7 +396,15 @@
         <w:spacing w:before="120" w:after="120" w:line="276" w:lineRule="auto"/>
       </w:pPr>
       <w:r>
-        <w:t>Nous vous adressons notre lettre de fin de mission concernant l'exercice clos le [[dateFinEx]].</w:t>
+        <w:t>Nous vous adressons notre lettre de fin de mission concernant l'exercice clos le [[</w:t>
+      </w:r>
+      <w:proofErr w:type="spellStart"/>
+      <w:r>
+        <w:t>dateFinEx</w:t>
+      </w:r>
+      <w:proofErr w:type="spellEnd"/>
+      <w:r>
+        <w:t>]].</w:t>
       </w:r>
     </w:p>
     <w:p>
@@ -325,10 +416,6 @@
     <w:p>
       <w:pPr>
         <w:pStyle w:val="titre"/>
-        <w:rPr>
-          <w:color w:val="46413B"/>
-          <w:spacing w:val="-4"/>
-        </w:rPr>
       </w:pPr>
       <w:r>
         <w:t>CHIFFRES CLES</w:t>
@@ -339,13 +426,54 @@
         <w:spacing w:before="120" w:after="120" w:line="276" w:lineRule="auto"/>
       </w:pPr>
       <w:r>
-        <w:t>[[CC_comPerspective]]</w:t>
-      </w:r>
-    </w:p>
-    <w:p>
-      <w:pPr>
-        <w:spacing w:before="120" w:after="120" w:line="276" w:lineRule="auto"/>
-      </w:pPr>
+        <w:t>[[</w:t>
+      </w:r>
+      <w:r>
+        <w:t>#</w:t>
+      </w:r>
+      <w:r>
+        <w:t>CC_comPerspective]]</w:t>
+      </w:r>
+    </w:p>
+    <w:p>
+      <w:pPr>
+        <w:spacing w:before="120" w:after="120" w:line="276" w:lineRule="auto"/>
+      </w:pPr>
+      <w:r>
+        <w:t>[[</w:t>
+      </w:r>
+      <w:proofErr w:type="spellStart"/>
+      <w:r>
+        <w:t>CC_comPerspective</w:t>
+      </w:r>
+      <w:proofErr w:type="spellEnd"/>
+      <w:r>
+        <w:t>]]</w:t>
+      </w:r>
+    </w:p>
+    <w:p>
+      <w:pPr>
+        <w:spacing w:before="120" w:after="120" w:line="276" w:lineRule="auto"/>
+      </w:pPr>
+    </w:p>
+    <w:p>
+      <w:pPr>
+        <w:spacing w:before="120" w:after="120" w:line="276" w:lineRule="auto"/>
+      </w:pPr>
+      <w:r>
+        <w:t>[[</w:t>
+      </w:r>
+      <w:r>
+        <w:t>/</w:t>
+      </w:r>
+      <w:proofErr w:type="spellStart"/>
+      <w:r>
+        <w:t>CC_comPerspective</w:t>
+      </w:r>
+      <w:proofErr w:type="spellEnd"/>
+      <w:r>
+        <w:t>]]</w:t>
+      </w:r>
     </w:p>
     <w:tbl>
       <w:tblPr>
@@ -624,7 +752,7 @@
         </w:tc>
         <w:tc>
           <w:tcPr>
-            <w:tcW w:w="1314" w:type="dxa"/>
+            <w:tcW w:w="1317" w:type="dxa"/>
             <w:tcBorders>
               <w:top w:val="nil"/>
               <w:left w:val="single" w:sz="6" w:space="0" w:color="000000"/>
@@ -748,6 +876,7 @@
               </w:rPr>
               <w:t>[[</w:t>
             </w:r>
+            <w:proofErr w:type="spellStart"/>
             <w:r>
               <w:rPr>
                 <w:color w:val="46413B"/>
@@ -760,7 +889,15 @@
                 <w:color w:val="46413B"/>
                 <w:sz w:val="20"/>
               </w:rPr>
-              <w:t>caN]]</w:t>
+              <w:t>caN</w:t>
+            </w:r>
+            <w:proofErr w:type="spellEnd"/>
+            <w:r>
+              <w:rPr>
+                <w:color w:val="46413B"/>
+                <w:sz w:val="20"/>
+              </w:rPr>
+              <w:t>]]</w:t>
             </w:r>
           </w:p>
         </w:tc>
@@ -921,6 +1058,7 @@
               </w:rPr>
               <w:t>[[</w:t>
             </w:r>
+            <w:proofErr w:type="spellStart"/>
             <w:r>
               <w:rPr>
                 <w:color w:val="46413B"/>
@@ -933,13 +1071,21 @@
                 <w:color w:val="46413B"/>
                 <w:sz w:val="20"/>
               </w:rPr>
-              <w:t>caVar]]</w:t>
-            </w:r>
-          </w:p>
-        </w:tc>
-        <w:tc>
-          <w:tcPr>
-            <w:tcW w:w="1314" w:type="dxa"/>
+              <w:t>caVar</w:t>
+            </w:r>
+            <w:proofErr w:type="spellEnd"/>
+            <w:r>
+              <w:rPr>
+                <w:color w:val="46413B"/>
+                <w:sz w:val="20"/>
+              </w:rPr>
+              <w:t>]]</w:t>
+            </w:r>
+          </w:p>
+        </w:tc>
+        <w:tc>
+          <w:tcPr>
+            <w:tcW w:w="1317" w:type="dxa"/>
             <w:tcBorders>
               <w:top w:val="thinThickMediumGap" w:sz="3" w:space="0" w:color="000000"/>
               <w:left w:val="single" w:sz="6" w:space="0" w:color="000000"/>
@@ -980,7 +1126,25 @@
                 <w:spacing w:val="-4"/>
                 <w:sz w:val="20"/>
               </w:rPr>
-              <w:t>%caVar]]</w:t>
+              <w:t>%</w:t>
+            </w:r>
+            <w:proofErr w:type="spellStart"/>
+            <w:r>
+              <w:rPr>
+                <w:color w:val="46413B"/>
+                <w:spacing w:val="-4"/>
+                <w:sz w:val="20"/>
+              </w:rPr>
+              <w:t>caVar</w:t>
+            </w:r>
+            <w:proofErr w:type="spellEnd"/>
+            <w:r>
+              <w:rPr>
+                <w:color w:val="46413B"/>
+                <w:spacing w:val="-4"/>
+                <w:sz w:val="20"/>
+              </w:rPr>
+              <w:t>]]</w:t>
             </w:r>
           </w:p>
         </w:tc>
@@ -1063,6 +1227,7 @@
               </w:rPr>
               <w:t>[[</w:t>
             </w:r>
+            <w:proofErr w:type="spellStart"/>
             <w:r>
               <w:rPr>
                 <w:color w:val="46413B"/>
@@ -1077,7 +1242,16 @@
                 <w:spacing w:val="-2"/>
                 <w:sz w:val="20"/>
               </w:rPr>
-              <w:t>margeN]]</w:t>
+              <w:t>margeN</w:t>
+            </w:r>
+            <w:proofErr w:type="spellEnd"/>
+            <w:r>
+              <w:rPr>
+                <w:color w:val="46413B"/>
+                <w:spacing w:val="-2"/>
+                <w:sz w:val="20"/>
+              </w:rPr>
+              <w:t>]]</w:t>
             </w:r>
           </w:p>
         </w:tc>
@@ -1124,7 +1298,25 @@
                 <w:spacing w:val="-2"/>
                 <w:sz w:val="20"/>
               </w:rPr>
-              <w:t>%margeN]]</w:t>
+              <w:t>%</w:t>
+            </w:r>
+            <w:proofErr w:type="spellStart"/>
+            <w:r>
+              <w:rPr>
+                <w:color w:val="46413B"/>
+                <w:spacing w:val="-2"/>
+                <w:sz w:val="20"/>
+              </w:rPr>
+              <w:t>margeN</w:t>
+            </w:r>
+            <w:proofErr w:type="spellEnd"/>
+            <w:r>
+              <w:rPr>
+                <w:color w:val="46413B"/>
+                <w:spacing w:val="-2"/>
+                <w:sz w:val="20"/>
+              </w:rPr>
+              <w:t>]]</w:t>
             </w:r>
           </w:p>
         </w:tc>
@@ -1250,6 +1442,7 @@
               </w:rPr>
               <w:t>[[</w:t>
             </w:r>
+            <w:proofErr w:type="spellStart"/>
             <w:r>
               <w:rPr>
                 <w:color w:val="46413B"/>
@@ -1262,13 +1455,21 @@
                 <w:color w:val="46413B"/>
                 <w:sz w:val="20"/>
               </w:rPr>
-              <w:t>margeVar]]</w:t>
-            </w:r>
-          </w:p>
-        </w:tc>
-        <w:tc>
-          <w:tcPr>
-            <w:tcW w:w="1314" w:type="dxa"/>
+              <w:t>margeVar</w:t>
+            </w:r>
+            <w:proofErr w:type="spellEnd"/>
+            <w:r>
+              <w:rPr>
+                <w:color w:val="46413B"/>
+                <w:sz w:val="20"/>
+              </w:rPr>
+              <w:t>]]</w:t>
+            </w:r>
+          </w:p>
+        </w:tc>
+        <w:tc>
+          <w:tcPr>
+            <w:tcW w:w="1317" w:type="dxa"/>
             <w:tcBorders>
               <w:top w:val="single" w:sz="6" w:space="0" w:color="000000"/>
               <w:left w:val="single" w:sz="6" w:space="0" w:color="000000"/>
@@ -1309,7 +1510,25 @@
                 <w:spacing w:val="-4"/>
                 <w:sz w:val="20"/>
               </w:rPr>
-              <w:t>%margeVar]]</w:t>
+              <w:t>%</w:t>
+            </w:r>
+            <w:proofErr w:type="spellStart"/>
+            <w:r>
+              <w:rPr>
+                <w:color w:val="46413B"/>
+                <w:spacing w:val="-4"/>
+                <w:sz w:val="20"/>
+              </w:rPr>
+              <w:t>margeVar</w:t>
+            </w:r>
+            <w:proofErr w:type="spellEnd"/>
+            <w:r>
+              <w:rPr>
+                <w:color w:val="46413B"/>
+                <w:spacing w:val="-4"/>
+                <w:sz w:val="20"/>
+              </w:rPr>
+              <w:t>]]</w:t>
             </w:r>
           </w:p>
         </w:tc>
@@ -1406,6 +1625,7 @@
               </w:rPr>
               <w:t>[[</w:t>
             </w:r>
+            <w:proofErr w:type="spellStart"/>
             <w:r>
               <w:rPr>
                 <w:color w:val="46413B"/>
@@ -1418,7 +1638,15 @@
                 <w:color w:val="46413B"/>
                 <w:sz w:val="20"/>
               </w:rPr>
-              <w:t>excedN]]</w:t>
+              <w:t>excedN</w:t>
+            </w:r>
+            <w:proofErr w:type="spellEnd"/>
+            <w:r>
+              <w:rPr>
+                <w:color w:val="46413B"/>
+                <w:sz w:val="20"/>
+              </w:rPr>
+              <w:t>]]</w:t>
             </w:r>
           </w:p>
         </w:tc>
@@ -1465,7 +1693,25 @@
                 <w:spacing w:val="-4"/>
                 <w:sz w:val="20"/>
               </w:rPr>
-              <w:t>%excedN]]</w:t>
+              <w:t>%</w:t>
+            </w:r>
+            <w:proofErr w:type="spellStart"/>
+            <w:r>
+              <w:rPr>
+                <w:color w:val="46413B"/>
+                <w:spacing w:val="-4"/>
+                <w:sz w:val="20"/>
+              </w:rPr>
+              <w:t>excedN</w:t>
+            </w:r>
+            <w:proofErr w:type="spellEnd"/>
+            <w:r>
+              <w:rPr>
+                <w:color w:val="46413B"/>
+                <w:spacing w:val="-4"/>
+                <w:sz w:val="20"/>
+              </w:rPr>
+              <w:t>]]</w:t>
             </w:r>
           </w:p>
         </w:tc>
@@ -1588,6 +1834,7 @@
               </w:rPr>
               <w:t>[[</w:t>
             </w:r>
+            <w:proofErr w:type="spellStart"/>
             <w:r>
               <w:rPr>
                 <w:color w:val="46413B"/>
@@ -1600,13 +1847,21 @@
                 <w:color w:val="46413B"/>
                 <w:sz w:val="20"/>
               </w:rPr>
-              <w:t>excedVar]]</w:t>
-            </w:r>
-          </w:p>
-        </w:tc>
-        <w:tc>
-          <w:tcPr>
-            <w:tcW w:w="1314" w:type="dxa"/>
+              <w:t>excedVar</w:t>
+            </w:r>
+            <w:proofErr w:type="spellEnd"/>
+            <w:r>
+              <w:rPr>
+                <w:color w:val="46413B"/>
+                <w:sz w:val="20"/>
+              </w:rPr>
+              <w:t>]]</w:t>
+            </w:r>
+          </w:p>
+        </w:tc>
+        <w:tc>
+          <w:tcPr>
+            <w:tcW w:w="1317" w:type="dxa"/>
             <w:tcBorders>
               <w:top w:val="single" w:sz="8" w:space="0" w:color="000000"/>
               <w:left w:val="single" w:sz="6" w:space="0" w:color="000000"/>
@@ -1647,7 +1902,25 @@
                 <w:spacing w:val="-5"/>
                 <w:sz w:val="20"/>
               </w:rPr>
-              <w:t>%excedVar]]</w:t>
+              <w:t>%</w:t>
+            </w:r>
+            <w:proofErr w:type="spellStart"/>
+            <w:r>
+              <w:rPr>
+                <w:color w:val="46413B"/>
+                <w:spacing w:val="-5"/>
+                <w:sz w:val="20"/>
+              </w:rPr>
+              <w:t>excedVar</w:t>
+            </w:r>
+            <w:proofErr w:type="spellEnd"/>
+            <w:r>
+              <w:rPr>
+                <w:color w:val="46413B"/>
+                <w:spacing w:val="-5"/>
+                <w:sz w:val="20"/>
+              </w:rPr>
+              <w:t>]]</w:t>
             </w:r>
           </w:p>
         </w:tc>
@@ -1730,6 +2003,7 @@
               </w:rPr>
               <w:t>[[</w:t>
             </w:r>
+            <w:proofErr w:type="spellStart"/>
             <w:r>
               <w:rPr>
                 <w:color w:val="46413B"/>
@@ -1742,7 +2016,15 @@
                 <w:color w:val="46413B"/>
                 <w:sz w:val="20"/>
               </w:rPr>
-              <w:t>resCourantN]]</w:t>
+              <w:t>resCourantN</w:t>
+            </w:r>
+            <w:proofErr w:type="spellEnd"/>
+            <w:r>
+              <w:rPr>
+                <w:color w:val="46413B"/>
+                <w:sz w:val="20"/>
+              </w:rPr>
+              <w:t>]]</w:t>
             </w:r>
           </w:p>
         </w:tc>
@@ -1789,16 +2071,26 @@
                 <w:spacing w:val="-4"/>
                 <w:sz w:val="20"/>
               </w:rPr>
-              <w:t>%resCourant</w:t>
-            </w:r>
+              <w:t>%</w:t>
+            </w:r>
+            <w:proofErr w:type="spellStart"/>
             <w:r>
               <w:rPr>
                 <w:color w:val="46413B"/>
                 <w:spacing w:val="-4"/>
                 <w:sz w:val="20"/>
               </w:rPr>
+              <w:t>resCourant</w:t>
+            </w:r>
+            <w:r>
+              <w:rPr>
+                <w:color w:val="46413B"/>
+                <w:spacing w:val="-4"/>
+                <w:sz w:val="20"/>
+              </w:rPr>
               <w:t>N</w:t>
             </w:r>
+            <w:proofErr w:type="spellEnd"/>
             <w:r>
               <w:rPr>
                 <w:color w:val="46413B"/>
@@ -1928,6 +2220,7 @@
               </w:rPr>
               <w:t>[[</w:t>
             </w:r>
+            <w:proofErr w:type="spellStart"/>
             <w:r>
               <w:rPr>
                 <w:color w:val="46413B"/>
@@ -1940,13 +2233,21 @@
                 <w:color w:val="46413B"/>
                 <w:sz w:val="20"/>
               </w:rPr>
-              <w:t>resCourantVar]]</w:t>
-            </w:r>
-          </w:p>
-        </w:tc>
-        <w:tc>
-          <w:tcPr>
-            <w:tcW w:w="1314" w:type="dxa"/>
+              <w:t>resCourantVar</w:t>
+            </w:r>
+            <w:proofErr w:type="spellEnd"/>
+            <w:r>
+              <w:rPr>
+                <w:color w:val="46413B"/>
+                <w:sz w:val="20"/>
+              </w:rPr>
+              <w:t>]]</w:t>
+            </w:r>
+          </w:p>
+        </w:tc>
+        <w:tc>
+          <w:tcPr>
+            <w:tcW w:w="1317" w:type="dxa"/>
             <w:tcBorders>
               <w:top w:val="single" w:sz="6" w:space="0" w:color="000000"/>
               <w:left w:val="single" w:sz="6" w:space="0" w:color="000000"/>
@@ -1987,7 +2288,25 @@
                 <w:spacing w:val="-5"/>
                 <w:sz w:val="20"/>
               </w:rPr>
-              <w:t>%resCourantVar]]</w:t>
+              <w:t>%</w:t>
+            </w:r>
+            <w:proofErr w:type="spellStart"/>
+            <w:r>
+              <w:rPr>
+                <w:color w:val="46413B"/>
+                <w:spacing w:val="-5"/>
+                <w:sz w:val="20"/>
+              </w:rPr>
+              <w:t>resCourantVar</w:t>
+            </w:r>
+            <w:proofErr w:type="spellEnd"/>
+            <w:r>
+              <w:rPr>
+                <w:color w:val="46413B"/>
+                <w:spacing w:val="-5"/>
+                <w:sz w:val="20"/>
+              </w:rPr>
+              <w:t>]]</w:t>
             </w:r>
           </w:p>
         </w:tc>
@@ -2070,6 +2389,7 @@
               </w:rPr>
               <w:t>[[</w:t>
             </w:r>
+            <w:proofErr w:type="spellStart"/>
             <w:r>
               <w:rPr>
                 <w:color w:val="46413B"/>
@@ -2082,7 +2402,15 @@
                 <w:color w:val="46413B"/>
                 <w:sz w:val="20"/>
               </w:rPr>
-              <w:t>resNetN]]</w:t>
+              <w:t>resNetN</w:t>
+            </w:r>
+            <w:proofErr w:type="spellEnd"/>
+            <w:r>
+              <w:rPr>
+                <w:color w:val="46413B"/>
+                <w:sz w:val="20"/>
+              </w:rPr>
+              <w:t>]]</w:t>
             </w:r>
           </w:p>
         </w:tc>
@@ -2129,16 +2457,26 @@
                 <w:spacing w:val="-4"/>
                 <w:sz w:val="20"/>
               </w:rPr>
-              <w:t>%resNet</w:t>
-            </w:r>
+              <w:t>%</w:t>
+            </w:r>
+            <w:proofErr w:type="spellStart"/>
             <w:r>
               <w:rPr>
                 <w:color w:val="46413B"/>
                 <w:spacing w:val="-4"/>
                 <w:sz w:val="20"/>
               </w:rPr>
+              <w:t>resNet</w:t>
+            </w:r>
+            <w:r>
+              <w:rPr>
+                <w:color w:val="46413B"/>
+                <w:spacing w:val="-4"/>
+                <w:sz w:val="20"/>
+              </w:rPr>
               <w:t>N</w:t>
             </w:r>
+            <w:proofErr w:type="spellEnd"/>
             <w:r>
               <w:rPr>
                 <w:color w:val="46413B"/>
@@ -2268,6 +2606,7 @@
               </w:rPr>
               <w:t>[[</w:t>
             </w:r>
+            <w:proofErr w:type="spellStart"/>
             <w:r>
               <w:rPr>
                 <w:color w:val="46413B"/>
@@ -2280,13 +2619,21 @@
                 <w:color w:val="46413B"/>
                 <w:sz w:val="20"/>
               </w:rPr>
-              <w:t>resNetVar]]</w:t>
-            </w:r>
-          </w:p>
-        </w:tc>
-        <w:tc>
-          <w:tcPr>
-            <w:tcW w:w="1314" w:type="dxa"/>
+              <w:t>resNetVar</w:t>
+            </w:r>
+            <w:proofErr w:type="spellEnd"/>
+            <w:r>
+              <w:rPr>
+                <w:color w:val="46413B"/>
+                <w:sz w:val="20"/>
+              </w:rPr>
+              <w:t>]]</w:t>
+            </w:r>
+          </w:p>
+        </w:tc>
+        <w:tc>
+          <w:tcPr>
+            <w:tcW w:w="1317" w:type="dxa"/>
             <w:tcBorders>
               <w:top w:val="single" w:sz="8" w:space="0" w:color="000000"/>
               <w:left w:val="single" w:sz="6" w:space="0" w:color="000000"/>
@@ -2327,7 +2674,25 @@
                 <w:spacing w:val="-5"/>
                 <w:sz w:val="20"/>
               </w:rPr>
-              <w:t>%resNetVar]]</w:t>
+              <w:t>%</w:t>
+            </w:r>
+            <w:proofErr w:type="spellStart"/>
+            <w:r>
+              <w:rPr>
+                <w:color w:val="46413B"/>
+                <w:spacing w:val="-5"/>
+                <w:sz w:val="20"/>
+              </w:rPr>
+              <w:t>resNetVar</w:t>
+            </w:r>
+            <w:proofErr w:type="spellEnd"/>
+            <w:r>
+              <w:rPr>
+                <w:color w:val="46413B"/>
+                <w:spacing w:val="-5"/>
+                <w:sz w:val="20"/>
+              </w:rPr>
+              <w:t>]]</w:t>
             </w:r>
           </w:p>
         </w:tc>
@@ -2337,26 +2702,75 @@
       <w:pPr>
         <w:spacing w:before="120" w:after="120" w:line="276" w:lineRule="auto"/>
       </w:pPr>
-    </w:p>
-    <w:p>
-      <w:pPr>
-        <w:spacing w:before="120" w:after="120" w:line="276" w:lineRule="auto"/>
-      </w:pPr>
-      <w:r>
-        <w:t>[[CC_commentaire]]</w:t>
-      </w:r>
-    </w:p>
-    <w:p>
-      <w:pPr>
-        <w:spacing w:before="120" w:after="120" w:line="276" w:lineRule="auto"/>
-      </w:pPr>
-    </w:p>
-    <w:p>
-      <w:pPr>
-        <w:spacing w:before="120" w:after="120" w:line="276" w:lineRule="auto"/>
-      </w:pPr>
-      <w:r>
-        <w:t>[[^EC_masquerSection]]</w:t>
+      <w:r>
+        <w:t>[[</w:t>
+      </w:r>
+      <w:r>
+        <w:t>#</w:t>
+      </w:r>
+      <w:r>
+        <w:t>CC_commentaire]]</w:t>
+      </w:r>
+    </w:p>
+    <w:p>
+      <w:pPr>
+        <w:spacing w:before="120" w:after="120" w:line="276" w:lineRule="auto"/>
+      </w:pPr>
+    </w:p>
+    <w:p>
+      <w:pPr>
+        <w:spacing w:before="120" w:after="120" w:line="276" w:lineRule="auto"/>
+      </w:pPr>
+      <w:r>
+        <w:t>[[</w:t>
+      </w:r>
+      <w:proofErr w:type="spellStart"/>
+      <w:r>
+        <w:t>CC_commentaire</w:t>
+      </w:r>
+      <w:proofErr w:type="spellEnd"/>
+      <w:r>
+        <w:t>]]</w:t>
+      </w:r>
+    </w:p>
+    <w:p>
+      <w:pPr>
+        <w:spacing w:before="120" w:after="120" w:line="276" w:lineRule="auto"/>
+      </w:pPr>
+      <w:r>
+        <w:t>[[</w:t>
+      </w:r>
+      <w:r>
+        <w:t>/</w:t>
+      </w:r>
+      <w:proofErr w:type="spellStart"/>
+      <w:r>
+        <w:t>CC_commentaire</w:t>
+      </w:r>
+      <w:proofErr w:type="spellEnd"/>
+      <w:r>
+        <w:t>]]</w:t>
+      </w:r>
+    </w:p>
+    <w:p>
+      <w:pPr>
+        <w:spacing w:before="120" w:after="120" w:line="276" w:lineRule="auto"/>
+      </w:pPr>
+    </w:p>
+    <w:p>
+      <w:pPr>
+        <w:spacing w:before="120" w:after="120" w:line="276" w:lineRule="auto"/>
+      </w:pPr>
+      <w:r>
+        <w:t>[[^</w:t>
+      </w:r>
+      <w:proofErr w:type="spellStart"/>
+      <w:r>
+        <w:t>EC_masquerSection</w:t>
+      </w:r>
+      <w:proofErr w:type="spellEnd"/>
+      <w:r>
+        <w:t>]]</w:t>
       </w:r>
     </w:p>
     <w:p>
@@ -2707,7 +3121,23 @@
                 <w:color w:val="46413B"/>
                 <w:sz w:val="20"/>
               </w:rPr>
-              <w:t>[[EC_valN]]</w:t>
+              <w:t>[[</w:t>
+            </w:r>
+            <w:proofErr w:type="spellStart"/>
+            <w:r>
+              <w:rPr>
+                <w:color w:val="46413B"/>
+                <w:sz w:val="20"/>
+              </w:rPr>
+              <w:t>EC_valN</w:t>
+            </w:r>
+            <w:proofErr w:type="spellEnd"/>
+            <w:r>
+              <w:rPr>
+                <w:color w:val="46413B"/>
+                <w:sz w:val="20"/>
+              </w:rPr>
+              <w:t>]]</w:t>
             </w:r>
           </w:p>
         </w:tc>
@@ -2767,7 +3197,23 @@
                 <w:color w:val="46413B"/>
                 <w:sz w:val="20"/>
               </w:rPr>
-              <w:t>[[EC_valVar]]</w:t>
+              <w:t>[[</w:t>
+            </w:r>
+            <w:proofErr w:type="spellStart"/>
+            <w:r>
+              <w:rPr>
+                <w:color w:val="46413B"/>
+                <w:sz w:val="20"/>
+              </w:rPr>
+              <w:t>EC_valVar</w:t>
+            </w:r>
+            <w:proofErr w:type="spellEnd"/>
+            <w:r>
+              <w:rPr>
+                <w:color w:val="46413B"/>
+                <w:sz w:val="20"/>
+              </w:rPr>
+              <w:t>]]</w:t>
             </w:r>
           </w:p>
         </w:tc>
@@ -2796,7 +3242,23 @@
                 <w:color w:val="46413B"/>
                 <w:sz w:val="20"/>
               </w:rPr>
-              <w:t>[[EC_%Var]]</w:t>
+              <w:t>[[</w:t>
+            </w:r>
+            <w:proofErr w:type="spellStart"/>
+            <w:r>
+              <w:rPr>
+                <w:color w:val="46413B"/>
+                <w:sz w:val="20"/>
+              </w:rPr>
+              <w:t>EC_%Var</w:t>
+            </w:r>
+            <w:proofErr w:type="spellEnd"/>
+            <w:r>
+              <w:rPr>
+                <w:color w:val="46413B"/>
+                <w:sz w:val="20"/>
+              </w:rPr>
+              <w:t>]]</w:t>
             </w:r>
           </w:p>
         </w:tc>
@@ -2869,14 +3331,46 @@
                 <w:color w:val="46413B"/>
                 <w:sz w:val="20"/>
               </w:rPr>
-              <w:t>[[/EC_comment_tab]]</w:t>
-            </w:r>
-            <w:r>
-              <w:rPr>
-                <w:color w:val="46413B"/>
-                <w:sz w:val="20"/>
-              </w:rPr>
-              <w:t>[[/EC_tab]]</w:t>
+              <w:t>[[/</w:t>
+            </w:r>
+            <w:proofErr w:type="spellStart"/>
+            <w:r>
+              <w:rPr>
+                <w:color w:val="46413B"/>
+                <w:sz w:val="20"/>
+              </w:rPr>
+              <w:t>EC_comment_tab</w:t>
+            </w:r>
+            <w:proofErr w:type="spellEnd"/>
+            <w:r>
+              <w:rPr>
+                <w:color w:val="46413B"/>
+                <w:sz w:val="20"/>
+              </w:rPr>
+              <w:t>]]</w:t>
+            </w:r>
+            <w:r>
+              <w:rPr>
+                <w:color w:val="46413B"/>
+                <w:sz w:val="20"/>
+              </w:rPr>
+              <w:t>[[/</w:t>
+            </w:r>
+            <w:proofErr w:type="spellStart"/>
+            <w:r>
+              <w:rPr>
+                <w:color w:val="46413B"/>
+                <w:sz w:val="20"/>
+              </w:rPr>
+              <w:t>EC_tab</w:t>
+            </w:r>
+            <w:proofErr w:type="spellEnd"/>
+            <w:r>
+              <w:rPr>
+                <w:color w:val="46413B"/>
+                <w:sz w:val="20"/>
+              </w:rPr>
+              <w:t>]]</w:t>
             </w:r>
           </w:p>
         </w:tc>
@@ -2887,7 +3381,15 @@
         <w:spacing w:before="120" w:after="120" w:line="276" w:lineRule="auto"/>
       </w:pPr>
       <w:r>
-        <w:t>[[/EC_masquerSection]]</w:t>
+        <w:t>[[/</w:t>
+      </w:r>
+      <w:proofErr w:type="spellStart"/>
+      <w:r>
+        <w:t>EC_masquerSection</w:t>
+      </w:r>
+      <w:proofErr w:type="spellEnd"/>
+      <w:r>
+        <w:t>]]</w:t>
       </w:r>
     </w:p>
     <w:p>
@@ -3290,7 +3792,23 @@
                 <w:color w:val="46413B"/>
                 <w:sz w:val="20"/>
               </w:rPr>
-              <w:t>[[CP_Val]]</w:t>
+              <w:t>[[</w:t>
+            </w:r>
+            <w:proofErr w:type="spellStart"/>
+            <w:r>
+              <w:rPr>
+                <w:color w:val="46413B"/>
+                <w:sz w:val="20"/>
+              </w:rPr>
+              <w:t>CP_Val</w:t>
+            </w:r>
+            <w:proofErr w:type="spellEnd"/>
+            <w:r>
+              <w:rPr>
+                <w:color w:val="46413B"/>
+                <w:sz w:val="20"/>
+              </w:rPr>
+              <w:t>]]</w:t>
             </w:r>
           </w:p>
         </w:tc>
@@ -3433,7 +3951,25 @@
                 <w:spacing w:val="-5"/>
                 <w:sz w:val="20"/>
               </w:rPr>
-              <w:t>[[CP_%caN]]</w:t>
+              <w:t>[[CP_%</w:t>
+            </w:r>
+            <w:proofErr w:type="spellStart"/>
+            <w:r>
+              <w:rPr>
+                <w:color w:val="46413B"/>
+                <w:spacing w:val="-5"/>
+                <w:sz w:val="20"/>
+              </w:rPr>
+              <w:t>caN</w:t>
+            </w:r>
+            <w:proofErr w:type="spellEnd"/>
+            <w:r>
+              <w:rPr>
+                <w:color w:val="46413B"/>
+                <w:spacing w:val="-5"/>
+                <w:sz w:val="20"/>
+              </w:rPr>
+              <w:t>]]</w:t>
             </w:r>
           </w:p>
         </w:tc>
@@ -3656,7 +4192,25 @@
                 <w:spacing w:val="-5"/>
                 <w:sz w:val="20"/>
               </w:rPr>
-              <w:t>[[CP_%margeN]]</w:t>
+              <w:t>[[CP_%</w:t>
+            </w:r>
+            <w:proofErr w:type="spellStart"/>
+            <w:r>
+              <w:rPr>
+                <w:color w:val="46413B"/>
+                <w:spacing w:val="-5"/>
+                <w:sz w:val="20"/>
+              </w:rPr>
+              <w:t>margeN</w:t>
+            </w:r>
+            <w:proofErr w:type="spellEnd"/>
+            <w:r>
+              <w:rPr>
+                <w:color w:val="46413B"/>
+                <w:spacing w:val="-5"/>
+                <w:sz w:val="20"/>
+              </w:rPr>
+              <w:t>]]</w:t>
             </w:r>
           </w:p>
         </w:tc>
@@ -3831,6 +4385,7 @@
               </w:rPr>
               <w:t>[[</w:t>
             </w:r>
+            <w:proofErr w:type="spellStart"/>
             <w:r>
               <w:rPr>
                 <w:color w:val="46413B"/>
@@ -3845,7 +4400,16 @@
                 <w:spacing w:val="-2"/>
                 <w:sz w:val="20"/>
               </w:rPr>
-              <w:t>_heuresRemunN]]</w:t>
+              <w:t>_heuresRemunN</w:t>
+            </w:r>
+            <w:proofErr w:type="spellEnd"/>
+            <w:r>
+              <w:rPr>
+                <w:color w:val="46413B"/>
+                <w:spacing w:val="-2"/>
+                <w:sz w:val="20"/>
+              </w:rPr>
+              <w:t>]]</w:t>
             </w:r>
           </w:p>
         </w:tc>
@@ -3918,7 +4482,25 @@
                 <w:spacing w:val="-5"/>
                 <w:sz w:val="20"/>
               </w:rPr>
-              <w:t>[[CP_heureVal]]</w:t>
+              <w:t>[[</w:t>
+            </w:r>
+            <w:proofErr w:type="spellStart"/>
+            <w:r>
+              <w:rPr>
+                <w:color w:val="46413B"/>
+                <w:spacing w:val="-5"/>
+                <w:sz w:val="20"/>
+              </w:rPr>
+              <w:t>CP_heureVal</w:t>
+            </w:r>
+            <w:proofErr w:type="spellEnd"/>
+            <w:r>
+              <w:rPr>
+                <w:color w:val="46413B"/>
+                <w:spacing w:val="-5"/>
+                <w:sz w:val="20"/>
+              </w:rPr>
+              <w:t>]]</w:t>
             </w:r>
           </w:p>
         </w:tc>
@@ -3948,7 +4530,14 @@
               <w:rPr>
                 <w:sz w:val="20"/>
               </w:rPr>
-              <w:t>[[CP_%heure</w:t>
+              <w:t>[[CP_%</w:t>
+            </w:r>
+            <w:proofErr w:type="spellStart"/>
+            <w:r>
+              <w:rPr>
+                <w:sz w:val="20"/>
+              </w:rPr>
+              <w:t>heure</w:t>
             </w:r>
             <w:r>
               <w:rPr>
@@ -3956,6 +4545,7 @@
               </w:rPr>
               <w:t>Val</w:t>
             </w:r>
+            <w:proofErr w:type="spellEnd"/>
             <w:r>
               <w:rPr>
                 <w:sz w:val="20"/>
@@ -4071,7 +4661,25 @@
                 <w:spacing w:val="-5"/>
                 <w:sz w:val="20"/>
               </w:rPr>
-              <w:t>[[CP_coutHorN]]</w:t>
+              <w:t>[[</w:t>
+            </w:r>
+            <w:proofErr w:type="spellStart"/>
+            <w:r>
+              <w:rPr>
+                <w:color w:val="46413B"/>
+                <w:spacing w:val="-5"/>
+                <w:sz w:val="20"/>
+              </w:rPr>
+              <w:t>CP_coutHorN</w:t>
+            </w:r>
+            <w:proofErr w:type="spellEnd"/>
+            <w:r>
+              <w:rPr>
+                <w:color w:val="46413B"/>
+                <w:spacing w:val="-5"/>
+                <w:sz w:val="20"/>
+              </w:rPr>
+              <w:t>]]</w:t>
             </w:r>
           </w:p>
         </w:tc>
@@ -4205,34 +4813,52 @@
     <w:p>
       <w:pPr>
         <w:pStyle w:val="titre"/>
-        <w:rPr>
-          <w:rFonts w:ascii="Arial"/>
-          <w:color w:val="46413B"/>
-          <w:spacing w:val="-2"/>
-          <w:sz w:val="16"/>
-        </w:rPr>
       </w:pPr>
       <w:r>
         <w:t>INVESTISSEMENTS</w:t>
       </w:r>
     </w:p>
     <w:p>
-      <w:pPr>
-        <w:spacing w:before="120" w:after="120" w:line="276" w:lineRule="auto"/>
-      </w:pPr>
-      <w:r>
-        <w:t>[[I_commentaire]]</w:t>
-      </w:r>
-    </w:p>
-    <w:p>
-      <w:pPr>
-        <w:pStyle w:val="titre"/>
-        <w:rPr>
-          <w:bCs/>
-          <w:color w:val="46413B"/>
-          <w:spacing w:val="-2"/>
-        </w:rPr>
-      </w:pPr>
+      <w:r>
+        <w:t>[[#I_commentaire]]</w:t>
+      </w:r>
+    </w:p>
+    <w:p>
+      <w:pPr>
+        <w:spacing w:before="120" w:after="120" w:line="276" w:lineRule="auto"/>
+      </w:pPr>
+      <w:r>
+        <w:t>[[</w:t>
+      </w:r>
+      <w:proofErr w:type="spellStart"/>
+      <w:r>
+        <w:t>I_commentaire</w:t>
+      </w:r>
+      <w:proofErr w:type="spellEnd"/>
+      <w:r>
+        <w:t>]]</w:t>
+      </w:r>
+    </w:p>
+    <w:p>
+      <w:pPr>
+        <w:spacing w:before="120" w:after="120" w:line="276" w:lineRule="auto"/>
+      </w:pPr>
+    </w:p>
+    <w:p>
+      <w:pPr>
+        <w:spacing w:before="120" w:after="120" w:line="276" w:lineRule="auto"/>
+      </w:pPr>
+      <w:r>
+        <w:t>[[/</w:t>
+      </w:r>
+      <w:proofErr w:type="spellStart"/>
+      <w:r>
+        <w:t>I_commentaire</w:t>
+      </w:r>
+      <w:proofErr w:type="spellEnd"/>
+      <w:r>
+        <w:t>]]</w:t>
+      </w:r>
     </w:p>
     <w:tbl>
       <w:tblPr>
@@ -4439,7 +5065,23 @@
                 <w:color w:val="46413B"/>
                 <w:sz w:val="20"/>
               </w:rPr>
-              <w:t>[[I_prevAmoN]]</w:t>
+              <w:t>[[</w:t>
+            </w:r>
+            <w:proofErr w:type="spellStart"/>
+            <w:r>
+              <w:rPr>
+                <w:color w:val="46413B"/>
+                <w:sz w:val="20"/>
+              </w:rPr>
+              <w:t>I_prevAmoN</w:t>
+            </w:r>
+            <w:proofErr w:type="spellEnd"/>
+            <w:r>
+              <w:rPr>
+                <w:color w:val="46413B"/>
+                <w:sz w:val="20"/>
+              </w:rPr>
+              <w:t>]]</w:t>
             </w:r>
           </w:p>
         </w:tc>
@@ -4519,7 +5161,15 @@
         <w:spacing w:before="120" w:after="120" w:line="276" w:lineRule="auto"/>
       </w:pPr>
       <w:r>
-        <w:t>[[/I_masquerSection]]</w:t>
+        <w:t>[[/</w:t>
+      </w:r>
+      <w:proofErr w:type="spellStart"/>
+      <w:r>
+        <w:t>I_masquerSection</w:t>
+      </w:r>
+      <w:proofErr w:type="spellEnd"/>
+      <w:r>
+        <w:t>]]</w:t>
       </w:r>
     </w:p>
     <w:p>
@@ -4644,6 +5294,7 @@
                 <w:color w:val="46413B"/>
                 <w:sz w:val="20"/>
               </w:rPr>
+              <w:lastRenderedPageBreak/>
               <w:t>Impôt</w:t>
             </w:r>
             <w:r>
@@ -4705,7 +5356,25 @@
                 <w:spacing w:val="-2"/>
                 <w:sz w:val="20"/>
               </w:rPr>
-              <w:t>[[IS_tot]]</w:t>
+              <w:t>[[</w:t>
+            </w:r>
+            <w:proofErr w:type="spellStart"/>
+            <w:r>
+              <w:rPr>
+                <w:color w:val="46413B"/>
+                <w:spacing w:val="-2"/>
+                <w:sz w:val="20"/>
+              </w:rPr>
+              <w:t>IS_tot</w:t>
+            </w:r>
+            <w:proofErr w:type="spellEnd"/>
+            <w:r>
+              <w:rPr>
+                <w:color w:val="46413B"/>
+                <w:spacing w:val="-2"/>
+                <w:sz w:val="20"/>
+              </w:rPr>
+              <w:t>]]</w:t>
             </w:r>
           </w:p>
         </w:tc>
@@ -4776,7 +5445,25 @@
                 <w:spacing w:val="-2"/>
                 <w:sz w:val="20"/>
               </w:rPr>
-              <w:t>[[IS_credit]]</w:t>
+              <w:t>[[</w:t>
+            </w:r>
+            <w:proofErr w:type="spellStart"/>
+            <w:r>
+              <w:rPr>
+                <w:color w:val="46413B"/>
+                <w:spacing w:val="-2"/>
+                <w:sz w:val="20"/>
+              </w:rPr>
+              <w:t>IS_credit</w:t>
+            </w:r>
+            <w:proofErr w:type="spellEnd"/>
+            <w:r>
+              <w:rPr>
+                <w:color w:val="46413B"/>
+                <w:spacing w:val="-2"/>
+                <w:sz w:val="20"/>
+              </w:rPr>
+              <w:t>]]</w:t>
             </w:r>
           </w:p>
         </w:tc>
@@ -4853,7 +5540,16 @@
                 <w:spacing w:val="-2"/>
                 <w:sz w:val="20"/>
               </w:rPr>
-              <w:t>[[IS_</w:t>
+              <w:t>[[</w:t>
+            </w:r>
+            <w:proofErr w:type="spellStart"/>
+            <w:r>
+              <w:rPr>
+                <w:color w:val="46413B"/>
+                <w:spacing w:val="-2"/>
+                <w:sz w:val="20"/>
+              </w:rPr>
+              <w:t>IS_</w:t>
             </w:r>
             <w:r>
               <w:rPr>
@@ -4869,7 +5565,16 @@
                 <w:spacing w:val="-2"/>
                 <w:sz w:val="20"/>
               </w:rPr>
-              <w:t>comptes]]</w:t>
+              <w:t>comptes</w:t>
+            </w:r>
+            <w:proofErr w:type="spellEnd"/>
+            <w:r>
+              <w:rPr>
+                <w:color w:val="46413B"/>
+                <w:spacing w:val="-2"/>
+                <w:sz w:val="20"/>
+              </w:rPr>
+              <w:t>]]</w:t>
             </w:r>
           </w:p>
         </w:tc>
@@ -4932,7 +5637,25 @@
                 <w:spacing w:val="-2"/>
                 <w:sz w:val="20"/>
               </w:rPr>
-              <w:t>[[IS_choixMontant]]</w:t>
+              <w:t>[[</w:t>
+            </w:r>
+            <w:proofErr w:type="spellStart"/>
+            <w:r>
+              <w:rPr>
+                <w:color w:val="46413B"/>
+                <w:spacing w:val="-2"/>
+                <w:sz w:val="20"/>
+              </w:rPr>
+              <w:t>IS_choixMontant</w:t>
+            </w:r>
+            <w:proofErr w:type="spellEnd"/>
+            <w:r>
+              <w:rPr>
+                <w:color w:val="46413B"/>
+                <w:spacing w:val="-2"/>
+                <w:sz w:val="20"/>
+              </w:rPr>
+              <w:t>]]</w:t>
             </w:r>
           </w:p>
         </w:tc>
@@ -4963,7 +5686,25 @@
                 <w:spacing w:val="-2"/>
                 <w:sz w:val="20"/>
               </w:rPr>
-              <w:t>[[IS_montant]]</w:t>
+              <w:t>[[</w:t>
+            </w:r>
+            <w:proofErr w:type="spellStart"/>
+            <w:r>
+              <w:rPr>
+                <w:color w:val="46413B"/>
+                <w:spacing w:val="-2"/>
+                <w:sz w:val="20"/>
+              </w:rPr>
+              <w:t>IS_montant</w:t>
+            </w:r>
+            <w:proofErr w:type="spellEnd"/>
+            <w:r>
+              <w:rPr>
+                <w:color w:val="46413B"/>
+                <w:spacing w:val="-2"/>
+                <w:sz w:val="20"/>
+              </w:rPr>
+              <w:t>]]</w:t>
             </w:r>
           </w:p>
         </w:tc>
@@ -4979,16 +5720,31 @@
         <w:spacing w:before="120" w:after="120" w:line="276" w:lineRule="auto"/>
       </w:pPr>
       <w:r>
-        <w:t>[[IS_phraseAcomptes]]</w:t>
-      </w:r>
-    </w:p>
-    <w:p>
-      <w:pPr>
-        <w:spacing w:before="120" w:after="120" w:line="276" w:lineRule="auto"/>
-      </w:pPr>
-      <w:r>
-        <w:lastRenderedPageBreak/>
-        <w:t>[[/IS_masquerSection]]</w:t>
+        <w:t>[[</w:t>
+      </w:r>
+      <w:proofErr w:type="spellStart"/>
+      <w:r>
+        <w:t>IS_phraseAcomptes</w:t>
+      </w:r>
+      <w:proofErr w:type="spellEnd"/>
+      <w:r>
+        <w:t>]]</w:t>
+      </w:r>
+    </w:p>
+    <w:p>
+      <w:pPr>
+        <w:spacing w:before="120" w:after="120" w:line="276" w:lineRule="auto"/>
+      </w:pPr>
+      <w:r>
+        <w:t>[[/</w:t>
+      </w:r>
+      <w:proofErr w:type="spellStart"/>
+      <w:r>
+        <w:t>IS_masquerSection</w:t>
+      </w:r>
+      <w:proofErr w:type="spellEnd"/>
+      <w:r>
+        <w:t>]]</w:t>
       </w:r>
     </w:p>
     <w:p>
@@ -5355,7 +6111,15 @@
         <w:spacing w:before="120" w:after="120" w:line="276" w:lineRule="auto"/>
       </w:pPr>
       <w:r>
-        <w:t>[[/AI_masquerSection]]</w:t>
+        <w:t>[[/</w:t>
+      </w:r>
+      <w:proofErr w:type="spellStart"/>
+      <w:r>
+        <w:t>AI_masquerSection</w:t>
+      </w:r>
+      <w:proofErr w:type="spellEnd"/>
+      <w:r>
+        <w:t>]]</w:t>
       </w:r>
     </w:p>
     <w:p>
@@ -5418,7 +6182,15 @@
         <w:spacing w:before="120" w:after="120" w:line="276" w:lineRule="auto"/>
       </w:pPr>
       <w:r>
-        <w:t>[[/informationFiscale_Rnovation_et_taux_rduit_de_TVA]]</w:t>
+        <w:t>[[/</w:t>
+      </w:r>
+      <w:proofErr w:type="spellStart"/>
+      <w:r>
+        <w:t>informationFiscale_Rnovation_et_taux_rduit_de_TVA</w:t>
+      </w:r>
+      <w:proofErr w:type="spellEnd"/>
+      <w:r>
+        <w:t>]]</w:t>
       </w:r>
     </w:p>
     <w:p>
@@ -5503,6 +6275,7 @@
         <w:rPr>
           <w:sz w:val="22"/>
         </w:rPr>
+        <w:lastRenderedPageBreak/>
         <w:t xml:space="preserve">Vous utilisez une ou plusieurs caisses enregistreuses ou un système informatique de caisse, dans le cadre de votre activité. Vous êtes, en conséquence, concerné par l'entrée en application au </w:t>
       </w:r>
       <w:r>
@@ -5532,14 +6305,7 @@
         <w:rPr>
           <w:sz w:val="22"/>
         </w:rPr>
-        <w:t xml:space="preserve">L'assujetti à TVA qui ne pourra présenter ce document encourra une amende de 7 500 € par système de caisse concerné. Sans attendre les précisions de l'administration demandées par les professionnels et les éditeurs de </w:t>
-      </w:r>
-      <w:r>
-        <w:rPr>
-          <w:sz w:val="22"/>
-        </w:rPr>
-        <w:lastRenderedPageBreak/>
-        <w:t>logiciels, nous vous conseillons de vous adresser à votre fournisseur de systèmes de caisse. »</w:t>
+        <w:t>L'assujetti à TVA qui ne pourra présenter ce document encourra une amende de 7 500 € par système de caisse concerné. Sans attendre les précisions de l'administration demandées par les professionnels et les éditeurs de logiciels, nous vous conseillons de vous adresser à votre fournisseur de systèmes de caisse. »</w:t>
       </w:r>
     </w:p>
     <w:p>
@@ -5585,7 +6351,15 @@
         <w:spacing w:before="120" w:after="120" w:line="276" w:lineRule="auto"/>
       </w:pPr>
       <w:r>
-        <w:t>[[/informationFiscale_Crances_irrcouvrables]]</w:t>
+        <w:t>[[/</w:t>
+      </w:r>
+      <w:proofErr w:type="spellStart"/>
+      <w:r>
+        <w:t>informationFiscale_Crances_irrcouvrables</w:t>
+      </w:r>
+      <w:proofErr w:type="spellEnd"/>
+      <w:r>
+        <w:t>]]</w:t>
       </w:r>
     </w:p>
     <w:p>
@@ -5762,7 +6536,15 @@
         <w:spacing w:before="120" w:after="120" w:line="276" w:lineRule="auto"/>
       </w:pPr>
       <w:r>
-        <w:t>[[/informationFiscale_Perte_de_la_moiti_de_capital_social]]</w:t>
+        <w:t>[[/</w:t>
+      </w:r>
+      <w:proofErr w:type="spellStart"/>
+      <w:r>
+        <w:t>informationFiscale_Perte_de_la_moiti_de_capital_social</w:t>
+      </w:r>
+      <w:proofErr w:type="spellEnd"/>
+      <w:r>
+        <w:t>]]</w:t>
       </w:r>
     </w:p>
     <w:p>
@@ -5792,7 +6574,14 @@
         <w:rPr>
           <w:sz w:val="22"/>
         </w:rPr>
-        <w:t>Les comptes courants débiteurs sont interdits par le code de commerce. Il suffit que la position débitrice du compte courant existe une seule fois dans l'exercice comptable pour que l'infraction, quel que soit son montant, soit avérée. Dans les SARL, la règle s'applique aux associés personnes physiques (article L 223-21 du Code de commerce) : « À peine de nullité du contrat, il est interdit aux gérants ou associés autres que les personnes morales de contracter, sous quelque forme que ce soit, des emprunts auprès de la société, de se faire consentir par elle un découvert, en compte courant ou autrement, ainsi que de faire cautionner ou avaliser par elle leurs engagements envers les tiers. Cette interdiction s'applique aux représentants légaux des personnes morales associées.</w:t>
+        <w:t xml:space="preserve">Les comptes courants débiteurs sont interdits par le code de commerce. Il suffit que la position débitrice du compte </w:t>
+      </w:r>
+      <w:r>
+        <w:rPr>
+          <w:sz w:val="22"/>
+        </w:rPr>
+        <w:lastRenderedPageBreak/>
+        <w:t>courant existe une seule fois dans l'exercice comptable pour que l'infraction, quel que soit son montant, soit avérée. Dans les SARL, la règle s'applique aux associés personnes physiques (article L 223-21 du Code de commerce) : « À peine de nullité du contrat, il est interdit aux gérants ou associés autres que les personnes morales de contracter, sous quelque forme que ce soit, des emprunts auprès de la société, de se faire consentir par elle un découvert, en compte courant ou autrement, ainsi que de faire cautionner ou avaliser par elle leurs engagements envers les tiers. Cette interdiction s'applique aux représentants légaux des personnes morales associées.</w:t>
       </w:r>
     </w:p>
     <w:p>
@@ -5806,14 +6595,7 @@
         <w:rPr>
           <w:sz w:val="22"/>
         </w:rPr>
-        <w:t xml:space="preserve">L'interdiction s'applique également aux conjoint, ascendants et descendants des personnes visées à l'alinéa précédent </w:t>
-      </w:r>
-      <w:r>
-        <w:rPr>
-          <w:sz w:val="22"/>
-        </w:rPr>
-        <w:lastRenderedPageBreak/>
-        <w:t>ainsi qu'à toute personne interposée ».</w:t>
+        <w:t>L'interdiction s'applique également aux conjoint, ascendants et descendants des personnes visées à l'alinéa précédent ainsi qu'à toute personne interposée ».</w:t>
       </w:r>
     </w:p>
     <w:p>
@@ -5836,11 +6618,19 @@
         <w:spacing w:before="120" w:after="120" w:line="276" w:lineRule="auto"/>
         <w:jc w:val="both"/>
       </w:pPr>
+      <w:proofErr w:type="gramStart"/>
       <w:r>
         <w:rPr>
           <w:sz w:val="22"/>
         </w:rPr>
-        <w:t>Au plan social</w:t>
+        <w:t>Au</w:t>
+      </w:r>
+      <w:proofErr w:type="gramEnd"/>
+      <w:r>
+        <w:rPr>
+          <w:sz w:val="22"/>
+        </w:rPr>
+        <w:t xml:space="preserve"> plan social</w:t>
       </w:r>
     </w:p>
     <w:p>
@@ -5863,11 +6653,19 @@
         <w:spacing w:before="120" w:after="120" w:line="276" w:lineRule="auto"/>
         <w:jc w:val="both"/>
       </w:pPr>
+      <w:proofErr w:type="gramStart"/>
       <w:r>
         <w:rPr>
           <w:sz w:val="22"/>
         </w:rPr>
-        <w:t>Au plan fiscal</w:t>
+        <w:t>Au</w:t>
+      </w:r>
+      <w:proofErr w:type="gramEnd"/>
+      <w:r>
+        <w:rPr>
+          <w:sz w:val="22"/>
+        </w:rPr>
+        <w:t xml:space="preserve"> plan fiscal</w:t>
       </w:r>
     </w:p>
     <w:p>
@@ -5905,7 +6703,15 @@
         <w:spacing w:before="120" w:after="120" w:line="276" w:lineRule="auto"/>
       </w:pPr>
       <w:r>
-        <w:t>[[/informationFiscale_Comptes_courants_dbiteurs]]</w:t>
+        <w:t>[[/</w:t>
+      </w:r>
+      <w:proofErr w:type="spellStart"/>
+      <w:r>
+        <w:t>informationFiscale_Comptes_courants_dbiteurs</w:t>
+      </w:r>
+      <w:proofErr w:type="spellEnd"/>
+      <w:r>
+        <w:t>]]</w:t>
       </w:r>
     </w:p>
     <w:p>
@@ -6005,7 +6811,15 @@
         <w:spacing w:before="120" w:after="120" w:line="276" w:lineRule="auto"/>
       </w:pPr>
       <w:r>
-        <w:t>[[/informationFiscale_Obligation_des_entreprises_individuelles]]</w:t>
+        <w:t>[[/</w:t>
+      </w:r>
+      <w:proofErr w:type="spellStart"/>
+      <w:r>
+        <w:t>informationFiscale_Obligation_des_entreprises_individuelles</w:t>
+      </w:r>
+      <w:proofErr w:type="spellEnd"/>
+      <w:r>
+        <w:t>]]</w:t>
       </w:r>
     </w:p>
     <w:p>
@@ -6021,6 +6835,7 @@
         <w:pStyle w:val="IF"/>
       </w:pPr>
       <w:r>
+        <w:lastRenderedPageBreak/>
         <w:t>SCI IR : obligation du gérant de transmettre les documents aux associés :</w:t>
       </w:r>
     </w:p>
@@ -6059,7 +6874,6 @@
         <w:pStyle w:val="IF"/>
       </w:pPr>
       <w:r>
-        <w:lastRenderedPageBreak/>
         <w:t>Non affiliation à la médecine du travail :</w:t>
       </w:r>
     </w:p>
@@ -6124,7 +6938,15 @@
         <w:spacing w:before="120" w:after="120" w:line="276" w:lineRule="auto"/>
       </w:pPr>
       <w:r>
-        <w:t>[[/informationFiscale_Non_affiliation__la_mdecine_du_travail]]</w:t>
+        <w:t>[[/informationFiscale_Non_affiliation__</w:t>
+      </w:r>
+      <w:proofErr w:type="spellStart"/>
+      <w:r>
+        <w:t>la_mdecine_du_travail</w:t>
+      </w:r>
+      <w:proofErr w:type="spellEnd"/>
+      <w:r>
+        <w:t>]]</w:t>
       </w:r>
     </w:p>
     <w:p>
@@ -6140,7 +6962,15 @@
         <w:pStyle w:val="IF"/>
       </w:pPr>
       <w:r>
-        <w:t>Retard dans le dépôt de vos déclarations fiscales suite à non-transmission de vos éléments comptables :</w:t>
+        <w:t xml:space="preserve">Retard dans le dépôt de vos déclarations fiscales </w:t>
+      </w:r>
+      <w:proofErr w:type="gramStart"/>
+      <w:r>
+        <w:t>suite à</w:t>
+      </w:r>
+      <w:proofErr w:type="gramEnd"/>
+      <w:r>
+        <w:t xml:space="preserve"> non-transmission de vos éléments comptables :</w:t>
       </w:r>
     </w:p>
     <w:p>
@@ -6280,15 +7110,31 @@
         <w:spacing w:before="120" w:after="120" w:line="276" w:lineRule="auto"/>
       </w:pPr>
       <w:r>
-        <w:t>[[/informationFiscale_Protection_sociale]]</w:t>
-      </w:r>
-    </w:p>
-    <w:p>
-      <w:pPr>
-        <w:spacing w:before="120" w:after="120" w:line="276" w:lineRule="auto"/>
-      </w:pPr>
-      <w:r>
-        <w:t>[[/informationFiscale_hasAny]]</w:t>
+        <w:t>[[/</w:t>
+      </w:r>
+      <w:proofErr w:type="spellStart"/>
+      <w:r>
+        <w:t>informationFiscale_Protection_sociale</w:t>
+      </w:r>
+      <w:proofErr w:type="spellEnd"/>
+      <w:r>
+        <w:t>]]</w:t>
+      </w:r>
+    </w:p>
+    <w:p>
+      <w:pPr>
+        <w:spacing w:before="120" w:after="120" w:line="276" w:lineRule="auto"/>
+      </w:pPr>
+      <w:r>
+        <w:t>[[/</w:t>
+      </w:r>
+      <w:proofErr w:type="spellStart"/>
+      <w:r>
+        <w:t>informationFiscale_hasAny</w:t>
+      </w:r>
+      <w:proofErr w:type="spellEnd"/>
+      <w:r>
+        <w:t>]]</w:t>
       </w:r>
     </w:p>
     <w:p>
@@ -6414,6 +7260,7 @@
                 <w:color w:val="46413B"/>
                 <w:sz w:val="20"/>
               </w:rPr>
+              <w:lastRenderedPageBreak/>
               <w:t>Résultat</w:t>
             </w:r>
             <w:r>
@@ -6476,7 +7323,25 @@
                 <w:spacing w:val="-2"/>
                 <w:sz w:val="20"/>
               </w:rPr>
-              <w:t>[[PA_resEx]]</w:t>
+              <w:t>[[</w:t>
+            </w:r>
+            <w:proofErr w:type="spellStart"/>
+            <w:r>
+              <w:rPr>
+                <w:color w:val="46413B"/>
+                <w:spacing w:val="-2"/>
+                <w:sz w:val="20"/>
+              </w:rPr>
+              <w:t>PA_resEx</w:t>
+            </w:r>
+            <w:proofErr w:type="spellEnd"/>
+            <w:r>
+              <w:rPr>
+                <w:color w:val="46413B"/>
+                <w:spacing w:val="-2"/>
+                <w:sz w:val="20"/>
+              </w:rPr>
+              <w:t>]]</w:t>
             </w:r>
           </w:p>
         </w:tc>
@@ -6635,7 +7500,25 @@
                 <w:spacing w:val="-2"/>
                 <w:sz w:val="20"/>
               </w:rPr>
-              <w:t>[[PA_resLeg]]</w:t>
+              <w:t>[[</w:t>
+            </w:r>
+            <w:proofErr w:type="spellStart"/>
+            <w:r>
+              <w:rPr>
+                <w:color w:val="46413B"/>
+                <w:spacing w:val="-2"/>
+                <w:sz w:val="20"/>
+              </w:rPr>
+              <w:t>PA_resLeg</w:t>
+            </w:r>
+            <w:proofErr w:type="spellEnd"/>
+            <w:r>
+              <w:rPr>
+                <w:color w:val="46413B"/>
+                <w:spacing w:val="-2"/>
+                <w:sz w:val="20"/>
+              </w:rPr>
+              <w:t>]]</w:t>
             </w:r>
           </w:p>
         </w:tc>
@@ -6734,7 +7617,25 @@
                 <w:spacing w:val="-2"/>
                 <w:sz w:val="20"/>
               </w:rPr>
-              <w:t>[[PA_resOrd]]</w:t>
+              <w:t>[[</w:t>
+            </w:r>
+            <w:proofErr w:type="spellStart"/>
+            <w:r>
+              <w:rPr>
+                <w:color w:val="46413B"/>
+                <w:spacing w:val="-2"/>
+                <w:sz w:val="20"/>
+              </w:rPr>
+              <w:t>PA_resOrd</w:t>
+            </w:r>
+            <w:proofErr w:type="spellEnd"/>
+            <w:r>
+              <w:rPr>
+                <w:color w:val="46413B"/>
+                <w:spacing w:val="-2"/>
+                <w:sz w:val="20"/>
+              </w:rPr>
+              <w:t>]]</w:t>
             </w:r>
           </w:p>
         </w:tc>
@@ -6848,7 +7749,25 @@
                 <w:spacing w:val="-2"/>
                 <w:sz w:val="20"/>
               </w:rPr>
-              <w:t>[[PA_report]]</w:t>
+              <w:t>[[</w:t>
+            </w:r>
+            <w:proofErr w:type="spellStart"/>
+            <w:r>
+              <w:rPr>
+                <w:color w:val="46413B"/>
+                <w:spacing w:val="-2"/>
+                <w:sz w:val="20"/>
+              </w:rPr>
+              <w:t>PA_report</w:t>
+            </w:r>
+            <w:proofErr w:type="spellEnd"/>
+            <w:r>
+              <w:rPr>
+                <w:color w:val="46413B"/>
+                <w:spacing w:val="-2"/>
+                <w:sz w:val="20"/>
+              </w:rPr>
+              <w:t>]]</w:t>
             </w:r>
           </w:p>
         </w:tc>
@@ -6898,7 +7817,25 @@
                 <w:spacing w:val="-2"/>
                 <w:sz w:val="20"/>
               </w:rPr>
-              <w:t>[[PA_affectation]]</w:t>
+              <w:t>[[</w:t>
+            </w:r>
+            <w:proofErr w:type="spellStart"/>
+            <w:r>
+              <w:rPr>
+                <w:color w:val="46413B"/>
+                <w:spacing w:val="-2"/>
+                <w:sz w:val="20"/>
+              </w:rPr>
+              <w:t>PA_affectation</w:t>
+            </w:r>
+            <w:proofErr w:type="spellEnd"/>
+            <w:r>
+              <w:rPr>
+                <w:color w:val="46413B"/>
+                <w:spacing w:val="-2"/>
+                <w:sz w:val="20"/>
+              </w:rPr>
+              <w:t>]]</w:t>
             </w:r>
           </w:p>
         </w:tc>
@@ -6931,7 +7868,16 @@
                 <w:spacing w:val="-2"/>
                 <w:sz w:val="20"/>
               </w:rPr>
-              <w:t>[[PA_</w:t>
+              <w:t>[[</w:t>
+            </w:r>
+            <w:proofErr w:type="spellStart"/>
+            <w:r>
+              <w:rPr>
+                <w:color w:val="46413B"/>
+                <w:spacing w:val="-2"/>
+                <w:sz w:val="20"/>
+              </w:rPr>
+              <w:t>PA_</w:t>
             </w:r>
             <w:r>
               <w:rPr>
@@ -6941,6 +7887,7 @@
               </w:rPr>
               <w:t>affect</w:t>
             </w:r>
+            <w:proofErr w:type="spellEnd"/>
             <w:r>
               <w:rPr>
                 <w:color w:val="46413B"/>
@@ -7117,7 +8064,15 @@
                 <w:color w:val="46413B"/>
                 <w:sz w:val="20"/>
               </w:rPr>
-              <w:t>[[AF_</w:t>
+              <w:t>[[</w:t>
+            </w:r>
+            <w:proofErr w:type="spellStart"/>
+            <w:r>
+              <w:rPr>
+                <w:color w:val="46413B"/>
+                <w:sz w:val="20"/>
+              </w:rPr>
+              <w:t>AF_</w:t>
             </w:r>
             <w:r>
               <w:rPr>
@@ -7126,6 +8081,7 @@
               </w:rPr>
               <w:t>resEx</w:t>
             </w:r>
+            <w:proofErr w:type="spellEnd"/>
             <w:r>
               <w:rPr>
                 <w:color w:val="46413B"/>
@@ -7196,7 +8152,15 @@
                 <w:color w:val="46413B"/>
                 <w:sz w:val="20"/>
               </w:rPr>
-              <w:t>[[AF_</w:t>
+              <w:t>[[</w:t>
+            </w:r>
+            <w:proofErr w:type="spellStart"/>
+            <w:r>
+              <w:rPr>
+                <w:color w:val="46413B"/>
+                <w:sz w:val="20"/>
+              </w:rPr>
+              <w:t>AF_</w:t>
             </w:r>
             <w:r>
               <w:rPr>
@@ -7205,6 +8169,7 @@
               </w:rPr>
               <w:t>dota</w:t>
             </w:r>
+            <w:proofErr w:type="spellEnd"/>
             <w:r>
               <w:rPr>
                 <w:color w:val="46413B"/>
@@ -7275,7 +8240,15 @@
                 <w:color w:val="46413B"/>
                 <w:sz w:val="20"/>
               </w:rPr>
-              <w:t>[[AF_</w:t>
+              <w:t>[[</w:t>
+            </w:r>
+            <w:proofErr w:type="spellStart"/>
+            <w:r>
+              <w:rPr>
+                <w:color w:val="46413B"/>
+                <w:sz w:val="20"/>
+              </w:rPr>
+              <w:t>AF_</w:t>
             </w:r>
             <w:r>
               <w:rPr>
@@ -7284,6 +8257,7 @@
               </w:rPr>
               <w:t>reprises</w:t>
             </w:r>
+            <w:proofErr w:type="spellEnd"/>
             <w:r>
               <w:rPr>
                 <w:color w:val="46413B"/>
@@ -7362,14 +8336,30 @@
                 <w:color w:val="46413B"/>
                 <w:sz w:val="20"/>
               </w:rPr>
-              <w:t>[[AF_</w:t>
-            </w:r>
-            <w:r>
-              <w:rPr>
-                <w:color w:val="46413B"/>
-                <w:sz w:val="20"/>
-              </w:rPr>
-              <w:t>cessions]]</w:t>
+              <w:t>[[</w:t>
+            </w:r>
+            <w:proofErr w:type="spellStart"/>
+            <w:r>
+              <w:rPr>
+                <w:color w:val="46413B"/>
+                <w:sz w:val="20"/>
+              </w:rPr>
+              <w:t>AF_</w:t>
+            </w:r>
+            <w:r>
+              <w:rPr>
+                <w:color w:val="46413B"/>
+                <w:sz w:val="20"/>
+              </w:rPr>
+              <w:t>cessions</w:t>
+            </w:r>
+            <w:proofErr w:type="spellEnd"/>
+            <w:r>
+              <w:rPr>
+                <w:color w:val="46413B"/>
+                <w:sz w:val="20"/>
+              </w:rPr>
+              <w:t>]]</w:t>
             </w:r>
           </w:p>
         </w:tc>
@@ -7495,7 +8485,23 @@
                 <w:color w:val="46413B"/>
                 <w:sz w:val="20"/>
               </w:rPr>
-              <w:t>[[AF_subven]]</w:t>
+              <w:t>[[</w:t>
+            </w:r>
+            <w:proofErr w:type="spellStart"/>
+            <w:r>
+              <w:rPr>
+                <w:color w:val="46413B"/>
+                <w:sz w:val="20"/>
+              </w:rPr>
+              <w:t>AF_subven</w:t>
+            </w:r>
+            <w:proofErr w:type="spellEnd"/>
+            <w:r>
+              <w:rPr>
+                <w:color w:val="46413B"/>
+                <w:sz w:val="20"/>
+              </w:rPr>
+              <w:t>]]</w:t>
             </w:r>
           </w:p>
         </w:tc>
@@ -7565,7 +8571,23 @@
                 <w:color w:val="46413B"/>
                 <w:sz w:val="20"/>
               </w:rPr>
-              <w:t>[[AF_capa]]</w:t>
+              <w:t>[[</w:t>
+            </w:r>
+            <w:proofErr w:type="spellStart"/>
+            <w:r>
+              <w:rPr>
+                <w:color w:val="46413B"/>
+                <w:sz w:val="20"/>
+              </w:rPr>
+              <w:t>AF_capa</w:t>
+            </w:r>
+            <w:proofErr w:type="spellEnd"/>
+            <w:r>
+              <w:rPr>
+                <w:color w:val="46413B"/>
+                <w:sz w:val="20"/>
+              </w:rPr>
+              <w:t>]]</w:t>
             </w:r>
           </w:p>
         </w:tc>
@@ -7630,7 +8652,15 @@
                 <w:color w:val="46413B"/>
                 <w:sz w:val="20"/>
               </w:rPr>
-              <w:t>[[AF_re</w:t>
+              <w:t>[[</w:t>
+            </w:r>
+            <w:proofErr w:type="spellStart"/>
+            <w:r>
+              <w:rPr>
+                <w:color w:val="46413B"/>
+                <w:sz w:val="20"/>
+              </w:rPr>
+              <w:t>AF_re</w:t>
             </w:r>
             <w:r>
               <w:rPr>
@@ -7639,6 +8669,7 @@
               </w:rPr>
               <w:t>mbours</w:t>
             </w:r>
+            <w:proofErr w:type="spellEnd"/>
             <w:r>
               <w:rPr>
                 <w:color w:val="46413B"/>
@@ -7706,7 +8737,21 @@
               <w:rPr>
                 <w:sz w:val="20"/>
               </w:rPr>
-              <w:t>[[AF_divi]]</w:t>
+              <w:t>[[</w:t>
+            </w:r>
+            <w:proofErr w:type="spellStart"/>
+            <w:r>
+              <w:rPr>
+                <w:sz w:val="20"/>
+              </w:rPr>
+              <w:t>AF_divi</w:t>
+            </w:r>
+            <w:proofErr w:type="spellEnd"/>
+            <w:r>
+              <w:rPr>
+                <w:sz w:val="20"/>
+              </w:rPr>
+              <w:t>]]</w:t>
             </w:r>
           </w:p>
         </w:tc>
@@ -7772,7 +8817,21 @@
               <w:rPr>
                 <w:sz w:val="20"/>
               </w:rPr>
-              <w:t>[[AF_capaNet]]</w:t>
+              <w:t>[[</w:t>
+            </w:r>
+            <w:proofErr w:type="spellStart"/>
+            <w:r>
+              <w:rPr>
+                <w:sz w:val="20"/>
+              </w:rPr>
+              <w:t>AF_capaNet</w:t>
+            </w:r>
+            <w:proofErr w:type="spellEnd"/>
+            <w:r>
+              <w:rPr>
+                <w:sz w:val="20"/>
+              </w:rPr>
+              <w:t>]]</w:t>
             </w:r>
           </w:p>
         </w:tc>
@@ -7783,7 +8842,15 @@
         <w:spacing w:before="120" w:after="120" w:line="276" w:lineRule="auto"/>
       </w:pPr>
       <w:r>
-        <w:t>[[/AF_enabled]]</w:t>
+        <w:t>[[/</w:t>
+      </w:r>
+      <w:proofErr w:type="spellStart"/>
+      <w:r>
+        <w:t>AF_enabled</w:t>
+      </w:r>
+      <w:proofErr w:type="spellEnd"/>
+      <w:r>
+        <w:t>]]</w:t>
       </w:r>
     </w:p>
     <w:p>
@@ -7982,7 +9049,25 @@
                 <w:spacing w:val="-2"/>
                 <w:sz w:val="20"/>
               </w:rPr>
-              <w:t>[[EA_resEx]]</w:t>
+              <w:t>[[</w:t>
+            </w:r>
+            <w:proofErr w:type="spellStart"/>
+            <w:r>
+              <w:rPr>
+                <w:color w:val="46413B"/>
+                <w:spacing w:val="-2"/>
+                <w:sz w:val="20"/>
+              </w:rPr>
+              <w:t>EA_resEx</w:t>
+            </w:r>
+            <w:proofErr w:type="spellEnd"/>
+            <w:r>
+              <w:rPr>
+                <w:color w:val="46413B"/>
+                <w:spacing w:val="-2"/>
+                <w:sz w:val="20"/>
+              </w:rPr>
+              <w:t>]]</w:t>
             </w:r>
           </w:p>
         </w:tc>
@@ -8080,15 +9165,33 @@
                 <w:spacing w:val="-2"/>
                 <w:sz w:val="20"/>
               </w:rPr>
-              <w:t>[[EA_</w:t>
-            </w:r>
-            <w:r>
-              <w:rPr>
-                <w:color w:val="46413B"/>
-                <w:spacing w:val="-2"/>
-                <w:sz w:val="20"/>
-              </w:rPr>
-              <w:t>dot]]</w:t>
+              <w:t>[[</w:t>
+            </w:r>
+            <w:proofErr w:type="spellStart"/>
+            <w:r>
+              <w:rPr>
+                <w:color w:val="46413B"/>
+                <w:spacing w:val="-2"/>
+                <w:sz w:val="20"/>
+              </w:rPr>
+              <w:t>EA_</w:t>
+            </w:r>
+            <w:r>
+              <w:rPr>
+                <w:color w:val="46413B"/>
+                <w:spacing w:val="-2"/>
+                <w:sz w:val="20"/>
+              </w:rPr>
+              <w:t>dot</w:t>
+            </w:r>
+            <w:proofErr w:type="spellEnd"/>
+            <w:r>
+              <w:rPr>
+                <w:color w:val="46413B"/>
+                <w:spacing w:val="-2"/>
+                <w:sz w:val="20"/>
+              </w:rPr>
+              <w:t>]]</w:t>
             </w:r>
           </w:p>
         </w:tc>
@@ -8172,15 +9275,33 @@
                 <w:spacing w:val="-2"/>
                 <w:sz w:val="20"/>
               </w:rPr>
-              <w:t>[[EA_</w:t>
-            </w:r>
-            <w:r>
-              <w:rPr>
-                <w:color w:val="46413B"/>
-                <w:spacing w:val="-2"/>
-                <w:sz w:val="20"/>
-              </w:rPr>
-              <w:t>rembours]]</w:t>
+              <w:t>[[</w:t>
+            </w:r>
+            <w:proofErr w:type="spellStart"/>
+            <w:r>
+              <w:rPr>
+                <w:color w:val="46413B"/>
+                <w:spacing w:val="-2"/>
+                <w:sz w:val="20"/>
+              </w:rPr>
+              <w:t>EA_</w:t>
+            </w:r>
+            <w:r>
+              <w:rPr>
+                <w:color w:val="46413B"/>
+                <w:spacing w:val="-2"/>
+                <w:sz w:val="20"/>
+              </w:rPr>
+              <w:t>rembours</w:t>
+            </w:r>
+            <w:proofErr w:type="spellEnd"/>
+            <w:r>
+              <w:rPr>
+                <w:color w:val="46413B"/>
+                <w:spacing w:val="-2"/>
+                <w:sz w:val="20"/>
+              </w:rPr>
+              <w:t>]]</w:t>
             </w:r>
           </w:p>
         </w:tc>
@@ -8248,15 +9369,33 @@
                 <w:spacing w:val="-2"/>
                 <w:sz w:val="20"/>
               </w:rPr>
-              <w:t>[[EA_</w:t>
-            </w:r>
-            <w:r>
-              <w:rPr>
-                <w:color w:val="46413B"/>
-                <w:spacing w:val="-2"/>
-                <w:sz w:val="20"/>
-              </w:rPr>
-              <w:t>divi]]</w:t>
+              <w:t>[[</w:t>
+            </w:r>
+            <w:proofErr w:type="spellStart"/>
+            <w:r>
+              <w:rPr>
+                <w:color w:val="46413B"/>
+                <w:spacing w:val="-2"/>
+                <w:sz w:val="20"/>
+              </w:rPr>
+              <w:t>EA_</w:t>
+            </w:r>
+            <w:r>
+              <w:rPr>
+                <w:color w:val="46413B"/>
+                <w:spacing w:val="-2"/>
+                <w:sz w:val="20"/>
+              </w:rPr>
+              <w:t>divi</w:t>
+            </w:r>
+            <w:proofErr w:type="spellEnd"/>
+            <w:r>
+              <w:rPr>
+                <w:color w:val="46413B"/>
+                <w:spacing w:val="-2"/>
+                <w:sz w:val="20"/>
+              </w:rPr>
+              <w:t>]]</w:t>
             </w:r>
           </w:p>
         </w:tc>
@@ -8379,15 +9518,33 @@
                 <w:spacing w:val="-2"/>
                 <w:sz w:val="20"/>
               </w:rPr>
-              <w:t>[[EA_</w:t>
-            </w:r>
-            <w:r>
-              <w:rPr>
-                <w:color w:val="46413B"/>
-                <w:spacing w:val="-2"/>
-                <w:sz w:val="20"/>
-              </w:rPr>
-              <w:t>capa]]</w:t>
+              <w:t>[[</w:t>
+            </w:r>
+            <w:proofErr w:type="spellStart"/>
+            <w:r>
+              <w:rPr>
+                <w:color w:val="46413B"/>
+                <w:spacing w:val="-2"/>
+                <w:sz w:val="20"/>
+              </w:rPr>
+              <w:t>EA_</w:t>
+            </w:r>
+            <w:r>
+              <w:rPr>
+                <w:color w:val="46413B"/>
+                <w:spacing w:val="-2"/>
+                <w:sz w:val="20"/>
+              </w:rPr>
+              <w:t>capa</w:t>
+            </w:r>
+            <w:proofErr w:type="spellEnd"/>
+            <w:r>
+              <w:rPr>
+                <w:color w:val="46413B"/>
+                <w:spacing w:val="-2"/>
+                <w:sz w:val="20"/>
+              </w:rPr>
+              <w:t>]]</w:t>
             </w:r>
           </w:p>
         </w:tc>
@@ -8398,7 +9555,15 @@
         <w:spacing w:before="120" w:after="120" w:line="276" w:lineRule="auto"/>
       </w:pPr>
       <w:r>
-        <w:t>[[/EA_enabled]]</w:t>
+        <w:t>[[/</w:t>
+      </w:r>
+      <w:proofErr w:type="spellStart"/>
+      <w:r>
+        <w:t>EA_enabled</w:t>
+      </w:r>
+      <w:proofErr w:type="spellEnd"/>
+      <w:r>
+        <w:t>]]</w:t>
       </w:r>
     </w:p>
     <w:p>
@@ -8490,6 +9655,7 @@
         </w:rPr>
       </w:pPr>
       <w:r>
+        <w:lastRenderedPageBreak/>
         <w:t>Faire les mises à jour de vos logiciels et protéger le matériel des virus,</w:t>
       </w:r>
     </w:p>
@@ -8590,7 +9756,6 @@
         </w:rPr>
       </w:pPr>
       <w:r>
-        <w:lastRenderedPageBreak/>
         <w:t>Être attentif aux informations personnelles ou professionnelles diffusées sur internet.</w:t>
       </w:r>
     </w:p>
@@ -8964,7 +10129,16 @@
         <w:spacing w:before="120" w:after="120" w:line="276" w:lineRule="auto"/>
       </w:pPr>
       <w:r>
-        <w:t>[[/MD_enabled]]</w:t>
+        <w:lastRenderedPageBreak/>
+        <w:t>[[/</w:t>
+      </w:r>
+      <w:proofErr w:type="spellStart"/>
+      <w:r>
+        <w:t>MD_enabled</w:t>
+      </w:r>
+      <w:proofErr w:type="spellEnd"/>
+      <w:r>
+        <w:t>]]</w:t>
       </w:r>
     </w:p>
     <w:p>
@@ -8987,6 +10161,41 @@
       <w:r>
         <w:t>FAITS MARQUANTS DE L'EXERCICE</w:t>
       </w:r>
+    </w:p>
+    <w:p>
+      <w:pPr>
+        <w:spacing w:before="120" w:after="120" w:line="276" w:lineRule="auto"/>
+      </w:pPr>
+      <w:r>
+        <w:t>[[</w:t>
+      </w:r>
+      <w:r>
+        <w:t>#</w:t>
+      </w:r>
+      <w:r>
+        <w:t>FM_commentaire]]</w:t>
+      </w:r>
+    </w:p>
+    <w:p>
+      <w:pPr>
+        <w:spacing w:before="120" w:after="120" w:line="276" w:lineRule="auto"/>
+      </w:pPr>
+      <w:r>
+        <w:t>[[</w:t>
+      </w:r>
+      <w:proofErr w:type="spellStart"/>
+      <w:r>
+        <w:t>FM_commentaire</w:t>
+      </w:r>
+      <w:proofErr w:type="spellEnd"/>
+      <w:r>
+        <w:t>]]</w:t>
+      </w:r>
+    </w:p>
+    <w:p>
+      <w:pPr>
+        <w:spacing w:before="120" w:after="120" w:line="276" w:lineRule="auto"/>
+      </w:pPr>
     </w:p>
     <w:p>
       <w:pPr>
@@ -8998,8 +10207,18 @@
         </w:rPr>
       </w:pPr>
       <w:r>
-        <w:lastRenderedPageBreak/>
-        <w:t>[[FM_commentaire]]</w:t>
+        <w:t>[[</w:t>
+      </w:r>
+      <w:r>
+        <w:t>/</w:t>
+      </w:r>
+      <w:proofErr w:type="spellStart"/>
+      <w:r>
+        <w:t>FM_commentaire</w:t>
+      </w:r>
+      <w:proofErr w:type="spellEnd"/>
+      <w:r>
+        <w:t>]]</w:t>
       </w:r>
     </w:p>
     <w:p>
@@ -9008,6 +10227,23 @@
       </w:pPr>
       <w:r>
         <w:t>[[#FM_justificationsDemandes]]</w:t>
+      </w:r>
+    </w:p>
+    <w:p>
+      <w:pPr>
+        <w:pStyle w:val="Corpsdetexte"/>
+        <w:spacing w:before="120" w:after="120" w:line="276" w:lineRule="auto"/>
+        <w:ind w:right="64"/>
+        <w:jc w:val="both"/>
+        <w:rPr>
+          <w:color w:val="46413B"/>
+        </w:rPr>
+      </w:pPr>
+      <w:r>
+        <w:rPr>
+          <w:sz w:val="22"/>
+        </w:rPr>
+        <w:t>Nous avons pris bonne note des justifications apportées à nos demandes d’explications concernant les apports financiers effectués.</w:t>
       </w:r>
     </w:p>
     <w:p>
@@ -9019,22 +10255,57 @@
           <w:szCs w:val="20"/>
         </w:rPr>
       </w:pPr>
-    </w:p>
-    <w:p>
-      <w:pPr>
-        <w:pStyle w:val="Corpsdetexte"/>
-        <w:spacing w:before="120" w:after="120" w:line="276" w:lineRule="auto"/>
-        <w:ind w:right="64"/>
-        <w:jc w:val="both"/>
+      <w:r>
+        <w:t>[[/</w:t>
+      </w:r>
+      <w:proofErr w:type="spellStart"/>
+      <w:r>
+        <w:t>FM_justificationsDemandes</w:t>
+      </w:r>
+      <w:proofErr w:type="spellEnd"/>
+      <w:r>
+        <w:t>]]</w:t>
+      </w:r>
+    </w:p>
+    <w:p>
+      <w:pPr>
+        <w:spacing w:before="120" w:after="120" w:line="276" w:lineRule="auto"/>
+      </w:pPr>
+      <w:r>
+        <w:t>[[/</w:t>
+      </w:r>
+      <w:proofErr w:type="spellStart"/>
+      <w:r>
+        <w:t>FM_enabled</w:t>
+      </w:r>
+      <w:proofErr w:type="spellEnd"/>
+      <w:r>
+        <w:t>]]</w:t>
+      </w:r>
+    </w:p>
+    <w:p>
+      <w:pPr>
+        <w:spacing w:before="120" w:after="120" w:line="276" w:lineRule="auto"/>
+      </w:pPr>
+    </w:p>
+    <w:p>
+      <w:pPr>
+        <w:spacing w:before="120" w:after="120" w:line="276" w:lineRule="auto"/>
+      </w:pPr>
+      <w:r>
+        <w:t>[[#PI_commentaire]]</w:t>
+      </w:r>
+    </w:p>
+    <w:p>
+      <w:pPr>
+        <w:pStyle w:val="titre"/>
         <w:rPr>
           <w:color w:val="46413B"/>
-        </w:rPr>
-      </w:pPr>
-      <w:r>
-        <w:rPr>
-          <w:sz w:val="22"/>
-        </w:rPr>
-        <w:t>Nous avons pris bonne note des justifications apportées à nos demandes d’explications concernant les apports financiers effectués.</w:t>
+          <w:spacing w:val="-2"/>
+        </w:rPr>
+      </w:pPr>
+      <w:r>
+        <w:t>POINTS IMPORTANTS</w:t>
       </w:r>
     </w:p>
     <w:p>
@@ -9047,40 +10318,52 @@
         </w:rPr>
       </w:pPr>
       <w:r>
-        <w:t>[[/FM_justificationsDemandes]]</w:t>
-      </w:r>
-    </w:p>
-    <w:p>
-      <w:pPr>
-        <w:spacing w:before="120" w:after="120" w:line="276" w:lineRule="auto"/>
-      </w:pPr>
-      <w:r>
-        <w:t>[[/FM_enabled]]</w:t>
-      </w:r>
-    </w:p>
-    <w:p>
-      <w:pPr>
-        <w:spacing w:before="120" w:after="120" w:line="276" w:lineRule="auto"/>
-      </w:pPr>
-    </w:p>
-    <w:p>
-      <w:pPr>
-        <w:spacing w:before="120" w:after="120" w:line="276" w:lineRule="auto"/>
-      </w:pPr>
-      <w:r>
-        <w:t>[[#PI_commentaire]]</w:t>
+        <w:t>[[</w:t>
+      </w:r>
+      <w:proofErr w:type="spellStart"/>
+      <w:r>
+        <w:t>PI_commentaire</w:t>
+      </w:r>
+      <w:proofErr w:type="spellEnd"/>
+      <w:r>
+        <w:t>]]</w:t>
+      </w:r>
+    </w:p>
+    <w:p>
+      <w:pPr>
+        <w:spacing w:before="120" w:after="120" w:line="276" w:lineRule="auto"/>
+      </w:pPr>
+      <w:r>
+        <w:t>[[/</w:t>
+      </w:r>
+      <w:proofErr w:type="spellStart"/>
+      <w:r>
+        <w:t>PI_commentaire</w:t>
+      </w:r>
+      <w:proofErr w:type="spellEnd"/>
+      <w:r>
+        <w:t>]]</w:t>
+      </w:r>
+    </w:p>
+    <w:p>
+      <w:pPr>
+        <w:spacing w:before="120" w:after="120" w:line="276" w:lineRule="auto"/>
+      </w:pPr>
+    </w:p>
+    <w:p>
+      <w:pPr>
+        <w:spacing w:before="120" w:after="120" w:line="276" w:lineRule="auto"/>
+      </w:pPr>
+      <w:r>
+        <w:t>[[#P_commentaire]]</w:t>
       </w:r>
     </w:p>
     <w:p>
       <w:pPr>
         <w:pStyle w:val="titre"/>
-        <w:rPr>
-          <w:color w:val="46413B"/>
-          <w:spacing w:val="-2"/>
-        </w:rPr>
-      </w:pPr>
-      <w:r>
-        <w:t>POINTS IMPORTANTS</w:t>
+      </w:pPr>
+      <w:r>
+        <w:t>LES PERSPECTIVES</w:t>
       </w:r>
     </w:p>
     <w:p>
@@ -9093,57 +10376,31 @@
         </w:rPr>
       </w:pPr>
       <w:r>
-        <w:t>[[PI_commentaire]]</w:t>
-      </w:r>
-    </w:p>
-    <w:p>
-      <w:pPr>
-        <w:spacing w:before="120" w:after="120" w:line="276" w:lineRule="auto"/>
-      </w:pPr>
-      <w:r>
-        <w:t>[[/PI_commentaire]]</w:t>
-      </w:r>
-    </w:p>
-    <w:p>
-      <w:pPr>
-        <w:spacing w:before="120" w:after="120" w:line="276" w:lineRule="auto"/>
-      </w:pPr>
-    </w:p>
-    <w:p>
-      <w:pPr>
-        <w:spacing w:before="120" w:after="120" w:line="276" w:lineRule="auto"/>
-      </w:pPr>
-      <w:r>
-        <w:t>[[#P_commentaire]]</w:t>
-      </w:r>
-    </w:p>
-    <w:p>
-      <w:pPr>
-        <w:pStyle w:val="titre"/>
-      </w:pPr>
-      <w:r>
-        <w:t>LES PERSPECTIVES</w:t>
-      </w:r>
-    </w:p>
-    <w:p>
-      <w:pPr>
-        <w:spacing w:before="120" w:after="120" w:line="276" w:lineRule="auto"/>
-        <w:rPr>
-          <w:color w:val="46413B"/>
-          <w:sz w:val="20"/>
-          <w:szCs w:val="20"/>
-        </w:rPr>
-      </w:pPr>
-      <w:r>
-        <w:t>[[P_commentaire]]</w:t>
-      </w:r>
-    </w:p>
-    <w:p>
-      <w:pPr>
-        <w:spacing w:before="120" w:after="120" w:line="276" w:lineRule="auto"/>
-      </w:pPr>
-      <w:r>
-        <w:t>[[/P_commentaire]]</w:t>
+        <w:t>[[</w:t>
+      </w:r>
+      <w:proofErr w:type="spellStart"/>
+      <w:r>
+        <w:t>P_commentaire</w:t>
+      </w:r>
+      <w:proofErr w:type="spellEnd"/>
+      <w:r>
+        <w:t>]]</w:t>
+      </w:r>
+    </w:p>
+    <w:p>
+      <w:pPr>
+        <w:spacing w:before="120" w:after="120" w:line="276" w:lineRule="auto"/>
+      </w:pPr>
+      <w:r>
+        <w:t>[[/</w:t>
+      </w:r>
+      <w:proofErr w:type="spellStart"/>
+      <w:r>
+        <w:t>P_commentaire</w:t>
+      </w:r>
+      <w:proofErr w:type="spellEnd"/>
+      <w:r>
+        <w:t>]]</w:t>
       </w:r>
     </w:p>
     <w:p>
@@ -9205,11 +10462,16 @@
             <w:r>
               <w:t>[[</w:t>
             </w:r>
+            <w:proofErr w:type="spellStart"/>
             <w:r>
               <w:t>S</w:t>
             </w:r>
             <w:r>
-              <w:t>_nomExpert]]</w:t>
+              <w:t>_nomExpert</w:t>
+            </w:r>
+            <w:proofErr w:type="spellEnd"/>
+            <w:r>
+              <w:t>]]</w:t>
             </w:r>
           </w:p>
         </w:tc>
@@ -9224,11 +10486,16 @@
             <w:r>
               <w:t>[[</w:t>
             </w:r>
+            <w:proofErr w:type="spellStart"/>
             <w:r>
               <w:t>S</w:t>
             </w:r>
             <w:r>
-              <w:t>_nomReviseur]]</w:t>
+              <w:t>_nomReviseur</w:t>
+            </w:r>
+            <w:proofErr w:type="spellEnd"/>
+            <w:r>
+              <w:t>]]</w:t>
             </w:r>
           </w:p>
         </w:tc>
@@ -9248,6 +10515,7 @@
             <w:r>
               <w:t>[[</w:t>
             </w:r>
+            <w:proofErr w:type="spellStart"/>
             <w:r>
               <w:t>S</w:t>
             </w:r>
@@ -9257,6 +10525,7 @@
             <w:r>
               <w:t>qualiteExpert</w:t>
             </w:r>
+            <w:proofErr w:type="spellEnd"/>
             <w:r>
               <w:t>]]</w:t>
             </w:r>
@@ -9273,6 +10542,7 @@
             <w:r>
               <w:t>[[</w:t>
             </w:r>
+            <w:proofErr w:type="spellStart"/>
             <w:r>
               <w:t>S</w:t>
             </w:r>
@@ -9282,6 +10552,7 @@
             <w:r>
               <w:t>qualiteReviseur</w:t>
             </w:r>
+            <w:proofErr w:type="spellEnd"/>
             <w:r>
               <w:t>]]</w:t>
             </w:r>
@@ -9319,7 +10590,16 @@
         <w:spacing w:before="120" w:after="120" w:line="276" w:lineRule="auto"/>
       </w:pPr>
       <w:r>
-        <w:t>Vous nous avez donné mandat dans la lettre de mission signée avec notre cabinet de transmettre à votre (vos) établissements bancaires la liasse fiscale relative à l’exercice clos le [[dateFinEx]]. A défaut d’instruction contraire de votre part cette liasse leur est transmise dès transmission à l’administration fiscale.</w:t>
+        <w:lastRenderedPageBreak/>
+        <w:t>Vous nous avez donné mandat dans la lettre de mission signée avec notre cabinet de transmettre à votre (vos) établissements bancaires la liasse fiscale relative à l’exercice clos le [[</w:t>
+      </w:r>
+      <w:proofErr w:type="spellStart"/>
+      <w:r>
+        <w:t>dateFinEx</w:t>
+      </w:r>
+      <w:proofErr w:type="spellEnd"/>
+      <w:r>
+        <w:t>]]. A défaut d’instruction contraire de votre part cette liasse leur est transmise dès transmission à l’administration fiscale.</w:t>
       </w:r>
     </w:p>
     <w:p>
@@ -9337,7 +10617,6 @@
         <w:rPr>
           <w:noProof/>
         </w:rPr>
-        <w:lastRenderedPageBreak/>
         <w:drawing>
           <wp:anchor distT="0" distB="0" distL="0" distR="0" simplePos="0" relativeHeight="251659264" behindDoc="1" locked="0" layoutInCell="1" allowOverlap="1" wp14:anchorId="351DE62A" wp14:editId="6CC16068">
             <wp:simplePos x="0" y="0"/>

</xml_diff>

<commit_message>
ajustement des espaces et du formatage des templates word, j'ai enlevé les console.log du backend
</commit_message>
<xml_diff>
--- a/backend/src/templates/modele_complet.docx
+++ b/backend/src/templates/modele_complet.docx
@@ -426,22 +426,16 @@
         <w:spacing w:before="120" w:after="120" w:line="276" w:lineRule="auto"/>
       </w:pPr>
       <w:r>
+        <w:t>[[#CC_comPerspective]]</w:t>
+      </w:r>
+    </w:p>
+    <w:p>
+      <w:pPr>
+        <w:spacing w:before="120" w:after="120" w:line="276" w:lineRule="auto"/>
+      </w:pPr>
+      <w:r>
         <w:t>[[</w:t>
       </w:r>
-      <w:r>
-        <w:t>#</w:t>
-      </w:r>
-      <w:r>
-        <w:t>CC_comPerspective]]</w:t>
-      </w:r>
-    </w:p>
-    <w:p>
-      <w:pPr>
-        <w:spacing w:before="120" w:after="120" w:line="276" w:lineRule="auto"/>
-      </w:pPr>
-      <w:r>
-        <w:t>[[</w:t>
-      </w:r>
       <w:proofErr w:type="spellStart"/>
       <w:r>
         <w:t>CC_comPerspective</w:t>
@@ -461,10 +455,7 @@
         <w:spacing w:before="120" w:after="120" w:line="276" w:lineRule="auto"/>
       </w:pPr>
       <w:r>
-        <w:t>[[</w:t>
-      </w:r>
-      <w:r>
-        <w:t>/</w:t>
+        <w:t>[[/</w:t>
       </w:r>
       <w:proofErr w:type="spellStart"/>
       <w:r>
@@ -493,11 +484,11 @@
       <w:tblGrid>
         <w:gridCol w:w="2458"/>
         <w:gridCol w:w="1315"/>
+        <w:gridCol w:w="1316"/>
         <w:gridCol w:w="1315"/>
-        <w:gridCol w:w="1314"/>
-        <w:gridCol w:w="1318"/>
-        <w:gridCol w:w="1314"/>
-        <w:gridCol w:w="1317"/>
+        <w:gridCol w:w="1316"/>
+        <w:gridCol w:w="1315"/>
+        <w:gridCol w:w="1316"/>
       </w:tblGrid>
       <w:tr>
         <w:trPr>
@@ -615,7 +606,7 @@
         </w:tc>
         <w:tc>
           <w:tcPr>
-            <w:tcW w:w="1315" w:type="dxa"/>
+            <w:tcW w:w="1316" w:type="dxa"/>
             <w:tcBorders>
               <w:left w:val="single" w:sz="6" w:space="0" w:color="000000"/>
               <w:bottom w:val="thickThinMediumGap" w:sz="3" w:space="0" w:color="000000"/>
@@ -647,7 +638,7 @@
         </w:tc>
         <w:tc>
           <w:tcPr>
-            <w:tcW w:w="1314" w:type="dxa"/>
+            <w:tcW w:w="1315" w:type="dxa"/>
             <w:tcBorders>
               <w:left w:val="single" w:sz="6" w:space="0" w:color="000000"/>
               <w:bottom w:val="thickThinMediumGap" w:sz="3" w:space="0" w:color="000000"/>
@@ -688,7 +679,7 @@
         </w:tc>
         <w:tc>
           <w:tcPr>
-            <w:tcW w:w="1318" w:type="dxa"/>
+            <w:tcW w:w="1316" w:type="dxa"/>
             <w:tcBorders>
               <w:left w:val="single" w:sz="6" w:space="0" w:color="000000"/>
               <w:bottom w:val="thickThinMediumGap" w:sz="3" w:space="0" w:color="000000"/>
@@ -720,7 +711,7 @@
         </w:tc>
         <w:tc>
           <w:tcPr>
-            <w:tcW w:w="1314" w:type="dxa"/>
+            <w:tcW w:w="1315" w:type="dxa"/>
             <w:tcBorders>
               <w:top w:val="nil"/>
               <w:left w:val="single" w:sz="6" w:space="0" w:color="000000"/>
@@ -752,7 +743,7 @@
         </w:tc>
         <w:tc>
           <w:tcPr>
-            <w:tcW w:w="1317" w:type="dxa"/>
+            <w:tcW w:w="1316" w:type="dxa"/>
             <w:tcBorders>
               <w:top w:val="nil"/>
               <w:left w:val="single" w:sz="6" w:space="0" w:color="000000"/>
@@ -903,7 +894,7 @@
         </w:tc>
         <w:tc>
           <w:tcPr>
-            <w:tcW w:w="1315" w:type="dxa"/>
+            <w:tcW w:w="1316" w:type="dxa"/>
             <w:tcBorders>
               <w:top w:val="thinThickMediumGap" w:sz="3" w:space="0" w:color="000000"/>
               <w:left w:val="single" w:sz="6" w:space="0" w:color="000000"/>
@@ -942,7 +933,7 @@
         </w:tc>
         <w:tc>
           <w:tcPr>
-            <w:tcW w:w="1314" w:type="dxa"/>
+            <w:tcW w:w="1315" w:type="dxa"/>
             <w:tcBorders>
               <w:top w:val="thinThickMediumGap" w:sz="3" w:space="0" w:color="000000"/>
               <w:left w:val="single" w:sz="6" w:space="0" w:color="000000"/>
@@ -993,7 +984,7 @@
         </w:tc>
         <w:tc>
           <w:tcPr>
-            <w:tcW w:w="1318" w:type="dxa"/>
+            <w:tcW w:w="1316" w:type="dxa"/>
             <w:tcBorders>
               <w:top w:val="thinThickMediumGap" w:sz="3" w:space="0" w:color="000000"/>
               <w:left w:val="single" w:sz="6" w:space="0" w:color="000000"/>
@@ -1032,7 +1023,7 @@
         </w:tc>
         <w:tc>
           <w:tcPr>
-            <w:tcW w:w="1314" w:type="dxa"/>
+            <w:tcW w:w="1315" w:type="dxa"/>
             <w:tcBorders>
               <w:top w:val="thinThickMediumGap" w:sz="3" w:space="0" w:color="000000"/>
               <w:left w:val="single" w:sz="6" w:space="0" w:color="000000"/>
@@ -1085,7 +1076,7 @@
         </w:tc>
         <w:tc>
           <w:tcPr>
-            <w:tcW w:w="1317" w:type="dxa"/>
+            <w:tcW w:w="1316" w:type="dxa"/>
             <w:tcBorders>
               <w:top w:val="thinThickMediumGap" w:sz="3" w:space="0" w:color="000000"/>
               <w:left w:val="single" w:sz="6" w:space="0" w:color="000000"/>
@@ -1257,7 +1248,7 @@
         </w:tc>
         <w:tc>
           <w:tcPr>
-            <w:tcW w:w="1315" w:type="dxa"/>
+            <w:tcW w:w="1316" w:type="dxa"/>
             <w:tcBorders>
               <w:top w:val="single" w:sz="6" w:space="0" w:color="000000"/>
               <w:left w:val="single" w:sz="6" w:space="0" w:color="000000"/>
@@ -1322,7 +1313,7 @@
         </w:tc>
         <w:tc>
           <w:tcPr>
-            <w:tcW w:w="1314" w:type="dxa"/>
+            <w:tcW w:w="1315" w:type="dxa"/>
             <w:tcBorders>
               <w:top w:val="single" w:sz="6" w:space="0" w:color="000000"/>
               <w:left w:val="single" w:sz="6" w:space="0" w:color="000000"/>
@@ -1369,7 +1360,7 @@
         </w:tc>
         <w:tc>
           <w:tcPr>
-            <w:tcW w:w="1318" w:type="dxa"/>
+            <w:tcW w:w="1316" w:type="dxa"/>
             <w:tcBorders>
               <w:top w:val="single" w:sz="6" w:space="0" w:color="000000"/>
               <w:left w:val="single" w:sz="6" w:space="0" w:color="000000"/>
@@ -1416,7 +1407,7 @@
         </w:tc>
         <w:tc>
           <w:tcPr>
-            <w:tcW w:w="1314" w:type="dxa"/>
+            <w:tcW w:w="1315" w:type="dxa"/>
             <w:tcBorders>
               <w:top w:val="single" w:sz="6" w:space="0" w:color="000000"/>
               <w:left w:val="single" w:sz="6" w:space="0" w:color="000000"/>
@@ -1469,7 +1460,7 @@
         </w:tc>
         <w:tc>
           <w:tcPr>
-            <w:tcW w:w="1317" w:type="dxa"/>
+            <w:tcW w:w="1316" w:type="dxa"/>
             <w:tcBorders>
               <w:top w:val="single" w:sz="6" w:space="0" w:color="000000"/>
               <w:left w:val="single" w:sz="6" w:space="0" w:color="000000"/>
@@ -1652,7 +1643,7 @@
         </w:tc>
         <w:tc>
           <w:tcPr>
-            <w:tcW w:w="1315" w:type="dxa"/>
+            <w:tcW w:w="1316" w:type="dxa"/>
             <w:tcBorders>
               <w:top w:val="single" w:sz="8" w:space="0" w:color="000000"/>
               <w:left w:val="single" w:sz="6" w:space="0" w:color="000000"/>
@@ -1717,7 +1708,7 @@
         </w:tc>
         <w:tc>
           <w:tcPr>
-            <w:tcW w:w="1314" w:type="dxa"/>
+            <w:tcW w:w="1315" w:type="dxa"/>
             <w:tcBorders>
               <w:top w:val="single" w:sz="8" w:space="0" w:color="000000"/>
               <w:left w:val="single" w:sz="6" w:space="0" w:color="000000"/>
@@ -1761,7 +1752,7 @@
         </w:tc>
         <w:tc>
           <w:tcPr>
-            <w:tcW w:w="1318" w:type="dxa"/>
+            <w:tcW w:w="1316" w:type="dxa"/>
             <w:tcBorders>
               <w:top w:val="single" w:sz="8" w:space="0" w:color="000000"/>
               <w:left w:val="single" w:sz="6" w:space="0" w:color="000000"/>
@@ -1808,7 +1799,7 @@
         </w:tc>
         <w:tc>
           <w:tcPr>
-            <w:tcW w:w="1314" w:type="dxa"/>
+            <w:tcW w:w="1315" w:type="dxa"/>
             <w:tcBorders>
               <w:top w:val="single" w:sz="8" w:space="0" w:color="000000"/>
               <w:left w:val="single" w:sz="6" w:space="0" w:color="000000"/>
@@ -1861,7 +1852,7 @@
         </w:tc>
         <w:tc>
           <w:tcPr>
-            <w:tcW w:w="1317" w:type="dxa"/>
+            <w:tcW w:w="1316" w:type="dxa"/>
             <w:tcBorders>
               <w:top w:val="single" w:sz="8" w:space="0" w:color="000000"/>
               <w:left w:val="single" w:sz="6" w:space="0" w:color="000000"/>
@@ -2030,7 +2021,7 @@
         </w:tc>
         <w:tc>
           <w:tcPr>
-            <w:tcW w:w="1315" w:type="dxa"/>
+            <w:tcW w:w="1316" w:type="dxa"/>
             <w:tcBorders>
               <w:top w:val="single" w:sz="6" w:space="0" w:color="000000"/>
               <w:left w:val="single" w:sz="6" w:space="0" w:color="000000"/>
@@ -2103,7 +2094,7 @@
         </w:tc>
         <w:tc>
           <w:tcPr>
-            <w:tcW w:w="1314" w:type="dxa"/>
+            <w:tcW w:w="1315" w:type="dxa"/>
             <w:tcBorders>
               <w:top w:val="single" w:sz="6" w:space="0" w:color="000000"/>
               <w:left w:val="single" w:sz="6" w:space="0" w:color="000000"/>
@@ -2147,7 +2138,7 @@
         </w:tc>
         <w:tc>
           <w:tcPr>
-            <w:tcW w:w="1318" w:type="dxa"/>
+            <w:tcW w:w="1316" w:type="dxa"/>
             <w:tcBorders>
               <w:top w:val="single" w:sz="6" w:space="0" w:color="000000"/>
               <w:left w:val="single" w:sz="6" w:space="0" w:color="000000"/>
@@ -2194,7 +2185,7 @@
         </w:tc>
         <w:tc>
           <w:tcPr>
-            <w:tcW w:w="1314" w:type="dxa"/>
+            <w:tcW w:w="1315" w:type="dxa"/>
             <w:tcBorders>
               <w:top w:val="single" w:sz="6" w:space="0" w:color="000000"/>
               <w:left w:val="single" w:sz="6" w:space="0" w:color="000000"/>
@@ -2247,7 +2238,7 @@
         </w:tc>
         <w:tc>
           <w:tcPr>
-            <w:tcW w:w="1317" w:type="dxa"/>
+            <w:tcW w:w="1316" w:type="dxa"/>
             <w:tcBorders>
               <w:top w:val="single" w:sz="6" w:space="0" w:color="000000"/>
               <w:left w:val="single" w:sz="6" w:space="0" w:color="000000"/>
@@ -2416,7 +2407,7 @@
         </w:tc>
         <w:tc>
           <w:tcPr>
-            <w:tcW w:w="1315" w:type="dxa"/>
+            <w:tcW w:w="1316" w:type="dxa"/>
             <w:tcBorders>
               <w:top w:val="single" w:sz="8" w:space="0" w:color="000000"/>
               <w:left w:val="single" w:sz="6" w:space="0" w:color="000000"/>
@@ -2489,7 +2480,7 @@
         </w:tc>
         <w:tc>
           <w:tcPr>
-            <w:tcW w:w="1314" w:type="dxa"/>
+            <w:tcW w:w="1315" w:type="dxa"/>
             <w:tcBorders>
               <w:top w:val="single" w:sz="8" w:space="0" w:color="000000"/>
               <w:left w:val="single" w:sz="6" w:space="0" w:color="000000"/>
@@ -2533,7 +2524,7 @@
         </w:tc>
         <w:tc>
           <w:tcPr>
-            <w:tcW w:w="1318" w:type="dxa"/>
+            <w:tcW w:w="1316" w:type="dxa"/>
             <w:tcBorders>
               <w:top w:val="single" w:sz="8" w:space="0" w:color="000000"/>
               <w:left w:val="single" w:sz="6" w:space="0" w:color="000000"/>
@@ -2580,7 +2571,7 @@
         </w:tc>
         <w:tc>
           <w:tcPr>
-            <w:tcW w:w="1314" w:type="dxa"/>
+            <w:tcW w:w="1315" w:type="dxa"/>
             <w:tcBorders>
               <w:top w:val="single" w:sz="8" w:space="0" w:color="000000"/>
               <w:left w:val="single" w:sz="6" w:space="0" w:color="000000"/>
@@ -2633,7 +2624,7 @@
         </w:tc>
         <w:tc>
           <w:tcPr>
-            <w:tcW w:w="1317" w:type="dxa"/>
+            <w:tcW w:w="1316" w:type="dxa"/>
             <w:tcBorders>
               <w:top w:val="single" w:sz="8" w:space="0" w:color="000000"/>
               <w:left w:val="single" w:sz="6" w:space="0" w:color="000000"/>
@@ -2703,27 +2694,21 @@
         <w:spacing w:before="120" w:after="120" w:line="276" w:lineRule="auto"/>
       </w:pPr>
       <w:r>
+        <w:t>[[#CC_commentaire]]</w:t>
+      </w:r>
+    </w:p>
+    <w:p>
+      <w:pPr>
+        <w:spacing w:before="120" w:after="120" w:line="276" w:lineRule="auto"/>
+      </w:pPr>
+    </w:p>
+    <w:p>
+      <w:pPr>
+        <w:spacing w:before="120" w:after="120" w:line="276" w:lineRule="auto"/>
+      </w:pPr>
+      <w:r>
         <w:t>[[</w:t>
       </w:r>
-      <w:r>
-        <w:t>#</w:t>
-      </w:r>
-      <w:r>
-        <w:t>CC_commentaire]]</w:t>
-      </w:r>
-    </w:p>
-    <w:p>
-      <w:pPr>
-        <w:spacing w:before="120" w:after="120" w:line="276" w:lineRule="auto"/>
-      </w:pPr>
-    </w:p>
-    <w:p>
-      <w:pPr>
-        <w:spacing w:before="120" w:after="120" w:line="276" w:lineRule="auto"/>
-      </w:pPr>
-      <w:r>
-        <w:t>[[</w:t>
-      </w:r>
       <w:proofErr w:type="spellStart"/>
       <w:r>
         <w:t>CC_commentaire</w:t>
@@ -2738,10 +2723,7 @@
         <w:spacing w:before="120" w:after="120" w:line="276" w:lineRule="auto"/>
       </w:pPr>
       <w:r>
-        <w:t>[[</w:t>
-      </w:r>
-      <w:r>
-        <w:t>/</w:t>
+        <w:t>[[/</w:t>
       </w:r>
       <w:proofErr w:type="spellStart"/>
       <w:r>
@@ -2776,10 +2758,6 @@
     <w:p>
       <w:pPr>
         <w:pStyle w:val="titre"/>
-        <w:rPr>
-          <w:color w:val="46413B"/>
-          <w:spacing w:val="-2"/>
-        </w:rPr>
       </w:pPr>
       <w:r>
         <w:t>ÉVOLUTION DES CHARGES EXTERNES ET AUTRES ACHATS</w:t>
@@ -2803,10 +2781,11 @@
       </w:tblPr>
       <w:tblGrid>
         <w:gridCol w:w="3401"/>
-        <w:gridCol w:w="1774"/>
-        <w:gridCol w:w="1775"/>
-        <w:gridCol w:w="1774"/>
-        <w:gridCol w:w="1632"/>
+        <w:gridCol w:w="1738"/>
+        <w:gridCol w:w="1739"/>
+        <w:gridCol w:w="72"/>
+        <w:gridCol w:w="1667"/>
+        <w:gridCol w:w="1739"/>
       </w:tblGrid>
       <w:tr>
         <w:trPr>
@@ -2815,7 +2794,7 @@
         <w:tc>
           <w:tcPr>
             <w:tcW w:w="6950" w:type="dxa"/>
-            <w:gridSpan w:val="3"/>
+            <w:gridSpan w:val="4"/>
             <w:tcBorders>
               <w:top w:val="nil"/>
               <w:left w:val="nil"/>
@@ -2915,7 +2894,7 @@
         </w:tc>
         <w:tc>
           <w:tcPr>
-            <w:tcW w:w="1774" w:type="dxa"/>
+            <w:tcW w:w="1738" w:type="dxa"/>
             <w:tcBorders>
               <w:top w:val="single" w:sz="4" w:space="0" w:color="000000"/>
               <w:left w:val="single" w:sz="6" w:space="0" w:color="000000"/>
@@ -2948,7 +2927,7 @@
         </w:tc>
         <w:tc>
           <w:tcPr>
-            <w:tcW w:w="1775" w:type="dxa"/>
+            <w:tcW w:w="1739" w:type="dxa"/>
             <w:tcBorders>
               <w:top w:val="single" w:sz="4" w:space="0" w:color="000000"/>
               <w:left w:val="single" w:sz="6" w:space="0" w:color="000000"/>
@@ -2990,7 +2969,8 @@
         </w:tc>
         <w:tc>
           <w:tcPr>
-            <w:tcW w:w="1774" w:type="dxa"/>
+            <w:tcW w:w="1739" w:type="dxa"/>
+            <w:gridSpan w:val="2"/>
             <w:tcBorders>
               <w:top w:val="nil"/>
               <w:left w:val="single" w:sz="6" w:space="0" w:color="000000"/>
@@ -3022,7 +3002,7 @@
         </w:tc>
         <w:tc>
           <w:tcPr>
-            <w:tcW w:w="1632" w:type="dxa"/>
+            <w:tcW w:w="1739" w:type="dxa"/>
             <w:tcBorders>
               <w:top w:val="nil"/>
               <w:left w:val="single" w:sz="6" w:space="0" w:color="000000"/>
@@ -3097,7 +3077,7 @@
         </w:tc>
         <w:tc>
           <w:tcPr>
-            <w:tcW w:w="1774" w:type="dxa"/>
+            <w:tcW w:w="1738" w:type="dxa"/>
             <w:tcBorders>
               <w:top w:val="thinThickMediumGap" w:sz="3" w:space="0" w:color="000000"/>
               <w:left w:val="single" w:sz="6" w:space="0" w:color="000000"/>
@@ -3143,7 +3123,7 @@
         </w:tc>
         <w:tc>
           <w:tcPr>
-            <w:tcW w:w="1775" w:type="dxa"/>
+            <w:tcW w:w="1739" w:type="dxa"/>
             <w:tcBorders>
               <w:top w:val="thinThickMediumGap" w:sz="3" w:space="0" w:color="000000"/>
               <w:left w:val="single" w:sz="6" w:space="0" w:color="000000"/>
@@ -3173,7 +3153,8 @@
         </w:tc>
         <w:tc>
           <w:tcPr>
-            <w:tcW w:w="1774" w:type="dxa"/>
+            <w:tcW w:w="1739" w:type="dxa"/>
+            <w:gridSpan w:val="2"/>
             <w:tcBorders>
               <w:top w:val="thinThickMediumGap" w:sz="3" w:space="0" w:color="000000"/>
               <w:left w:val="single" w:sz="6" w:space="0" w:color="000000"/>
@@ -3219,7 +3200,7 @@
         </w:tc>
         <w:tc>
           <w:tcPr>
-            <w:tcW w:w="1632" w:type="dxa"/>
+            <w:tcW w:w="1739" w:type="dxa"/>
             <w:tcBorders>
               <w:top w:val="thinThickMediumGap" w:sz="3" w:space="0" w:color="000000"/>
               <w:left w:val="single" w:sz="6" w:space="0" w:color="000000"/>
@@ -3270,7 +3251,7 @@
         <w:tc>
           <w:tcPr>
             <w:tcW w:w="10356" w:type="dxa"/>
-            <w:gridSpan w:val="5"/>
+            <w:gridSpan w:val="6"/>
             <w:tcBorders>
               <w:top w:val="single" w:sz="4" w:space="0" w:color="auto"/>
               <w:left w:val="single" w:sz="4" w:space="0" w:color="000000"/>
@@ -3310,7 +3291,7 @@
         <w:tc>
           <w:tcPr>
             <w:tcW w:w="10356" w:type="dxa"/>
-            <w:gridSpan w:val="5"/>
+            <w:gridSpan w:val="6"/>
             <w:tcBorders>
               <w:top w:val="single" w:sz="4" w:space="0" w:color="auto"/>
               <w:left w:val="single" w:sz="4" w:space="0" w:color="000000"/>
@@ -3380,6 +3361,11 @@
       <w:pPr>
         <w:spacing w:before="120" w:after="120" w:line="276" w:lineRule="auto"/>
       </w:pPr>
+    </w:p>
+    <w:p>
+      <w:pPr>
+        <w:spacing w:before="120" w:after="120" w:line="276" w:lineRule="auto"/>
+      </w:pPr>
       <w:r>
         <w:t>[[/</w:t>
       </w:r>
@@ -3391,11 +3377,6 @@
       <w:r>
         <w:t>]]</w:t>
       </w:r>
-    </w:p>
-    <w:p>
-      <w:pPr>
-        <w:spacing w:before="120" w:after="120" w:line="276" w:lineRule="auto"/>
-      </w:pPr>
     </w:p>
     <w:p>
       <w:pPr>
@@ -3408,8 +3389,6 @@
     <w:tbl>
       <w:tblPr>
         <w:tblStyle w:val="TableNormal"/>
-        <w:tblpPr w:leftFromText="141" w:rightFromText="141" w:vertAnchor="text" w:tblpY="1"/>
-        <w:tblOverlap w:val="never"/>
         <w:tblW w:w="0" w:type="auto"/>
         <w:tblBorders>
           <w:top w:val="single" w:sz="4" w:space="0" w:color="000000"/>
@@ -3424,8 +3403,8 @@
       </w:tblPr>
       <w:tblGrid>
         <w:gridCol w:w="2743"/>
-        <w:gridCol w:w="1492"/>
         <w:gridCol w:w="1493"/>
+        <w:gridCol w:w="1494"/>
         <w:gridCol w:w="1493"/>
         <w:gridCol w:w="1489"/>
         <w:gridCol w:w="6"/>
@@ -3438,7 +3417,7 @@
         </w:trPr>
         <w:tc>
           <w:tcPr>
-            <w:tcW w:w="5728" w:type="dxa"/>
+            <w:tcW w:w="5729" w:type="dxa"/>
             <w:gridSpan w:val="3"/>
             <w:tcBorders>
               <w:top w:val="nil"/>
@@ -3515,7 +3494,7 @@
         </w:tc>
         <w:tc>
           <w:tcPr>
-            <w:tcW w:w="1492" w:type="dxa"/>
+            <w:tcW w:w="1493" w:type="dxa"/>
             <w:tcBorders>
               <w:left w:val="single" w:sz="6" w:space="0" w:color="000000"/>
               <w:bottom w:val="thickThinMediumGap" w:sz="3" w:space="0" w:color="000000"/>
@@ -3548,7 +3527,7 @@
         </w:tc>
         <w:tc>
           <w:tcPr>
-            <w:tcW w:w="1493" w:type="dxa"/>
+            <w:tcW w:w="1494" w:type="dxa"/>
             <w:tcBorders>
               <w:left w:val="single" w:sz="6" w:space="0" w:color="000000"/>
               <w:bottom w:val="thickThinMediumGap" w:sz="3" w:space="0" w:color="000000"/>
@@ -3623,7 +3602,7 @@
         </w:tc>
         <w:tc>
           <w:tcPr>
-            <w:tcW w:w="1495" w:type="dxa"/>
+            <w:tcW w:w="1494" w:type="dxa"/>
             <w:gridSpan w:val="2"/>
             <w:tcBorders>
               <w:top w:val="nil"/>
@@ -3708,7 +3687,7 @@
         </w:tc>
         <w:tc>
           <w:tcPr>
-            <w:tcW w:w="1492" w:type="dxa"/>
+            <w:tcW w:w="1493" w:type="dxa"/>
             <w:tcBorders>
               <w:top w:val="thinThickMediumGap" w:sz="3" w:space="0" w:color="000000"/>
               <w:left w:val="single" w:sz="6" w:space="0" w:color="000000"/>
@@ -3738,7 +3717,7 @@
         </w:tc>
         <w:tc>
           <w:tcPr>
-            <w:tcW w:w="1493" w:type="dxa"/>
+            <w:tcW w:w="1494" w:type="dxa"/>
             <w:tcBorders>
               <w:top w:val="thinThickMediumGap" w:sz="3" w:space="0" w:color="000000"/>
               <w:left w:val="single" w:sz="6" w:space="0" w:color="000000"/>
@@ -3814,7 +3793,7 @@
         </w:tc>
         <w:tc>
           <w:tcPr>
-            <w:tcW w:w="1495" w:type="dxa"/>
+            <w:tcW w:w="1494" w:type="dxa"/>
             <w:gridSpan w:val="2"/>
             <w:tcBorders>
               <w:top w:val="thinThickMediumGap" w:sz="3" w:space="0" w:color="000000"/>
@@ -3926,7 +3905,7 @@
         </w:tc>
         <w:tc>
           <w:tcPr>
-            <w:tcW w:w="1492" w:type="dxa"/>
+            <w:tcW w:w="1493" w:type="dxa"/>
             <w:tcBorders>
               <w:top w:val="single" w:sz="8" w:space="0" w:color="000000"/>
               <w:left w:val="single" w:sz="6" w:space="0" w:color="000000"/>
@@ -3975,7 +3954,7 @@
         </w:tc>
         <w:tc>
           <w:tcPr>
-            <w:tcW w:w="1493" w:type="dxa"/>
+            <w:tcW w:w="1494" w:type="dxa"/>
             <w:tcBorders>
               <w:top w:val="single" w:sz="8" w:space="0" w:color="000000"/>
               <w:left w:val="single" w:sz="6" w:space="0" w:color="000000"/>
@@ -4031,7 +4010,7 @@
         </w:tc>
         <w:tc>
           <w:tcPr>
-            <w:tcW w:w="1495" w:type="dxa"/>
+            <w:tcW w:w="1494" w:type="dxa"/>
             <w:gridSpan w:val="2"/>
             <w:tcBorders>
               <w:top w:val="single" w:sz="12" w:space="0" w:color="000000"/>
@@ -4167,7 +4146,7 @@
         </w:tc>
         <w:tc>
           <w:tcPr>
-            <w:tcW w:w="1492" w:type="dxa"/>
+            <w:tcW w:w="1493" w:type="dxa"/>
             <w:tcBorders>
               <w:top w:val="single" w:sz="6" w:space="0" w:color="000000"/>
               <w:left w:val="single" w:sz="6" w:space="0" w:color="000000"/>
@@ -4216,7 +4195,7 @@
         </w:tc>
         <w:tc>
           <w:tcPr>
-            <w:tcW w:w="1493" w:type="dxa"/>
+            <w:tcW w:w="1494" w:type="dxa"/>
             <w:tcBorders>
               <w:top w:val="single" w:sz="6" w:space="0" w:color="000000"/>
               <w:left w:val="single" w:sz="6" w:space="0" w:color="000000"/>
@@ -4272,7 +4251,7 @@
         </w:tc>
         <w:tc>
           <w:tcPr>
-            <w:tcW w:w="1495" w:type="dxa"/>
+            <w:tcW w:w="1494" w:type="dxa"/>
             <w:gridSpan w:val="2"/>
             <w:tcBorders>
               <w:top w:val="single" w:sz="6" w:space="0" w:color="000000"/>
@@ -4363,7 +4342,7 @@
         </w:tc>
         <w:tc>
           <w:tcPr>
-            <w:tcW w:w="1492" w:type="dxa"/>
+            <w:tcW w:w="1493" w:type="dxa"/>
             <w:tcBorders>
               <w:top w:val="inset" w:sz="6" w:space="0" w:color="000000"/>
               <w:left w:val="single" w:sz="6" w:space="0" w:color="000000"/>
@@ -4415,7 +4394,7 @@
         </w:tc>
         <w:tc>
           <w:tcPr>
-            <w:tcW w:w="1493" w:type="dxa"/>
+            <w:tcW w:w="1494" w:type="dxa"/>
             <w:tcBorders>
               <w:top w:val="inset" w:sz="6" w:space="0" w:color="000000"/>
               <w:left w:val="single" w:sz="6" w:space="0" w:color="000000"/>
@@ -4506,7 +4485,7 @@
         </w:tc>
         <w:tc>
           <w:tcPr>
-            <w:tcW w:w="1495" w:type="dxa"/>
+            <w:tcW w:w="1494" w:type="dxa"/>
             <w:gridSpan w:val="2"/>
             <w:tcBorders>
               <w:top w:val="inset" w:sz="6" w:space="0" w:color="000000"/>
@@ -4636,7 +4615,7 @@
         </w:tc>
         <w:tc>
           <w:tcPr>
-            <w:tcW w:w="1492" w:type="dxa"/>
+            <w:tcW w:w="1493" w:type="dxa"/>
             <w:tcBorders>
               <w:top w:val="single" w:sz="8" w:space="0" w:color="000000"/>
               <w:left w:val="single" w:sz="6" w:space="0" w:color="000000"/>
@@ -4685,7 +4664,7 @@
         </w:tc>
         <w:tc>
           <w:tcPr>
-            <w:tcW w:w="1493" w:type="dxa"/>
+            <w:tcW w:w="1494" w:type="dxa"/>
             <w:tcBorders>
               <w:top w:val="single" w:sz="8" w:space="0" w:color="000000"/>
               <w:left w:val="single" w:sz="6" w:space="0" w:color="000000"/>
@@ -4741,7 +4720,7 @@
         </w:tc>
         <w:tc>
           <w:tcPr>
-            <w:tcW w:w="1495" w:type="dxa"/>
+            <w:tcW w:w="1494" w:type="dxa"/>
             <w:gridSpan w:val="2"/>
             <w:tcBorders>
               <w:top w:val="single" w:sz="8" w:space="0" w:color="000000"/>
@@ -4770,36 +4749,6 @@
     <w:p>
       <w:pPr>
         <w:spacing w:before="120" w:after="120" w:line="276" w:lineRule="auto"/>
-      </w:pPr>
-    </w:p>
-    <w:p>
-      <w:pPr>
-        <w:spacing w:before="120" w:after="120" w:line="276" w:lineRule="auto"/>
-      </w:pPr>
-    </w:p>
-    <w:p>
-      <w:pPr>
-        <w:spacing w:before="120" w:after="120" w:line="276" w:lineRule="auto"/>
-      </w:pPr>
-    </w:p>
-    <w:p>
-      <w:pPr>
-        <w:spacing w:before="120" w:after="120" w:line="276" w:lineRule="auto"/>
-      </w:pPr>
-    </w:p>
-    <w:p>
-      <w:pPr>
-        <w:pStyle w:val="titre"/>
-      </w:pPr>
-    </w:p>
-    <w:p>
-      <w:pPr>
-        <w:pStyle w:val="titre"/>
-      </w:pPr>
-    </w:p>
-    <w:p>
-      <w:pPr>
-        <w:pStyle w:val="titre"/>
       </w:pPr>
     </w:p>
     <w:p>
@@ -5160,6 +5109,11 @@
       <w:pPr>
         <w:spacing w:before="120" w:after="120" w:line="276" w:lineRule="auto"/>
       </w:pPr>
+    </w:p>
+    <w:p>
+      <w:pPr>
+        <w:spacing w:before="120" w:after="120" w:line="276" w:lineRule="auto"/>
+      </w:pPr>
       <w:r>
         <w:t>[[/</w:t>
       </w:r>
@@ -5171,11 +5125,6 @@
       <w:r>
         <w:t>]]</w:t>
       </w:r>
-    </w:p>
-    <w:p>
-      <w:pPr>
-        <w:spacing w:before="120" w:after="120" w:line="276" w:lineRule="auto"/>
-      </w:pPr>
     </w:p>
     <w:p>
       <w:pPr>
@@ -5294,7 +5243,6 @@
                 <w:color w:val="46413B"/>
                 <w:sz w:val="20"/>
               </w:rPr>
-              <w:lastRenderedPageBreak/>
               <w:t>Impôt</w:t>
             </w:r>
             <w:r>
@@ -5402,6 +5350,7 @@
                 <w:color w:val="46413B"/>
                 <w:sz w:val="20"/>
               </w:rPr>
+              <w:lastRenderedPageBreak/>
               <w:t>Crédits</w:t>
             </w:r>
             <w:r>
@@ -5735,6 +5684,11 @@
       <w:pPr>
         <w:spacing w:before="120" w:after="120" w:line="276" w:lineRule="auto"/>
       </w:pPr>
+    </w:p>
+    <w:p>
+      <w:pPr>
+        <w:spacing w:before="120" w:after="120" w:line="276" w:lineRule="auto"/>
+      </w:pPr>
       <w:r>
         <w:t>[[/</w:t>
       </w:r>
@@ -5746,11 +5700,6 @@
       <w:r>
         <w:t>]]</w:t>
       </w:r>
-    </w:p>
-    <w:p>
-      <w:pPr>
-        <w:spacing w:before="120" w:after="120" w:line="276" w:lineRule="auto"/>
-      </w:pPr>
     </w:p>
     <w:p>
       <w:pPr>
@@ -6110,6 +6059,11 @@
       <w:pPr>
         <w:spacing w:before="120" w:after="120" w:line="276" w:lineRule="auto"/>
       </w:pPr>
+    </w:p>
+    <w:p>
+      <w:pPr>
+        <w:spacing w:before="120" w:after="120" w:line="276" w:lineRule="auto"/>
+      </w:pPr>
       <w:r>
         <w:t>[[/</w:t>
       </w:r>
@@ -6121,11 +6075,6 @@
       <w:r>
         <w:t>]]</w:t>
       </w:r>
-    </w:p>
-    <w:p>
-      <w:pPr>
-        <w:spacing w:before="120" w:after="120" w:line="276" w:lineRule="auto"/>
-      </w:pPr>
     </w:p>
     <w:p>
       <w:pPr>
@@ -6275,8 +6224,14 @@
         <w:rPr>
           <w:sz w:val="22"/>
         </w:rPr>
+        <w:t xml:space="preserve">Vous utilisez une ou plusieurs caisses enregistreuses ou un système informatique de caisse, dans le cadre de votre </w:t>
+      </w:r>
+      <w:r>
+        <w:rPr>
+          <w:sz w:val="22"/>
+        </w:rPr>
         <w:lastRenderedPageBreak/>
-        <w:t xml:space="preserve">Vous utilisez une ou plusieurs caisses enregistreuses ou un système informatique de caisse, dans le cadre de votre activité. Vous êtes, en conséquence, concerné par l'entrée en application au </w:t>
+        <w:t xml:space="preserve">activité. Vous êtes, en conséquence, concerné par l'entrée en application au </w:t>
       </w:r>
       <w:r>
         <w:rPr>
@@ -6574,14 +6529,14 @@
         <w:rPr>
           <w:sz w:val="22"/>
         </w:rPr>
-        <w:t xml:space="preserve">Les comptes courants débiteurs sont interdits par le code de commerce. Il suffit que la position débitrice du compte </w:t>
+        <w:t xml:space="preserve">Les comptes courants débiteurs sont interdits par le code de commerce. Il suffit que la position débitrice du compte courant existe une seule fois dans l'exercice comptable pour que l'infraction, quel que soit son montant, soit avérée. </w:t>
       </w:r>
       <w:r>
         <w:rPr>
           <w:sz w:val="22"/>
         </w:rPr>
         <w:lastRenderedPageBreak/>
-        <w:t>courant existe une seule fois dans l'exercice comptable pour que l'infraction, quel que soit son montant, soit avérée. Dans les SARL, la règle s'applique aux associés personnes physiques (article L 223-21 du Code de commerce) : « À peine de nullité du contrat, il est interdit aux gérants ou associés autres que les personnes morales de contracter, sous quelque forme que ce soit, des emprunts auprès de la société, de se faire consentir par elle un découvert, en compte courant ou autrement, ainsi que de faire cautionner ou avaliser par elle leurs engagements envers les tiers. Cette interdiction s'applique aux représentants légaux des personnes morales associées.</w:t>
+        <w:t>Dans les SARL, la règle s'applique aux associés personnes physiques (article L 223-21 du Code de commerce) : « À peine de nullité du contrat, il est interdit aux gérants ou associés autres que les personnes morales de contracter, sous quelque forme que ce soit, des emprunts auprès de la société, de se faire consentir par elle un découvert, en compte courant ou autrement, ainsi que de faire cautionner ou avaliser par elle leurs engagements envers les tiers. Cette interdiction s'applique aux représentants légaux des personnes morales associées.</w:t>
       </w:r>
     </w:p>
     <w:p>
@@ -7125,6 +7080,11 @@
       <w:pPr>
         <w:spacing w:before="120" w:after="120" w:line="276" w:lineRule="auto"/>
       </w:pPr>
+    </w:p>
+    <w:p>
+      <w:pPr>
+        <w:spacing w:before="120" w:after="120" w:line="276" w:lineRule="auto"/>
+      </w:pPr>
       <w:r>
         <w:t>[[/</w:t>
       </w:r>
@@ -7136,11 +7096,6 @@
       <w:r>
         <w:t>]]</w:t>
       </w:r>
-    </w:p>
-    <w:p>
-      <w:pPr>
-        <w:spacing w:before="120" w:after="120" w:line="276" w:lineRule="auto"/>
-      </w:pPr>
     </w:p>
     <w:p>
       <w:pPr>
@@ -8841,6 +8796,11 @@
       <w:pPr>
         <w:spacing w:before="120" w:after="120" w:line="276" w:lineRule="auto"/>
       </w:pPr>
+    </w:p>
+    <w:p>
+      <w:pPr>
+        <w:spacing w:before="120" w:after="120" w:line="276" w:lineRule="auto"/>
+      </w:pPr>
       <w:r>
         <w:t>[[/</w:t>
       </w:r>
@@ -8852,11 +8812,6 @@
       <w:r>
         <w:t>]]</w:t>
       </w:r>
-    </w:p>
-    <w:p>
-      <w:pPr>
-        <w:spacing w:before="120" w:after="120" w:line="276" w:lineRule="auto"/>
-      </w:pPr>
     </w:p>
     <w:p>
       <w:pPr>
@@ -9554,6 +9509,11 @@
       <w:pPr>
         <w:spacing w:before="120" w:after="120" w:line="276" w:lineRule="auto"/>
       </w:pPr>
+    </w:p>
+    <w:p>
+      <w:pPr>
+        <w:spacing w:before="120" w:after="120" w:line="276" w:lineRule="auto"/>
+      </w:pPr>
       <w:r>
         <w:t>[[/</w:t>
       </w:r>
@@ -9565,15 +9525,6 @@
       <w:r>
         <w:t>]]</w:t>
       </w:r>
-    </w:p>
-    <w:p>
-      <w:pPr>
-        <w:pStyle w:val="Corpsdetexte"/>
-        <w:spacing w:before="120" w:after="120" w:line="276" w:lineRule="auto"/>
-        <w:rPr>
-          <w:b/>
-        </w:rPr>
-      </w:pPr>
     </w:p>
     <w:p>
       <w:pPr>
@@ -10128,8 +10079,12 @@
       <w:pPr>
         <w:spacing w:before="120" w:after="120" w:line="276" w:lineRule="auto"/>
       </w:pPr>
-      <w:r>
-        <w:lastRenderedPageBreak/>
+    </w:p>
+    <w:p>
+      <w:pPr>
+        <w:spacing w:before="120" w:after="120" w:line="276" w:lineRule="auto"/>
+      </w:pPr>
+      <w:r>
         <w:t>[[/</w:t>
       </w:r>
       <w:proofErr w:type="spellStart"/>
@@ -10140,11 +10095,6 @@
       <w:r>
         <w:t>]]</w:t>
       </w:r>
-    </w:p>
-    <w:p>
-      <w:pPr>
-        <w:spacing w:before="120" w:after="120" w:line="276" w:lineRule="auto"/>
-      </w:pPr>
     </w:p>
     <w:p>
       <w:pPr>
@@ -10207,10 +10157,7 @@
         </w:rPr>
       </w:pPr>
       <w:r>
-        <w:t>[[</w:t>
-      </w:r>
-      <w:r>
-        <w:t>/</w:t>
+        <w:t>[[/</w:t>
       </w:r>
       <w:proofErr w:type="spellStart"/>
       <w:r>
@@ -10236,15 +10183,26 @@
         <w:ind w:right="64"/>
         <w:jc w:val="both"/>
         <w:rPr>
+          <w:sz w:val="22"/>
+        </w:rPr>
+      </w:pPr>
+      <w:r>
+        <w:rPr>
+          <w:sz w:val="22"/>
+        </w:rPr>
+        <w:t>Nous avons pris bonne note des justifications apportées à nos demandes d’explications concernant les apports financiers effectués.</w:t>
+      </w:r>
+    </w:p>
+    <w:p>
+      <w:pPr>
+        <w:pStyle w:val="Corpsdetexte"/>
+        <w:spacing w:before="120" w:after="120" w:line="276" w:lineRule="auto"/>
+        <w:ind w:right="64"/>
+        <w:jc w:val="both"/>
+        <w:rPr>
           <w:color w:val="46413B"/>
         </w:rPr>
       </w:pPr>
-      <w:r>
-        <w:rPr>
-          <w:sz w:val="22"/>
-        </w:rPr>
-        <w:t>Nous avons pris bonne note des justifications apportées à nos demandes d’explications concernant les apports financiers effectués.</w:t>
-      </w:r>
     </w:p>
     <w:p>
       <w:pPr>
@@ -10287,11 +10245,6 @@
       <w:pPr>
         <w:spacing w:before="120" w:after="120" w:line="276" w:lineRule="auto"/>
       </w:pPr>
-    </w:p>
-    <w:p>
-      <w:pPr>
-        <w:spacing w:before="120" w:after="120" w:line="276" w:lineRule="auto"/>
-      </w:pPr>
       <w:r>
         <w:t>[[#PI_commentaire]]</w:t>
       </w:r>
@@ -10306,6 +10259,22 @@
       </w:pPr>
       <w:r>
         <w:t>POINTS IMPORTANTS</w:t>
+      </w:r>
+    </w:p>
+    <w:p>
+      <w:pPr>
+        <w:spacing w:before="120" w:after="120" w:line="276" w:lineRule="auto"/>
+      </w:pPr>
+      <w:r>
+        <w:t>[[</w:t>
+      </w:r>
+      <w:proofErr w:type="spellStart"/>
+      <w:r>
+        <w:t>PI_commentaire</w:t>
+      </w:r>
+      <w:proofErr w:type="spellEnd"/>
+      <w:r>
+        <w:t>]]</w:t>
       </w:r>
     </w:p>
     <w:p>
@@ -10317,53 +10286,53 @@
           <w:szCs w:val="20"/>
         </w:rPr>
       </w:pPr>
+    </w:p>
+    <w:p>
+      <w:pPr>
+        <w:spacing w:before="120" w:after="120" w:line="276" w:lineRule="auto"/>
+      </w:pPr>
+      <w:r>
+        <w:t>[[/</w:t>
+      </w:r>
+      <w:proofErr w:type="spellStart"/>
+      <w:r>
+        <w:t>PI_commentaire</w:t>
+      </w:r>
+      <w:proofErr w:type="spellEnd"/>
+      <w:r>
+        <w:t>]]</w:t>
+      </w:r>
+    </w:p>
+    <w:p>
+      <w:pPr>
+        <w:spacing w:before="120" w:after="120" w:line="276" w:lineRule="auto"/>
+      </w:pPr>
+      <w:r>
+        <w:t>[[#P_commentaire]]</w:t>
+      </w:r>
+    </w:p>
+    <w:p>
+      <w:pPr>
+        <w:pStyle w:val="titre"/>
+      </w:pPr>
+      <w:r>
+        <w:t>LES PERSPECTIVES</w:t>
+      </w:r>
+    </w:p>
+    <w:p>
+      <w:pPr>
+        <w:spacing w:before="120" w:after="120" w:line="276" w:lineRule="auto"/>
+      </w:pPr>
       <w:r>
         <w:t>[[</w:t>
       </w:r>
       <w:proofErr w:type="spellStart"/>
       <w:r>
-        <w:t>PI_commentaire</w:t>
+        <w:t>P_commentaire</w:t>
       </w:r>
       <w:proofErr w:type="spellEnd"/>
       <w:r>
         <w:t>]]</w:t>
-      </w:r>
-    </w:p>
-    <w:p>
-      <w:pPr>
-        <w:spacing w:before="120" w:after="120" w:line="276" w:lineRule="auto"/>
-      </w:pPr>
-      <w:r>
-        <w:t>[[/</w:t>
-      </w:r>
-      <w:proofErr w:type="spellStart"/>
-      <w:r>
-        <w:t>PI_commentaire</w:t>
-      </w:r>
-      <w:proofErr w:type="spellEnd"/>
-      <w:r>
-        <w:t>]]</w:t>
-      </w:r>
-    </w:p>
-    <w:p>
-      <w:pPr>
-        <w:spacing w:before="120" w:after="120" w:line="276" w:lineRule="auto"/>
-      </w:pPr>
-    </w:p>
-    <w:p>
-      <w:pPr>
-        <w:spacing w:before="120" w:after="120" w:line="276" w:lineRule="auto"/>
-      </w:pPr>
-      <w:r>
-        <w:t>[[#P_commentaire]]</w:t>
-      </w:r>
-    </w:p>
-    <w:p>
-      <w:pPr>
-        <w:pStyle w:val="titre"/>
-      </w:pPr>
-      <w:r>
-        <w:t>LES PERSPECTIVES</w:t>
       </w:r>
     </w:p>
     <w:p>
@@ -10375,8 +10344,13 @@
           <w:szCs w:val="20"/>
         </w:rPr>
       </w:pPr>
-      <w:r>
-        <w:t>[[</w:t>
+    </w:p>
+    <w:p>
+      <w:pPr>
+        <w:spacing w:before="120" w:after="120" w:line="276" w:lineRule="auto"/>
+      </w:pPr>
+      <w:r>
+        <w:t>[[/</w:t>
       </w:r>
       <w:proofErr w:type="spellStart"/>
       <w:r>
@@ -10386,27 +10360,6 @@
       <w:r>
         <w:t>]]</w:t>
       </w:r>
-    </w:p>
-    <w:p>
-      <w:pPr>
-        <w:spacing w:before="120" w:after="120" w:line="276" w:lineRule="auto"/>
-      </w:pPr>
-      <w:r>
-        <w:t>[[/</w:t>
-      </w:r>
-      <w:proofErr w:type="spellStart"/>
-      <w:r>
-        <w:t>P_commentaire</w:t>
-      </w:r>
-      <w:proofErr w:type="spellEnd"/>
-      <w:r>
-        <w:t>]]</w:t>
-      </w:r>
-    </w:p>
-    <w:p>
-      <w:pPr>
-        <w:spacing w:before="120" w:after="120" w:line="276" w:lineRule="auto"/>
-      </w:pPr>
     </w:p>
     <w:p>
       <w:pPr>

</xml_diff>